<commit_message>
Updated the contract doc with Dr. McGough's signature
</commit_message>
<xml_diff>
--- a/Sprint1_Documents/srDesign_Contract.docx
+++ b/Sprint1_Documents/srDesign_Contract.docx
@@ -13,8 +13,6 @@
           <w:szCs w:val="27"/>
         </w:rPr>
       </w:pPr>
-      <w:bookmarkStart w:id="0" w:name="_GoBack"/>
-      <w:bookmarkEnd w:id="0"/>
       <w:r>
         <w:rPr>
           <w:rFonts w:ascii="Times New Roman" w:eastAsia="Times New Roman" w:hAnsi="Times New Roman" w:cs="Times New Roman"/>
@@ -29,6 +27,9 @@
     </w:p>
     <w:p>
       <w:pPr>
+        <w:tabs>
+          <w:tab w:val="left" w:pos="7125"/>
+        </w:tabs>
         <w:spacing w:after="0" w:line="240" w:lineRule="auto"/>
         <w:rPr>
           <w:rFonts w:ascii="Times New Roman" w:eastAsia="Times New Roman" w:hAnsi="Times New Roman" w:cs="Times New Roman"/>
@@ -36,6 +37,15 @@
           <w:szCs w:val="24"/>
         </w:rPr>
       </w:pPr>
+      <w:r>
+        <w:rPr>
+          <w:rFonts w:ascii="Times New Roman" w:eastAsia="Times New Roman" w:hAnsi="Times New Roman" w:cs="Times New Roman"/>
+          <w:color w:val="000000"/>
+          <w:sz w:val="27"/>
+          <w:szCs w:val="27"/>
+        </w:rPr>
+        <w:tab/>
+      </w:r>
       <w:r>
         <w:rPr>
           <w:rFonts w:ascii="Times New Roman" w:eastAsia="Times New Roman" w:hAnsi="Times New Roman" w:cs="Times New Roman"/>
@@ -62,8 +72,10 @@
           <w:sz w:val="27"/>
           <w:szCs w:val="27"/>
         </w:rPr>
-        <w:t>MDK</w:t>
-      </w:r>
+        <w:t>Plugged-In</w:t>
+      </w:r>
+      <w:bookmarkStart w:id="0" w:name="_GoBack"/>
+      <w:bookmarkEnd w:id="0"/>
       <w:r>
         <w:rPr>
           <w:rFonts w:ascii="Times New Roman" w:eastAsia="Times New Roman" w:hAnsi="Times New Roman" w:cs="Times New Roman"/>
@@ -1594,27 +1606,7 @@
           <w:szCs w:val="27"/>
         </w:rPr>
         <w:br/>
-        <w:t xml:space="preserve">2. </w:t>
-      </w:r>
-      <w:proofErr w:type="gramStart"/>
-      <w:r>
-        <w:rPr>
-          <w:rFonts w:ascii="Times New Roman" w:eastAsia="Times New Roman" w:hAnsi="Times New Roman" w:cs="Times New Roman"/>
-          <w:color w:val="000000"/>
-          <w:sz w:val="27"/>
-          <w:szCs w:val="27"/>
-        </w:rPr>
-        <w:t>is</w:t>
-      </w:r>
-      <w:proofErr w:type="gramEnd"/>
-      <w:r>
-        <w:rPr>
-          <w:rFonts w:ascii="Times New Roman" w:eastAsia="Times New Roman" w:hAnsi="Times New Roman" w:cs="Times New Roman"/>
-          <w:color w:val="000000"/>
-          <w:sz w:val="27"/>
-          <w:szCs w:val="27"/>
-        </w:rPr>
-        <w:t xml:space="preserve"> already in the recipient party's possession at the time of disclosure thereof; </w:t>
+        <w:t>2. is already in the recipient party's possession at the time of disclosure thereof; </w:t>
       </w:r>
       <w:r>
         <w:rPr>
@@ -1624,27 +1616,7 @@
           <w:szCs w:val="27"/>
         </w:rPr>
         <w:br/>
-        <w:t xml:space="preserve">3. </w:t>
-      </w:r>
-      <w:proofErr w:type="gramStart"/>
-      <w:r>
-        <w:rPr>
-          <w:rFonts w:ascii="Times New Roman" w:eastAsia="Times New Roman" w:hAnsi="Times New Roman" w:cs="Times New Roman"/>
-          <w:color w:val="000000"/>
-          <w:sz w:val="27"/>
-          <w:szCs w:val="27"/>
-        </w:rPr>
-        <w:t>is</w:t>
-      </w:r>
-      <w:proofErr w:type="gramEnd"/>
-      <w:r>
-        <w:rPr>
-          <w:rFonts w:ascii="Times New Roman" w:eastAsia="Times New Roman" w:hAnsi="Times New Roman" w:cs="Times New Roman"/>
-          <w:color w:val="000000"/>
-          <w:sz w:val="27"/>
-          <w:szCs w:val="27"/>
-        </w:rPr>
-        <w:t xml:space="preserve"> or later becomes part of the public domain through no fault of the recipient party; </w:t>
+        <w:t>3. is or later becomes part of the public domain through no fault of the recipient party; </w:t>
       </w:r>
       <w:r>
         <w:rPr>
@@ -1654,27 +1626,7 @@
           <w:szCs w:val="27"/>
         </w:rPr>
         <w:br/>
-        <w:t xml:space="preserve">4. </w:t>
-      </w:r>
-      <w:proofErr w:type="gramStart"/>
-      <w:r>
-        <w:rPr>
-          <w:rFonts w:ascii="Times New Roman" w:eastAsia="Times New Roman" w:hAnsi="Times New Roman" w:cs="Times New Roman"/>
-          <w:color w:val="000000"/>
-          <w:sz w:val="27"/>
-          <w:szCs w:val="27"/>
-        </w:rPr>
-        <w:t>is</w:t>
-      </w:r>
-      <w:proofErr w:type="gramEnd"/>
-      <w:r>
-        <w:rPr>
-          <w:rFonts w:ascii="Times New Roman" w:eastAsia="Times New Roman" w:hAnsi="Times New Roman" w:cs="Times New Roman"/>
-          <w:color w:val="000000"/>
-          <w:sz w:val="27"/>
-          <w:szCs w:val="27"/>
-        </w:rPr>
-        <w:t xml:space="preserve"> received from a third party having no obligations of confidentiality to the disclosing party; </w:t>
+        <w:t>4. is received from a third party having no obligations of confidentiality to the disclosing party; </w:t>
       </w:r>
       <w:r>
         <w:rPr>
@@ -1684,27 +1636,7 @@
           <w:szCs w:val="27"/>
         </w:rPr>
         <w:br/>
-        <w:t xml:space="preserve">5. </w:t>
-      </w:r>
-      <w:proofErr w:type="gramStart"/>
-      <w:r>
-        <w:rPr>
-          <w:rFonts w:ascii="Times New Roman" w:eastAsia="Times New Roman" w:hAnsi="Times New Roman" w:cs="Times New Roman"/>
-          <w:color w:val="000000"/>
-          <w:sz w:val="27"/>
-          <w:szCs w:val="27"/>
-        </w:rPr>
-        <w:t>is</w:t>
-      </w:r>
-      <w:proofErr w:type="gramEnd"/>
-      <w:r>
-        <w:rPr>
-          <w:rFonts w:ascii="Times New Roman" w:eastAsia="Times New Roman" w:hAnsi="Times New Roman" w:cs="Times New Roman"/>
-          <w:color w:val="000000"/>
-          <w:sz w:val="27"/>
-          <w:szCs w:val="27"/>
-        </w:rPr>
-        <w:t xml:space="preserve"> independently developed by the recipient party; or </w:t>
+        <w:t>5. is independently developed by the recipient party; or </w:t>
       </w:r>
       <w:r>
         <w:rPr>
@@ -1714,27 +1646,7 @@
           <w:szCs w:val="27"/>
         </w:rPr>
         <w:br/>
-        <w:t xml:space="preserve">6. </w:t>
-      </w:r>
-      <w:proofErr w:type="gramStart"/>
-      <w:r>
-        <w:rPr>
-          <w:rFonts w:ascii="Times New Roman" w:eastAsia="Times New Roman" w:hAnsi="Times New Roman" w:cs="Times New Roman"/>
-          <w:color w:val="000000"/>
-          <w:sz w:val="27"/>
-          <w:szCs w:val="27"/>
-        </w:rPr>
-        <w:t>is</w:t>
-      </w:r>
-      <w:proofErr w:type="gramEnd"/>
-      <w:r>
-        <w:rPr>
-          <w:rFonts w:ascii="Times New Roman" w:eastAsia="Times New Roman" w:hAnsi="Times New Roman" w:cs="Times New Roman"/>
-          <w:color w:val="000000"/>
-          <w:sz w:val="27"/>
-          <w:szCs w:val="27"/>
-        </w:rPr>
-        <w:t xml:space="preserve"> required by law or regulation to be disclosed. </w:t>
+        <w:t>6. is required by law or regulation to be disclosed. </w:t>
       </w:r>
     </w:p>
     <w:p>
@@ -1975,27 +1887,7 @@
           <w:szCs w:val="27"/>
         </w:rPr>
         <w:br/>
-        <w:t xml:space="preserve">The Senior Design Team represents and warrants </w:t>
-      </w:r>
-      <w:proofErr w:type="gramStart"/>
-      <w:r>
-        <w:rPr>
-          <w:rFonts w:ascii="Times New Roman" w:eastAsia="Times New Roman" w:hAnsi="Times New Roman" w:cs="Times New Roman"/>
-          <w:color w:val="000000"/>
-          <w:sz w:val="27"/>
-          <w:szCs w:val="27"/>
-        </w:rPr>
-        <w:t>to Sponsor</w:t>
-      </w:r>
-      <w:proofErr w:type="gramEnd"/>
-      <w:r>
-        <w:rPr>
-          <w:rFonts w:ascii="Times New Roman" w:eastAsia="Times New Roman" w:hAnsi="Times New Roman" w:cs="Times New Roman"/>
-          <w:color w:val="000000"/>
-          <w:sz w:val="27"/>
-          <w:szCs w:val="27"/>
-        </w:rPr>
-        <w:t xml:space="preserve"> that: </w:t>
+        <w:t>The Senior Design Team represents and warrants to Sponsor that: </w:t>
       </w:r>
       <w:r>
         <w:rPr>
@@ -2209,27 +2101,7 @@
           <w:szCs w:val="27"/>
         </w:rPr>
         <w:br/>
-        <w:t xml:space="preserve">For the purposes of this Agreement and all services to be provided hereunder, the parties shall be, and shall be deemed to be, independent contractors and not agents or employees of the other party. </w:t>
-      </w:r>
-      <w:proofErr w:type="gramStart"/>
-      <w:r>
-        <w:rPr>
-          <w:rFonts w:ascii="Times New Roman" w:eastAsia="Times New Roman" w:hAnsi="Times New Roman" w:cs="Times New Roman"/>
-          <w:color w:val="000000"/>
-          <w:sz w:val="27"/>
-          <w:szCs w:val="27"/>
-        </w:rPr>
-        <w:t>Neither party shall have authority to make any statements, representations or</w:t>
-      </w:r>
-      <w:proofErr w:type="gramEnd"/>
-      <w:r>
-        <w:rPr>
-          <w:rFonts w:ascii="Times New Roman" w:eastAsia="Times New Roman" w:hAnsi="Times New Roman" w:cs="Times New Roman"/>
-          <w:color w:val="000000"/>
-          <w:sz w:val="27"/>
-          <w:szCs w:val="27"/>
-        </w:rPr>
-        <w:t xml:space="preserve"> commitments of any kind, or to take any action which shall be binding on the other party, except as may be expressly provided for herein or authorized in writing. </w:t>
+        <w:t>For the purposes of this Agreement and all services to be provided hereunder, the parties shall be, and shall be deemed to be, independent contractors and not agents or employees of the other party. Neither party shall have authority to make any statements, representations or commitments of any kind, or to take any action which shall be binding on the other party, except as may be expressly provided for herein or authorized in writing. </w:t>
       </w:r>
       <w:r>
         <w:rPr>
@@ -2489,6 +2361,662 @@
       <w:r>
         <w:rPr>
           <w:rFonts w:ascii="Calibri" w:hAnsi="Calibri" w:cs="Calibri"/>
+          <w:noProof/>
+          <w:color w:val="000000"/>
+          <w:sz w:val="28"/>
+          <w:szCs w:val="24"/>
+        </w:rPr>
+        <mc:AlternateContent>
+          <mc:Choice Requires="wpi">
+            <w:drawing>
+              <wp:anchor distT="0" distB="0" distL="114300" distR="114300" simplePos="0" relativeHeight="251732992" behindDoc="0" locked="0" layoutInCell="1" allowOverlap="1">
+                <wp:simplePos x="0" y="0"/>
+                <wp:positionH relativeFrom="column">
+                  <wp:posOffset>5039385</wp:posOffset>
+                </wp:positionH>
+                <wp:positionV relativeFrom="paragraph">
+                  <wp:posOffset>44765</wp:posOffset>
+                </wp:positionV>
+                <wp:extent cx="254160" cy="127440"/>
+                <wp:effectExtent l="19050" t="38100" r="12700" b="44450"/>
+                <wp:wrapNone/>
+                <wp:docPr id="97" name="Ink 97"/>
+                <wp:cNvGraphicFramePr/>
+                <a:graphic xmlns:a="http://schemas.openxmlformats.org/drawingml/2006/main">
+                  <a:graphicData uri="http://schemas.microsoft.com/office/word/2010/wordprocessingInk">
+                    <w14:contentPart bwMode="auto" r:id="rId23">
+                      <w14:nvContentPartPr>
+                        <w14:cNvContentPartPr/>
+                      </w14:nvContentPartPr>
+                      <w14:xfrm>
+                        <a:off x="0" y="0"/>
+                        <a:ext cx="254160" cy="127440"/>
+                      </w14:xfrm>
+                    </w14:contentPart>
+                  </a:graphicData>
+                </a:graphic>
+              </wp:anchor>
+            </w:drawing>
+          </mc:Choice>
+          <mc:Fallback>
+            <w:pict>
+              <v:shapetype id="_x0000_t75" coordsize="21600,21600" o:spt="75" o:preferrelative="t" path="m@4@5l@4@11@9@11@9@5xe" filled="f" stroked="f">
+                <v:stroke joinstyle="miter"/>
+                <v:formulas>
+                  <v:f eqn="if lineDrawn pixelLineWidth 0"/>
+                  <v:f eqn="sum @0 1 0"/>
+                  <v:f eqn="sum 0 0 @1"/>
+                  <v:f eqn="prod @2 1 2"/>
+                  <v:f eqn="prod @3 21600 pixelWidth"/>
+                  <v:f eqn="prod @3 21600 pixelHeight"/>
+                  <v:f eqn="sum @0 0 1"/>
+                  <v:f eqn="prod @6 1 2"/>
+                  <v:f eqn="prod @7 21600 pixelWidth"/>
+                  <v:f eqn="sum @8 21600 0"/>
+                  <v:f eqn="prod @7 21600 pixelHeight"/>
+                  <v:f eqn="sum @10 21600 0"/>
+                </v:formulas>
+                <v:path o:extrusionok="f" gradientshapeok="t" o:connecttype="rect"/>
+                <o:lock v:ext="edit" aspectratio="t"/>
+              </v:shapetype>
+              <v:shape id="Ink 97" o:spid="_x0000_s1026" type="#_x0000_t75" style="position:absolute;margin-left:396.1pt;margin-top:2.6pt;width:21.05pt;height:12pt;z-index:251732992;visibility:visible;mso-wrap-style:square;mso-wrap-distance-left:9pt;mso-wrap-distance-top:0;mso-wrap-distance-right:9pt;mso-wrap-distance-bottom:0;mso-position-horizontal:absolute;mso-position-horizontal-relative:text;mso-position-vertical:absolute;mso-position-vertical-relative:text" o:gfxdata="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">
+                <v:imagedata r:id="rId24" o:title=""/>
+              </v:shape>
+            </w:pict>
+          </mc:Fallback>
+        </mc:AlternateContent>
+      </w:r>
+      <w:r>
+        <w:rPr>
+          <w:rFonts w:ascii="Calibri" w:hAnsi="Calibri" w:cs="Calibri"/>
+          <w:noProof/>
+          <w:color w:val="000000"/>
+          <w:sz w:val="28"/>
+          <w:szCs w:val="24"/>
+        </w:rPr>
+        <mc:AlternateContent>
+          <mc:Choice Requires="wpi">
+            <w:drawing>
+              <wp:anchor distT="0" distB="0" distL="114300" distR="114300" simplePos="0" relativeHeight="251731968" behindDoc="0" locked="0" layoutInCell="1" allowOverlap="1">
+                <wp:simplePos x="0" y="0"/>
+                <wp:positionH relativeFrom="column">
+                  <wp:posOffset>4936425</wp:posOffset>
+                </wp:positionH>
+                <wp:positionV relativeFrom="paragraph">
+                  <wp:posOffset>62045</wp:posOffset>
+                </wp:positionV>
+                <wp:extent cx="80640" cy="117720"/>
+                <wp:effectExtent l="38100" t="38100" r="34290" b="34925"/>
+                <wp:wrapNone/>
+                <wp:docPr id="96" name="Ink 96"/>
+                <wp:cNvGraphicFramePr/>
+                <a:graphic xmlns:a="http://schemas.openxmlformats.org/drawingml/2006/main">
+                  <a:graphicData uri="http://schemas.microsoft.com/office/word/2010/wordprocessingInk">
+                    <w14:contentPart bwMode="auto" r:id="rId25">
+                      <w14:nvContentPartPr>
+                        <w14:cNvContentPartPr/>
+                      </w14:nvContentPartPr>
+                      <w14:xfrm>
+                        <a:off x="0" y="0"/>
+                        <a:ext cx="80640" cy="117720"/>
+                      </w14:xfrm>
+                    </w14:contentPart>
+                  </a:graphicData>
+                </a:graphic>
+              </wp:anchor>
+            </w:drawing>
+          </mc:Choice>
+          <mc:Fallback>
+            <w:pict>
+              <v:shape id="Ink 96" o:spid="_x0000_s1026" type="#_x0000_t75" style="position:absolute;margin-left:388pt;margin-top:4.2pt;width:7.75pt;height:10.65pt;z-index:251731968;visibility:visible;mso-wrap-style:square;mso-wrap-distance-left:9pt;mso-wrap-distance-top:0;mso-wrap-distance-right:9pt;mso-wrap-distance-bottom:0;mso-position-horizontal:absolute;mso-position-horizontal-relative:text;mso-position-vertical:absolute;mso-position-vertical-relative:text" o:gfxdata="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">
+                <v:imagedata r:id="rId26" o:title=""/>
+              </v:shape>
+            </w:pict>
+          </mc:Fallback>
+        </mc:AlternateContent>
+      </w:r>
+      <w:r>
+        <w:rPr>
+          <w:rFonts w:ascii="Calibri" w:hAnsi="Calibri" w:cs="Calibri"/>
+          <w:noProof/>
+          <w:color w:val="000000"/>
+          <w:sz w:val="28"/>
+          <w:szCs w:val="24"/>
+        </w:rPr>
+        <mc:AlternateContent>
+          <mc:Choice Requires="wpi">
+            <w:drawing>
+              <wp:anchor distT="0" distB="0" distL="114300" distR="114300" simplePos="0" relativeHeight="251730944" behindDoc="0" locked="0" layoutInCell="1" allowOverlap="1">
+                <wp:simplePos x="0" y="0"/>
+                <wp:positionH relativeFrom="column">
+                  <wp:posOffset>4823025</wp:posOffset>
+                </wp:positionH>
+                <wp:positionV relativeFrom="paragraph">
+                  <wp:posOffset>-127315</wp:posOffset>
+                </wp:positionV>
+                <wp:extent cx="181440" cy="388800"/>
+                <wp:effectExtent l="38100" t="38100" r="47625" b="49530"/>
+                <wp:wrapNone/>
+                <wp:docPr id="95" name="Ink 95"/>
+                <wp:cNvGraphicFramePr/>
+                <a:graphic xmlns:a="http://schemas.openxmlformats.org/drawingml/2006/main">
+                  <a:graphicData uri="http://schemas.microsoft.com/office/word/2010/wordprocessingInk">
+                    <w14:contentPart bwMode="auto" r:id="rId27">
+                      <w14:nvContentPartPr>
+                        <w14:cNvContentPartPr/>
+                      </w14:nvContentPartPr>
+                      <w14:xfrm>
+                        <a:off x="0" y="0"/>
+                        <a:ext cx="181440" cy="388800"/>
+                      </w14:xfrm>
+                    </w14:contentPart>
+                  </a:graphicData>
+                </a:graphic>
+              </wp:anchor>
+            </w:drawing>
+          </mc:Choice>
+          <mc:Fallback>
+            <w:pict>
+              <v:shape id="Ink 95" o:spid="_x0000_s1026" type="#_x0000_t75" style="position:absolute;margin-left:378.85pt;margin-top:-10.8pt;width:16.05pt;height:32.35pt;z-index:251730944;visibility:visible;mso-wrap-style:square;mso-wrap-distance-left:9pt;mso-wrap-distance-top:0;mso-wrap-distance-right:9pt;mso-wrap-distance-bottom:0;mso-position-horizontal:absolute;mso-position-horizontal-relative:text;mso-position-vertical:absolute;mso-position-vertical-relative:text" o:gfxdata="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">
+                <v:imagedata r:id="rId28" o:title=""/>
+              </v:shape>
+            </w:pict>
+          </mc:Fallback>
+        </mc:AlternateContent>
+      </w:r>
+      <w:r>
+        <w:rPr>
+          <w:rFonts w:ascii="Calibri" w:hAnsi="Calibri" w:cs="Calibri"/>
+          <w:noProof/>
+          <w:color w:val="000000"/>
+          <w:sz w:val="28"/>
+          <w:szCs w:val="24"/>
+        </w:rPr>
+        <mc:AlternateContent>
+          <mc:Choice Requires="wpi">
+            <w:drawing>
+              <wp:anchor distT="0" distB="0" distL="114300" distR="114300" simplePos="0" relativeHeight="251729920" behindDoc="0" locked="0" layoutInCell="1" allowOverlap="1">
+                <wp:simplePos x="0" y="0"/>
+                <wp:positionH relativeFrom="column">
+                  <wp:posOffset>4711065</wp:posOffset>
+                </wp:positionH>
+                <wp:positionV relativeFrom="paragraph">
+                  <wp:posOffset>-8155</wp:posOffset>
+                </wp:positionV>
+                <wp:extent cx="144720" cy="231120"/>
+                <wp:effectExtent l="38100" t="38100" r="46355" b="36195"/>
+                <wp:wrapNone/>
+                <wp:docPr id="94" name="Ink 94"/>
+                <wp:cNvGraphicFramePr/>
+                <a:graphic xmlns:a="http://schemas.openxmlformats.org/drawingml/2006/main">
+                  <a:graphicData uri="http://schemas.microsoft.com/office/word/2010/wordprocessingInk">
+                    <w14:contentPart bwMode="auto" r:id="rId29">
+                      <w14:nvContentPartPr>
+                        <w14:cNvContentPartPr/>
+                      </w14:nvContentPartPr>
+                      <w14:xfrm>
+                        <a:off x="0" y="0"/>
+                        <a:ext cx="144720" cy="231120"/>
+                      </w14:xfrm>
+                    </w14:contentPart>
+                  </a:graphicData>
+                </a:graphic>
+              </wp:anchor>
+            </w:drawing>
+          </mc:Choice>
+          <mc:Fallback>
+            <w:pict>
+              <v:shape id="Ink 94" o:spid="_x0000_s1026" type="#_x0000_t75" style="position:absolute;margin-left:370pt;margin-top:-1.4pt;width:13.3pt;height:19.95pt;z-index:251729920;visibility:visible;mso-wrap-style:square;mso-wrap-distance-left:9pt;mso-wrap-distance-top:0;mso-wrap-distance-right:9pt;mso-wrap-distance-bottom:0;mso-position-horizontal:absolute;mso-position-horizontal-relative:text;mso-position-vertical:absolute;mso-position-vertical-relative:text" o:gfxdata="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">
+                <v:imagedata r:id="rId30" o:title=""/>
+              </v:shape>
+            </w:pict>
+          </mc:Fallback>
+        </mc:AlternateContent>
+      </w:r>
+      <w:r>
+        <w:rPr>
+          <w:rFonts w:ascii="Calibri" w:hAnsi="Calibri" w:cs="Calibri"/>
+          <w:noProof/>
+          <w:color w:val="000000"/>
+          <w:sz w:val="28"/>
+          <w:szCs w:val="24"/>
+        </w:rPr>
+        <mc:AlternateContent>
+          <mc:Choice Requires="wpi">
+            <w:drawing>
+              <wp:anchor distT="0" distB="0" distL="114300" distR="114300" simplePos="0" relativeHeight="251728896" behindDoc="0" locked="0" layoutInCell="1" allowOverlap="1">
+                <wp:simplePos x="0" y="0"/>
+                <wp:positionH relativeFrom="column">
+                  <wp:posOffset>4552305</wp:posOffset>
+                </wp:positionH>
+                <wp:positionV relativeFrom="paragraph">
+                  <wp:posOffset>-170515</wp:posOffset>
+                </wp:positionV>
+                <wp:extent cx="205560" cy="457200"/>
+                <wp:effectExtent l="38100" t="38100" r="42545" b="38100"/>
+                <wp:wrapNone/>
+                <wp:docPr id="93" name="Ink 93"/>
+                <wp:cNvGraphicFramePr/>
+                <a:graphic xmlns:a="http://schemas.openxmlformats.org/drawingml/2006/main">
+                  <a:graphicData uri="http://schemas.microsoft.com/office/word/2010/wordprocessingInk">
+                    <w14:contentPart bwMode="auto" r:id="rId31">
+                      <w14:nvContentPartPr>
+                        <w14:cNvContentPartPr/>
+                      </w14:nvContentPartPr>
+                      <w14:xfrm>
+                        <a:off x="0" y="0"/>
+                        <a:ext cx="205560" cy="457200"/>
+                      </w14:xfrm>
+                    </w14:contentPart>
+                  </a:graphicData>
+                </a:graphic>
+              </wp:anchor>
+            </w:drawing>
+          </mc:Choice>
+          <mc:Fallback>
+            <w:pict>
+              <v:shape id="Ink 93" o:spid="_x0000_s1026" type="#_x0000_t75" style="position:absolute;margin-left:357.75pt;margin-top:-14.4pt;width:17.9pt;height:37.65pt;z-index:251728896;visibility:visible;mso-wrap-style:square;mso-wrap-distance-left:9pt;mso-wrap-distance-top:0;mso-wrap-distance-right:9pt;mso-wrap-distance-bottom:0;mso-position-horizontal:absolute;mso-position-horizontal-relative:text;mso-position-vertical:absolute;mso-position-vertical-relative:text" o:gfxdata="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">
+                <v:imagedata r:id="rId32" o:title=""/>
+              </v:shape>
+            </w:pict>
+          </mc:Fallback>
+        </mc:AlternateContent>
+      </w:r>
+      <w:r>
+        <w:rPr>
+          <w:rFonts w:ascii="Calibri" w:hAnsi="Calibri" w:cs="Calibri"/>
+          <w:noProof/>
+          <w:color w:val="000000"/>
+          <w:sz w:val="28"/>
+          <w:szCs w:val="24"/>
+        </w:rPr>
+        <mc:AlternateContent>
+          <mc:Choice Requires="wpi">
+            <w:drawing>
+              <wp:anchor distT="0" distB="0" distL="114300" distR="114300" simplePos="0" relativeHeight="251727872" behindDoc="0" locked="0" layoutInCell="1" allowOverlap="1">
+                <wp:simplePos x="0" y="0"/>
+                <wp:positionH relativeFrom="column">
+                  <wp:posOffset>4436025</wp:posOffset>
+                </wp:positionH>
+                <wp:positionV relativeFrom="paragraph">
+                  <wp:posOffset>11645</wp:posOffset>
+                </wp:positionV>
+                <wp:extent cx="124560" cy="133560"/>
+                <wp:effectExtent l="38100" t="38100" r="46990" b="38100"/>
+                <wp:wrapNone/>
+                <wp:docPr id="92" name="Ink 92"/>
+                <wp:cNvGraphicFramePr/>
+                <a:graphic xmlns:a="http://schemas.openxmlformats.org/drawingml/2006/main">
+                  <a:graphicData uri="http://schemas.microsoft.com/office/word/2010/wordprocessingInk">
+                    <w14:contentPart bwMode="auto" r:id="rId33">
+                      <w14:nvContentPartPr>
+                        <w14:cNvContentPartPr/>
+                      </w14:nvContentPartPr>
+                      <w14:xfrm>
+                        <a:off x="0" y="0"/>
+                        <a:ext cx="124560" cy="133560"/>
+                      </w14:xfrm>
+                    </w14:contentPart>
+                  </a:graphicData>
+                </a:graphic>
+              </wp:anchor>
+            </w:drawing>
+          </mc:Choice>
+          <mc:Fallback>
+            <w:pict>
+              <v:shape id="Ink 92" o:spid="_x0000_s1026" type="#_x0000_t75" style="position:absolute;margin-left:348.35pt;margin-top:.3pt;width:11.7pt;height:12.05pt;z-index:251727872;visibility:visible;mso-wrap-style:square;mso-wrap-distance-left:9pt;mso-wrap-distance-top:0;mso-wrap-distance-right:9pt;mso-wrap-distance-bottom:0;mso-position-horizontal:absolute;mso-position-horizontal-relative:text;mso-position-vertical:absolute;mso-position-vertical-relative:text" o:gfxdata="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">
+                <v:imagedata r:id="rId34" o:title=""/>
+              </v:shape>
+            </w:pict>
+          </mc:Fallback>
+        </mc:AlternateContent>
+      </w:r>
+      <w:r>
+        <w:rPr>
+          <w:rFonts w:ascii="Calibri" w:hAnsi="Calibri" w:cs="Calibri"/>
+          <w:noProof/>
+          <w:color w:val="000000"/>
+          <w:sz w:val="28"/>
+          <w:szCs w:val="24"/>
+        </w:rPr>
+        <mc:AlternateContent>
+          <mc:Choice Requires="wpi">
+            <w:drawing>
+              <wp:anchor distT="0" distB="0" distL="114300" distR="114300" simplePos="0" relativeHeight="251726848" behindDoc="0" locked="0" layoutInCell="1" allowOverlap="1">
+                <wp:simplePos x="0" y="0"/>
+                <wp:positionH relativeFrom="column">
+                  <wp:posOffset>4291305</wp:posOffset>
+                </wp:positionH>
+                <wp:positionV relativeFrom="paragraph">
+                  <wp:posOffset>-43075</wp:posOffset>
+                </wp:positionV>
+                <wp:extent cx="154800" cy="239400"/>
+                <wp:effectExtent l="38100" t="38100" r="36195" b="46355"/>
+                <wp:wrapNone/>
+                <wp:docPr id="91" name="Ink 91"/>
+                <wp:cNvGraphicFramePr/>
+                <a:graphic xmlns:a="http://schemas.openxmlformats.org/drawingml/2006/main">
+                  <a:graphicData uri="http://schemas.microsoft.com/office/word/2010/wordprocessingInk">
+                    <w14:contentPart bwMode="auto" r:id="rId35">
+                      <w14:nvContentPartPr>
+                        <w14:cNvContentPartPr/>
+                      </w14:nvContentPartPr>
+                      <w14:xfrm>
+                        <a:off x="0" y="0"/>
+                        <a:ext cx="154800" cy="239400"/>
+                      </w14:xfrm>
+                    </w14:contentPart>
+                  </a:graphicData>
+                </a:graphic>
+              </wp:anchor>
+            </w:drawing>
+          </mc:Choice>
+          <mc:Fallback>
+            <w:pict>
+              <v:shape id="Ink 91" o:spid="_x0000_s1026" type="#_x0000_t75" style="position:absolute;margin-left:336.95pt;margin-top:-4.2pt;width:14pt;height:20.6pt;z-index:251726848;visibility:visible;mso-wrap-style:square;mso-wrap-distance-left:9pt;mso-wrap-distance-top:0;mso-wrap-distance-right:9pt;mso-wrap-distance-bottom:0;mso-position-horizontal:absolute;mso-position-horizontal-relative:text;mso-position-vertical:absolute;mso-position-vertical-relative:text" o:gfxdata="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">
+                <v:imagedata r:id="rId36" o:title=""/>
+              </v:shape>
+            </w:pict>
+          </mc:Fallback>
+        </mc:AlternateContent>
+      </w:r>
+      <w:r>
+        <w:rPr>
+          <w:rFonts w:ascii="Calibri" w:hAnsi="Calibri" w:cs="Calibri"/>
+          <w:noProof/>
+          <w:color w:val="000000"/>
+          <w:sz w:val="28"/>
+          <w:szCs w:val="24"/>
+        </w:rPr>
+        <mc:AlternateContent>
+          <mc:Choice Requires="wpi">
+            <w:drawing>
+              <wp:anchor distT="0" distB="0" distL="114300" distR="114300" simplePos="0" relativeHeight="251725824" behindDoc="0" locked="0" layoutInCell="1" allowOverlap="1">
+                <wp:simplePos x="0" y="0"/>
+                <wp:positionH relativeFrom="column">
+                  <wp:posOffset>2410665</wp:posOffset>
+                </wp:positionH>
+                <wp:positionV relativeFrom="paragraph">
+                  <wp:posOffset>-52795</wp:posOffset>
+                </wp:positionV>
+                <wp:extent cx="1511280" cy="331560"/>
+                <wp:effectExtent l="38100" t="38100" r="32385" b="30480"/>
+                <wp:wrapNone/>
+                <wp:docPr id="90" name="Ink 90"/>
+                <wp:cNvGraphicFramePr/>
+                <a:graphic xmlns:a="http://schemas.openxmlformats.org/drawingml/2006/main">
+                  <a:graphicData uri="http://schemas.microsoft.com/office/word/2010/wordprocessingInk">
+                    <w14:contentPart bwMode="auto" r:id="rId37">
+                      <w14:nvContentPartPr>
+                        <w14:cNvContentPartPr/>
+                      </w14:nvContentPartPr>
+                      <w14:xfrm>
+                        <a:off x="0" y="0"/>
+                        <a:ext cx="1511280" cy="331560"/>
+                      </w14:xfrm>
+                    </w14:contentPart>
+                  </a:graphicData>
+                </a:graphic>
+              </wp:anchor>
+            </w:drawing>
+          </mc:Choice>
+          <mc:Fallback>
+            <w:pict>
+              <v:shape id="Ink 90" o:spid="_x0000_s1026" type="#_x0000_t75" style="position:absolute;margin-left:188.8pt;margin-top:-4.5pt;width:120.4pt;height:27.45pt;z-index:251725824;visibility:visible;mso-wrap-style:square;mso-wrap-distance-left:9pt;mso-wrap-distance-top:0;mso-wrap-distance-right:9pt;mso-wrap-distance-bottom:0;mso-position-horizontal:absolute;mso-position-horizontal-relative:text;mso-position-vertical:absolute;mso-position-vertical-relative:text" o:gfxdata="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">
+                <v:imagedata r:id="rId38" o:title=""/>
+              </v:shape>
+            </w:pict>
+          </mc:Fallback>
+        </mc:AlternateContent>
+      </w:r>
+      <w:r>
+        <w:rPr>
+          <w:rFonts w:ascii="Calibri" w:hAnsi="Calibri" w:cs="Calibri"/>
+          <w:noProof/>
+          <w:color w:val="000000"/>
+          <w:sz w:val="28"/>
+          <w:szCs w:val="24"/>
+        </w:rPr>
+        <mc:AlternateContent>
+          <mc:Choice Requires="wpi">
+            <w:drawing>
+              <wp:anchor distT="0" distB="0" distL="114300" distR="114300" simplePos="0" relativeHeight="251724800" behindDoc="0" locked="0" layoutInCell="1" allowOverlap="1">
+                <wp:simplePos x="0" y="0"/>
+                <wp:positionH relativeFrom="column">
+                  <wp:posOffset>2188905</wp:posOffset>
+                </wp:positionH>
+                <wp:positionV relativeFrom="paragraph">
+                  <wp:posOffset>-28675</wp:posOffset>
+                </wp:positionV>
+                <wp:extent cx="175320" cy="269280"/>
+                <wp:effectExtent l="38100" t="38100" r="34290" b="35560"/>
+                <wp:wrapNone/>
+                <wp:docPr id="89" name="Ink 89"/>
+                <wp:cNvGraphicFramePr/>
+                <a:graphic xmlns:a="http://schemas.openxmlformats.org/drawingml/2006/main">
+                  <a:graphicData uri="http://schemas.microsoft.com/office/word/2010/wordprocessingInk">
+                    <w14:contentPart bwMode="auto" r:id="rId39">
+                      <w14:nvContentPartPr>
+                        <w14:cNvContentPartPr/>
+                      </w14:nvContentPartPr>
+                      <w14:xfrm>
+                        <a:off x="0" y="0"/>
+                        <a:ext cx="175320" cy="269280"/>
+                      </w14:xfrm>
+                    </w14:contentPart>
+                  </a:graphicData>
+                </a:graphic>
+              </wp:anchor>
+            </w:drawing>
+          </mc:Choice>
+          <mc:Fallback>
+            <w:pict>
+              <v:shape id="Ink 89" o:spid="_x0000_s1026" type="#_x0000_t75" style="position:absolute;margin-left:171.4pt;margin-top:-3.05pt;width:15.25pt;height:22.95pt;z-index:251724800;visibility:visible;mso-wrap-style:square;mso-wrap-distance-left:9pt;mso-wrap-distance-top:0;mso-wrap-distance-right:9pt;mso-wrap-distance-bottom:0;mso-position-horizontal:absolute;mso-position-horizontal-relative:text;mso-position-vertical:absolute;mso-position-vertical-relative:text" o:gfxdata="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">
+                <v:imagedata r:id="rId40" o:title=""/>
+              </v:shape>
+            </w:pict>
+          </mc:Fallback>
+        </mc:AlternateContent>
+      </w:r>
+      <w:r>
+        <w:rPr>
+          <w:rFonts w:ascii="Calibri" w:hAnsi="Calibri" w:cs="Calibri"/>
+          <w:noProof/>
+          <w:color w:val="000000"/>
+          <w:sz w:val="28"/>
+          <w:szCs w:val="24"/>
+        </w:rPr>
+        <mc:AlternateContent>
+          <mc:Choice Requires="wpi">
+            <w:drawing>
+              <wp:anchor distT="0" distB="0" distL="114300" distR="114300" simplePos="0" relativeHeight="251722752" behindDoc="0" locked="0" layoutInCell="1" allowOverlap="1">
+                <wp:simplePos x="0" y="0"/>
+                <wp:positionH relativeFrom="column">
+                  <wp:posOffset>2018985</wp:posOffset>
+                </wp:positionH>
+                <wp:positionV relativeFrom="paragraph">
+                  <wp:posOffset>-23635</wp:posOffset>
+                </wp:positionV>
+                <wp:extent cx="187200" cy="180000"/>
+                <wp:effectExtent l="57150" t="38100" r="3810" b="48895"/>
+                <wp:wrapNone/>
+                <wp:docPr id="87" name="Ink 87"/>
+                <wp:cNvGraphicFramePr/>
+                <a:graphic xmlns:a="http://schemas.openxmlformats.org/drawingml/2006/main">
+                  <a:graphicData uri="http://schemas.microsoft.com/office/word/2010/wordprocessingInk">
+                    <w14:contentPart bwMode="auto" r:id="rId41">
+                      <w14:nvContentPartPr>
+                        <w14:cNvContentPartPr/>
+                      </w14:nvContentPartPr>
+                      <w14:xfrm>
+                        <a:off x="0" y="0"/>
+                        <a:ext cx="187200" cy="180000"/>
+                      </w14:xfrm>
+                    </w14:contentPart>
+                  </a:graphicData>
+                </a:graphic>
+              </wp:anchor>
+            </w:drawing>
+          </mc:Choice>
+          <mc:Fallback>
+            <w:pict>
+              <v:shape id="Ink 87" o:spid="_x0000_s1026" type="#_x0000_t75" style="position:absolute;margin-left:158pt;margin-top:-2.8pt;width:16.8pt;height:15.8pt;z-index:251722752;visibility:visible;mso-wrap-style:square;mso-wrap-distance-left:9pt;mso-wrap-distance-top:0;mso-wrap-distance-right:9pt;mso-wrap-distance-bottom:0;mso-position-horizontal:absolute;mso-position-horizontal-relative:text;mso-position-vertical:absolute;mso-position-vertical-relative:text" o:gfxdata="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">
+                <v:imagedata r:id="rId42" o:title=""/>
+              </v:shape>
+            </w:pict>
+          </mc:Fallback>
+        </mc:AlternateContent>
+      </w:r>
+      <w:r>
+        <w:rPr>
+          <w:rFonts w:ascii="Calibri" w:hAnsi="Calibri" w:cs="Calibri"/>
+          <w:noProof/>
+          <w:color w:val="000000"/>
+          <w:sz w:val="28"/>
+          <w:szCs w:val="24"/>
+        </w:rPr>
+        <mc:AlternateContent>
+          <mc:Choice Requires="wpi">
+            <w:drawing>
+              <wp:anchor distT="0" distB="0" distL="114300" distR="114300" simplePos="0" relativeHeight="251721728" behindDoc="0" locked="0" layoutInCell="1" allowOverlap="1">
+                <wp:simplePos x="0" y="0"/>
+                <wp:positionH relativeFrom="column">
+                  <wp:posOffset>1585545</wp:posOffset>
+                </wp:positionH>
+                <wp:positionV relativeFrom="paragraph">
+                  <wp:posOffset>-31915</wp:posOffset>
+                </wp:positionV>
+                <wp:extent cx="448560" cy="300600"/>
+                <wp:effectExtent l="38100" t="38100" r="27940" b="42545"/>
+                <wp:wrapNone/>
+                <wp:docPr id="86" name="Ink 86"/>
+                <wp:cNvGraphicFramePr/>
+                <a:graphic xmlns:a="http://schemas.openxmlformats.org/drawingml/2006/main">
+                  <a:graphicData uri="http://schemas.microsoft.com/office/word/2010/wordprocessingInk">
+                    <w14:contentPart bwMode="auto" r:id="rId43">
+                      <w14:nvContentPartPr>
+                        <w14:cNvContentPartPr/>
+                      </w14:nvContentPartPr>
+                      <w14:xfrm>
+                        <a:off x="0" y="0"/>
+                        <a:ext cx="448560" cy="300600"/>
+                      </w14:xfrm>
+                    </w14:contentPart>
+                  </a:graphicData>
+                </a:graphic>
+              </wp:anchor>
+            </w:drawing>
+          </mc:Choice>
+          <mc:Fallback>
+            <w:pict>
+              <v:shape id="Ink 86" o:spid="_x0000_s1026" type="#_x0000_t75" style="position:absolute;margin-left:123.9pt;margin-top:-3.45pt;width:36.55pt;height:25.5pt;z-index:251721728;visibility:visible;mso-wrap-style:square;mso-wrap-distance-left:9pt;mso-wrap-distance-top:0;mso-wrap-distance-right:9pt;mso-wrap-distance-bottom:0;mso-position-horizontal:absolute;mso-position-horizontal-relative:text;mso-position-vertical:absolute;mso-position-vertical-relative:text" o:gfxdata="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">
+                <v:imagedata r:id="rId44" o:title=""/>
+              </v:shape>
+            </w:pict>
+          </mc:Fallback>
+        </mc:AlternateContent>
+      </w:r>
+      <w:r>
+        <w:rPr>
+          <w:rFonts w:ascii="Calibri" w:hAnsi="Calibri" w:cs="Calibri"/>
+          <w:noProof/>
+          <w:color w:val="000000"/>
+          <w:sz w:val="28"/>
+          <w:szCs w:val="24"/>
+        </w:rPr>
+        <mc:AlternateContent>
+          <mc:Choice Requires="wpi">
+            <w:drawing>
+              <wp:anchor distT="0" distB="0" distL="114300" distR="114300" simplePos="0" relativeHeight="251720704" behindDoc="0" locked="0" layoutInCell="1" allowOverlap="1">
+                <wp:simplePos x="0" y="0"/>
+                <wp:positionH relativeFrom="column">
+                  <wp:posOffset>1060305</wp:posOffset>
+                </wp:positionH>
+                <wp:positionV relativeFrom="paragraph">
+                  <wp:posOffset>-87355</wp:posOffset>
+                </wp:positionV>
+                <wp:extent cx="534240" cy="408600"/>
+                <wp:effectExtent l="19050" t="38100" r="18415" b="48895"/>
+                <wp:wrapNone/>
+                <wp:docPr id="85" name="Ink 85"/>
+                <wp:cNvGraphicFramePr/>
+                <a:graphic xmlns:a="http://schemas.openxmlformats.org/drawingml/2006/main">
+                  <a:graphicData uri="http://schemas.microsoft.com/office/word/2010/wordprocessingInk">
+                    <w14:contentPart bwMode="auto" r:id="rId45">
+                      <w14:nvContentPartPr>
+                        <w14:cNvContentPartPr/>
+                      </w14:nvContentPartPr>
+                      <w14:xfrm>
+                        <a:off x="0" y="0"/>
+                        <a:ext cx="534240" cy="408600"/>
+                      </w14:xfrm>
+                    </w14:contentPart>
+                  </a:graphicData>
+                </a:graphic>
+              </wp:anchor>
+            </w:drawing>
+          </mc:Choice>
+          <mc:Fallback>
+            <w:pict>
+              <v:shape id="Ink 85" o:spid="_x0000_s1026" type="#_x0000_t75" style="position:absolute;margin-left:82.7pt;margin-top:-7.85pt;width:43.1pt;height:34.15pt;z-index:251720704;visibility:visible;mso-wrap-style:square;mso-wrap-distance-left:9pt;mso-wrap-distance-top:0;mso-wrap-distance-right:9pt;mso-wrap-distance-bottom:0;mso-position-horizontal:absolute;mso-position-horizontal-relative:text;mso-position-vertical:absolute;mso-position-vertical-relative:text" o:gfxdata="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">
+                <v:imagedata r:id="rId46" o:title=""/>
+              </v:shape>
+            </w:pict>
+          </mc:Fallback>
+        </mc:AlternateContent>
+      </w:r>
+      <w:r>
+        <w:rPr>
+          <w:rFonts w:ascii="Calibri" w:hAnsi="Calibri" w:cs="Calibri"/>
+          <w:noProof/>
+          <w:color w:val="000000"/>
+          <w:sz w:val="28"/>
+          <w:szCs w:val="24"/>
+        </w:rPr>
+        <mc:AlternateContent>
+          <mc:Choice Requires="wpi">
+            <w:drawing>
+              <wp:anchor distT="0" distB="0" distL="114300" distR="114300" simplePos="0" relativeHeight="251719680" behindDoc="0" locked="0" layoutInCell="1" allowOverlap="1">
+                <wp:simplePos x="0" y="0"/>
+                <wp:positionH relativeFrom="column">
+                  <wp:posOffset>904065</wp:posOffset>
+                </wp:positionH>
+                <wp:positionV relativeFrom="paragraph">
+                  <wp:posOffset>-98875</wp:posOffset>
+                </wp:positionV>
+                <wp:extent cx="214920" cy="455040"/>
+                <wp:effectExtent l="38100" t="38100" r="33020" b="40640"/>
+                <wp:wrapNone/>
+                <wp:docPr id="84" name="Ink 84"/>
+                <wp:cNvGraphicFramePr/>
+                <a:graphic xmlns:a="http://schemas.openxmlformats.org/drawingml/2006/main">
+                  <a:graphicData uri="http://schemas.microsoft.com/office/word/2010/wordprocessingInk">
+                    <w14:contentPart bwMode="auto" r:id="rId47">
+                      <w14:nvContentPartPr>
+                        <w14:cNvContentPartPr/>
+                      </w14:nvContentPartPr>
+                      <w14:xfrm>
+                        <a:off x="0" y="0"/>
+                        <a:ext cx="214920" cy="455040"/>
+                      </w14:xfrm>
+                    </w14:contentPart>
+                  </a:graphicData>
+                </a:graphic>
+              </wp:anchor>
+            </w:drawing>
+          </mc:Choice>
+          <mc:Fallback>
+            <w:pict>
+              <v:shape id="Ink 84" o:spid="_x0000_s1026" type="#_x0000_t75" style="position:absolute;margin-left:70.3pt;margin-top:-8.7pt;width:18.7pt;height:37.7pt;z-index:251719680;visibility:visible;mso-wrap-style:square;mso-wrap-distance-left:9pt;mso-wrap-distance-top:0;mso-wrap-distance-right:9pt;mso-wrap-distance-bottom:0;mso-position-horizontal:absolute;mso-position-horizontal-relative:text;mso-position-vertical:absolute;mso-position-vertical-relative:text" o:gfxdata="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">
+                <v:imagedata r:id="rId48" o:title=""/>
+              </v:shape>
+            </w:pict>
+          </mc:Fallback>
+        </mc:AlternateContent>
+      </w:r>
+      <w:r>
+        <w:rPr>
+          <w:rFonts w:ascii="Calibri" w:hAnsi="Calibri" w:cs="Calibri"/>
           <w:color w:val="000000"/>
           <w:sz w:val="28"/>
           <w:szCs w:val="24"/>
@@ -2501,25 +3029,7 @@
           <w:sz w:val="28"/>
           <w:szCs w:val="24"/>
         </w:rPr>
-        <w:t>_________________________________ Date</w:t>
-      </w:r>
-      <w:proofErr w:type="gramStart"/>
-      <w:r>
-        <w:rPr>
-          <w:rFonts w:ascii="Calibri" w:hAnsi="Calibri" w:cs="Calibri"/>
-          <w:sz w:val="28"/>
-          <w:szCs w:val="24"/>
-        </w:rPr>
-        <w:t>:_</w:t>
-      </w:r>
-      <w:proofErr w:type="gramEnd"/>
-      <w:r>
-        <w:rPr>
-          <w:rFonts w:ascii="Calibri" w:hAnsi="Calibri" w:cs="Calibri"/>
-          <w:sz w:val="28"/>
-          <w:szCs w:val="24"/>
-        </w:rPr>
-        <w:t>______________</w:t>
+        <w:t>_________________________________ Date:_______________</w:t>
       </w:r>
     </w:p>
     <w:p>
@@ -2534,6 +3044,54 @@
           <w:szCs w:val="24"/>
         </w:rPr>
       </w:pPr>
+      <w:r>
+        <w:rPr>
+          <w:rFonts w:ascii="Calibri" w:hAnsi="Calibri" w:cs="Calibri"/>
+          <w:noProof/>
+          <w:sz w:val="28"/>
+          <w:szCs w:val="24"/>
+        </w:rPr>
+        <mc:AlternateContent>
+          <mc:Choice Requires="wpi">
+            <w:drawing>
+              <wp:anchor distT="0" distB="0" distL="114300" distR="114300" simplePos="0" relativeHeight="251723776" behindDoc="0" locked="0" layoutInCell="1" allowOverlap="1">
+                <wp:simplePos x="0" y="0"/>
+                <wp:positionH relativeFrom="column">
+                  <wp:posOffset>2046705</wp:posOffset>
+                </wp:positionH>
+                <wp:positionV relativeFrom="paragraph">
+                  <wp:posOffset>-11125</wp:posOffset>
+                </wp:positionV>
+                <wp:extent cx="95760" cy="49680"/>
+                <wp:effectExtent l="38100" t="19050" r="38100" b="26670"/>
+                <wp:wrapNone/>
+                <wp:docPr id="88" name="Ink 88"/>
+                <wp:cNvGraphicFramePr/>
+                <a:graphic xmlns:a="http://schemas.openxmlformats.org/drawingml/2006/main">
+                  <a:graphicData uri="http://schemas.microsoft.com/office/word/2010/wordprocessingInk">
+                    <w14:contentPart bwMode="auto" r:id="rId49">
+                      <w14:nvContentPartPr>
+                        <w14:cNvContentPartPr/>
+                      </w14:nvContentPartPr>
+                      <w14:xfrm>
+                        <a:off x="0" y="0"/>
+                        <a:ext cx="95760" cy="49680"/>
+                      </w14:xfrm>
+                    </w14:contentPart>
+                  </a:graphicData>
+                </a:graphic>
+              </wp:anchor>
+            </w:drawing>
+          </mc:Choice>
+          <mc:Fallback>
+            <w:pict>
+              <v:shape id="Ink 88" o:spid="_x0000_s1026" type="#_x0000_t75" style="position:absolute;margin-left:160.2pt;margin-top:-1.2pt;width:8.85pt;height:4.5pt;z-index:251723776;visibility:visible;mso-wrap-style:square;mso-wrap-distance-left:9pt;mso-wrap-distance-top:0;mso-wrap-distance-right:9pt;mso-wrap-distance-bottom:0;mso-position-horizontal:absolute;mso-position-horizontal-relative:text;mso-position-vertical:absolute;mso-position-vertical-relative:text" o:gfxdata="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">
+                <v:imagedata r:id="rId50" o:title=""/>
+              </v:shape>
+            </w:pict>
+          </mc:Fallback>
+        </mc:AlternateContent>
+      </w:r>
     </w:p>
     <w:p>
       <w:pPr>
@@ -2591,7 +3149,7 @@
                 <wp:cNvGraphicFramePr/>
                 <a:graphic xmlns:a="http://schemas.openxmlformats.org/drawingml/2006/main">
                   <a:graphicData uri="http://schemas.microsoft.com/office/word/2010/wordprocessingInk">
-                    <w14:contentPart bwMode="auto" r:id="rId23">
+                    <w14:contentPart bwMode="auto" r:id="rId51">
                       <w14:nvContentPartPr>
                         <w14:cNvContentPartPr/>
                       </w14:nvContentPartPr>
@@ -2627,7 +3185,7 @@
                 <o:lock v:ext="edit" aspectratio="t"/>
               </v:shapetype>
               <v:shape id="Ink 45" o:spid="_x0000_s1026" type="#_x0000_t75" style="position:absolute;margin-left:134.85pt;margin-top:16.3pt;width:4.75pt;height:14.7pt;z-index:251699200;visibility:visible;mso-wrap-style:square;mso-wrap-distance-left:9pt;mso-wrap-distance-top:0;mso-wrap-distance-right:9pt;mso-wrap-distance-bottom:0;mso-position-horizontal:absolute;mso-position-horizontal-relative:text;mso-position-vertical:absolute;mso-position-vertical-relative:text" o:gfxdata="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">
-                <v:imagedata r:id="rId24" o:title=""/>
+                <v:imagedata r:id="rId52" o:title=""/>
               </v:shape>
             </w:pict>
           </mc:Fallback>
@@ -2661,7 +3219,7 @@
                 <wp:cNvGraphicFramePr/>
                 <a:graphic xmlns:a="http://schemas.openxmlformats.org/drawingml/2006/main">
                   <a:graphicData uri="http://schemas.microsoft.com/office/word/2010/wordprocessingInk">
-                    <w14:contentPart bwMode="auto" r:id="rId25">
+                    <w14:contentPart bwMode="auto" r:id="rId53">
                       <w14:nvContentPartPr>
                         <w14:cNvContentPartPr/>
                       </w14:nvContentPartPr>
@@ -2678,7 +3236,7 @@
           <mc:Fallback>
             <w:pict>
               <v:shape id="Ink 42" o:spid="_x0000_s1026" type="#_x0000_t75" style="position:absolute;margin-left:81.15pt;margin-top:14.3pt;width:3.05pt;height:21.3pt;z-index:251696128;visibility:visible;mso-wrap-style:square;mso-wrap-distance-left:9pt;mso-wrap-distance-top:0;mso-wrap-distance-right:9pt;mso-wrap-distance-bottom:0;mso-position-horizontal:absolute;mso-position-horizontal-relative:text;mso-position-vertical:absolute;mso-position-vertical-relative:text" o:gfxdata="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">
-                <v:imagedata r:id="rId26" o:title=""/>
+                <v:imagedata r:id="rId54" o:title=""/>
               </v:shape>
             </w:pict>
           </mc:Fallback>
@@ -2734,7 +3292,7 @@
                 <wp:cNvGraphicFramePr/>
                 <a:graphic xmlns:a="http://schemas.openxmlformats.org/drawingml/2006/main">
                   <a:graphicData uri="http://schemas.microsoft.com/office/word/2010/wordprocessingInk">
-                    <w14:contentPart bwMode="auto" r:id="rId27">
+                    <w14:contentPart bwMode="auto" r:id="rId55">
                       <w14:nvContentPartPr>
                         <w14:cNvContentPartPr/>
                       </w14:nvContentPartPr>
@@ -2751,7 +3309,7 @@
           <mc:Fallback>
             <w:pict>
               <v:shape id="Ink 53" o:spid="_x0000_s1026" type="#_x0000_t75" style="position:absolute;margin-left:400.8pt;margin-top:1.6pt;width:20.95pt;height:14.05pt;z-index:251707392;visibility:visible;mso-wrap-style:square;mso-wrap-distance-left:9pt;mso-wrap-distance-top:0;mso-wrap-distance-right:9pt;mso-wrap-distance-bottom:0;mso-position-horizontal:absolute;mso-position-horizontal-relative:text;mso-position-vertical:absolute;mso-position-vertical-relative:text" o:gfxdata="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">
-                <v:imagedata r:id="rId28" o:title=""/>
+                <v:imagedata r:id="rId56" o:title=""/>
               </v:shape>
             </w:pict>
           </mc:Fallback>
@@ -2783,7 +3341,7 @@
                 <wp:cNvGraphicFramePr/>
                 <a:graphic xmlns:a="http://schemas.openxmlformats.org/drawingml/2006/main">
                   <a:graphicData uri="http://schemas.microsoft.com/office/word/2010/wordprocessingInk">
-                    <w14:contentPart bwMode="auto" r:id="rId29">
+                    <w14:contentPart bwMode="auto" r:id="rId57">
                       <w14:nvContentPartPr>
                         <w14:cNvContentPartPr/>
                       </w14:nvContentPartPr>
@@ -2800,7 +3358,7 @@
           <mc:Fallback>
             <w:pict>
               <v:shape id="Ink 52" o:spid="_x0000_s1026" type="#_x0000_t75" style="position:absolute;margin-left:391.65pt;margin-top:2.8pt;width:7.2pt;height:13.7pt;z-index:251706368;visibility:visible;mso-wrap-style:square;mso-wrap-distance-left:9pt;mso-wrap-distance-top:0;mso-wrap-distance-right:9pt;mso-wrap-distance-bottom:0;mso-position-horizontal:absolute;mso-position-horizontal-relative:text;mso-position-vertical:absolute;mso-position-vertical-relative:text" o:gfxdata="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">
-                <v:imagedata r:id="rId30" o:title=""/>
+                <v:imagedata r:id="rId58" o:title=""/>
               </v:shape>
             </w:pict>
           </mc:Fallback>
@@ -2832,7 +3390,7 @@
                 <wp:cNvGraphicFramePr/>
                 <a:graphic xmlns:a="http://schemas.openxmlformats.org/drawingml/2006/main">
                   <a:graphicData uri="http://schemas.microsoft.com/office/word/2010/wordprocessingInk">
-                    <w14:contentPart bwMode="auto" r:id="rId31">
+                    <w14:contentPart bwMode="auto" r:id="rId59">
                       <w14:nvContentPartPr>
                         <w14:cNvContentPartPr/>
                       </w14:nvContentPartPr>
@@ -2849,7 +3407,7 @@
           <mc:Fallback>
             <w:pict>
               <v:shape id="Ink 51" o:spid="_x0000_s1026" type="#_x0000_t75" style="position:absolute;margin-left:378.2pt;margin-top:-5.1pt;width:20.15pt;height:22.5pt;z-index:251705344;visibility:visible;mso-wrap-style:square;mso-wrap-distance-left:9pt;mso-wrap-distance-top:0;mso-wrap-distance-right:9pt;mso-wrap-distance-bottom:0;mso-position-horizontal:absolute;mso-position-horizontal-relative:text;mso-position-vertical:absolute;mso-position-vertical-relative:text" o:gfxdata="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">
-                <v:imagedata r:id="rId32" o:title=""/>
+                <v:imagedata r:id="rId60" o:title=""/>
               </v:shape>
             </w:pict>
           </mc:Fallback>
@@ -2881,7 +3439,7 @@
                 <wp:cNvGraphicFramePr/>
                 <a:graphic xmlns:a="http://schemas.openxmlformats.org/drawingml/2006/main">
                   <a:graphicData uri="http://schemas.microsoft.com/office/word/2010/wordprocessingInk">
-                    <w14:contentPart bwMode="auto" r:id="rId33">
+                    <w14:contentPart bwMode="auto" r:id="rId61">
                       <w14:nvContentPartPr>
                         <w14:cNvContentPartPr/>
                       </w14:nvContentPartPr>
@@ -2898,7 +3456,7 @@
           <mc:Fallback>
             <w:pict>
               <v:shape id="Ink 50" o:spid="_x0000_s1026" type="#_x0000_t75" style="position:absolute;margin-left:364.1pt;margin-top:2.65pt;width:14.4pt;height:10.95pt;z-index:251704320;visibility:visible;mso-wrap-style:square;mso-wrap-distance-left:9pt;mso-wrap-distance-top:0;mso-wrap-distance-right:9pt;mso-wrap-distance-bottom:0;mso-position-horizontal:absolute;mso-position-horizontal-relative:text;mso-position-vertical:absolute;mso-position-vertical-relative:text" o:gfxdata="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">
-                <v:imagedata r:id="rId34" o:title=""/>
+                <v:imagedata r:id="rId62" o:title=""/>
               </v:shape>
             </w:pict>
           </mc:Fallback>
@@ -2930,7 +3488,7 @@
                 <wp:cNvGraphicFramePr/>
                 <a:graphic xmlns:a="http://schemas.openxmlformats.org/drawingml/2006/main">
                   <a:graphicData uri="http://schemas.microsoft.com/office/word/2010/wordprocessingInk">
-                    <w14:contentPart bwMode="auto" r:id="rId35">
+                    <w14:contentPart bwMode="auto" r:id="rId63">
                       <w14:nvContentPartPr>
                         <w14:cNvContentPartPr/>
                       </w14:nvContentPartPr>
@@ -2947,7 +3505,7 @@
           <mc:Fallback>
             <w:pict>
               <v:shape id="Ink 49" o:spid="_x0000_s1026" type="#_x0000_t75" style="position:absolute;margin-left:350.85pt;margin-top:-7.9pt;width:21.35pt;height:23.95pt;z-index:251703296;visibility:visible;mso-wrap-style:square;mso-wrap-distance-left:9pt;mso-wrap-distance-top:0;mso-wrap-distance-right:9pt;mso-wrap-distance-bottom:0;mso-position-horizontal:absolute;mso-position-horizontal-relative:text;mso-position-vertical:absolute;mso-position-vertical-relative:text" o:gfxdata="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">
-                <v:imagedata r:id="rId36" o:title=""/>
+                <v:imagedata r:id="rId64" o:title=""/>
               </v:shape>
             </w:pict>
           </mc:Fallback>
@@ -2979,7 +3537,7 @@
                 <wp:cNvGraphicFramePr/>
                 <a:graphic xmlns:a="http://schemas.openxmlformats.org/drawingml/2006/main">
                   <a:graphicData uri="http://schemas.microsoft.com/office/word/2010/wordprocessingInk">
-                    <w14:contentPart bwMode="auto" r:id="rId37">
+                    <w14:contentPart bwMode="auto" r:id="rId65">
                       <w14:nvContentPartPr>
                         <w14:cNvContentPartPr/>
                       </w14:nvContentPartPr>
@@ -2996,7 +3554,7 @@
           <mc:Fallback>
             <w:pict>
               <v:shape id="Ink 48" o:spid="_x0000_s1026" type="#_x0000_t75" style="position:absolute;margin-left:336.15pt;margin-top:.35pt;width:17.85pt;height:9.4pt;z-index:251702272;visibility:visible;mso-wrap-style:square;mso-wrap-distance-left:9pt;mso-wrap-distance-top:0;mso-wrap-distance-right:9pt;mso-wrap-distance-bottom:0;mso-position-horizontal:absolute;mso-position-horizontal-relative:text;mso-position-vertical:absolute;mso-position-vertical-relative:text" o:gfxdata="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">
-                <v:imagedata r:id="rId38" o:title=""/>
+                <v:imagedata r:id="rId66" o:title=""/>
               </v:shape>
             </w:pict>
           </mc:Fallback>
@@ -3028,7 +3586,7 @@
                 <wp:cNvGraphicFramePr/>
                 <a:graphic xmlns:a="http://schemas.openxmlformats.org/drawingml/2006/main">
                   <a:graphicData uri="http://schemas.microsoft.com/office/word/2010/wordprocessingInk">
-                    <w14:contentPart bwMode="auto" r:id="rId39">
+                    <w14:contentPart bwMode="auto" r:id="rId67">
                       <w14:nvContentPartPr>
                         <w14:cNvContentPartPr/>
                       </w14:nvContentPartPr>
@@ -3045,7 +3603,7 @@
           <mc:Fallback>
             <w:pict>
               <v:shape id="Ink 47" o:spid="_x0000_s1026" type="#_x0000_t75" style="position:absolute;margin-left:330.75pt;margin-top:-1.15pt;width:3.1pt;height:13.3pt;z-index:251701248;visibility:visible;mso-wrap-style:square;mso-wrap-distance-left:9pt;mso-wrap-distance-top:0;mso-wrap-distance-right:9pt;mso-wrap-distance-bottom:0;mso-position-horizontal:absolute;mso-position-horizontal-relative:text;mso-position-vertical:absolute;mso-position-vertical-relative:text" o:gfxdata="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">
-                <v:imagedata r:id="rId40" o:title=""/>
+                <v:imagedata r:id="rId68" o:title=""/>
               </v:shape>
             </w:pict>
           </mc:Fallback>
@@ -3077,7 +3635,7 @@
                 <wp:cNvGraphicFramePr/>
                 <a:graphic xmlns:a="http://schemas.openxmlformats.org/drawingml/2006/main">
                   <a:graphicData uri="http://schemas.microsoft.com/office/word/2010/wordprocessingInk">
-                    <w14:contentPart bwMode="auto" r:id="rId41">
+                    <w14:contentPart bwMode="auto" r:id="rId69">
                       <w14:nvContentPartPr>
                         <w14:cNvContentPartPr/>
                       </w14:nvContentPartPr>
@@ -3094,7 +3652,7 @@
           <mc:Fallback>
             <w:pict>
               <v:shape id="Ink 46" o:spid="_x0000_s1026" type="#_x0000_t75" style="position:absolute;margin-left:113.65pt;margin-top:-13.35pt;width:90.75pt;height:32.55pt;z-index:251700224;visibility:visible;mso-wrap-style:square;mso-wrap-distance-left:9pt;mso-wrap-distance-top:0;mso-wrap-distance-right:9pt;mso-wrap-distance-bottom:0;mso-position-horizontal:absolute;mso-position-horizontal-relative:text;mso-position-vertical:absolute;mso-position-vertical-relative:text" o:gfxdata="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">
-                <v:imagedata r:id="rId42" o:title=""/>
+                <v:imagedata r:id="rId70" o:title=""/>
               </v:shape>
             </w:pict>
           </mc:Fallback>
@@ -3126,7 +3684,7 @@
                 <wp:cNvGraphicFramePr/>
                 <a:graphic xmlns:a="http://schemas.openxmlformats.org/drawingml/2006/main">
                   <a:graphicData uri="http://schemas.microsoft.com/office/word/2010/wordprocessingInk">
-                    <w14:contentPart bwMode="auto" r:id="rId43">
+                    <w14:contentPart bwMode="auto" r:id="rId71">
                       <w14:nvContentPartPr>
                         <w14:cNvContentPartPr/>
                       </w14:nvContentPartPr>
@@ -3143,7 +3701,7 @@
           <mc:Fallback>
             <w:pict>
               <v:shape id="Ink 44" o:spid="_x0000_s1026" type="#_x0000_t75" style="position:absolute;margin-left:94.3pt;margin-top:-8.5pt;width:37.55pt;height:20.3pt;z-index:251698176;visibility:visible;mso-wrap-style:square;mso-wrap-distance-left:9pt;mso-wrap-distance-top:0;mso-wrap-distance-right:9pt;mso-wrap-distance-bottom:0;mso-position-horizontal:absolute;mso-position-horizontal-relative:text;mso-position-vertical:absolute;mso-position-vertical-relative:text" o:gfxdata="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">
-                <v:imagedata r:id="rId44" o:title=""/>
+                <v:imagedata r:id="rId72" o:title=""/>
               </v:shape>
             </w:pict>
           </mc:Fallback>
@@ -3175,7 +3733,7 @@
                 <wp:cNvGraphicFramePr/>
                 <a:graphic xmlns:a="http://schemas.openxmlformats.org/drawingml/2006/main">
                   <a:graphicData uri="http://schemas.microsoft.com/office/word/2010/wordprocessingInk">
-                    <w14:contentPart bwMode="auto" r:id="rId45">
+                    <w14:contentPart bwMode="auto" r:id="rId73">
                       <w14:nvContentPartPr>
                         <w14:cNvContentPartPr/>
                       </w14:nvContentPartPr>
@@ -3192,7 +3750,7 @@
           <mc:Fallback>
             <w:pict>
               <v:shape id="Ink 43" o:spid="_x0000_s1026" type="#_x0000_t75" style="position:absolute;margin-left:53.45pt;margin-top:-12.55pt;width:48.9pt;height:32.05pt;z-index:251697152;visibility:visible;mso-wrap-style:square;mso-wrap-distance-left:9pt;mso-wrap-distance-top:0;mso-wrap-distance-right:9pt;mso-wrap-distance-bottom:0;mso-position-horizontal:absolute;mso-position-horizontal-relative:text;mso-position-vertical:absolute;mso-position-vertical-relative:text" o:gfxdata="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">
-                <v:imagedata r:id="rId46" o:title=""/>
+                <v:imagedata r:id="rId74" o:title=""/>
               </v:shape>
             </w:pict>
           </mc:Fallback>
@@ -3229,25 +3787,7 @@
           <w:sz w:val="28"/>
           <w:szCs w:val="24"/>
         </w:rPr>
-        <w:t>Date</w:t>
-      </w:r>
-      <w:proofErr w:type="gramStart"/>
-      <w:r>
-        <w:rPr>
-          <w:rFonts w:ascii="Calibri" w:hAnsi="Calibri" w:cs="Calibri"/>
-          <w:sz w:val="28"/>
-          <w:szCs w:val="24"/>
-        </w:rPr>
-        <w:t>:_</w:t>
-      </w:r>
-      <w:proofErr w:type="gramEnd"/>
-      <w:r>
-        <w:rPr>
-          <w:rFonts w:ascii="Calibri" w:hAnsi="Calibri" w:cs="Calibri"/>
-          <w:sz w:val="28"/>
-          <w:szCs w:val="24"/>
-        </w:rPr>
-        <w:t>______________</w:t>
+        <w:t>Date:_______________</w:t>
       </w:r>
     </w:p>
     <w:p>
@@ -3319,7 +3859,7 @@
                 <wp:cNvGraphicFramePr/>
                 <a:graphic xmlns:a="http://schemas.openxmlformats.org/drawingml/2006/main">
                   <a:graphicData uri="http://schemas.microsoft.com/office/word/2010/wordprocessingInk">
-                    <w14:contentPart bwMode="auto" r:id="rId47">
+                    <w14:contentPart bwMode="auto" r:id="rId75">
                       <w14:nvContentPartPr>
                         <w14:cNvContentPartPr/>
                       </w14:nvContentPartPr>
@@ -3336,7 +3876,7 @@
           <mc:Fallback>
             <w:pict>
               <v:shape id="Ink 15" o:spid="_x0000_s1026" type="#_x0000_t75" style="position:absolute;margin-left:443.25pt;margin-top:15.2pt;width:18.25pt;height:15.1pt;z-index:251671552;visibility:visible;mso-wrap-style:square;mso-wrap-distance-left:9pt;mso-wrap-distance-top:0;mso-wrap-distance-right:9pt;mso-wrap-distance-bottom:0;mso-position-horizontal:absolute;mso-position-horizontal-relative:text;mso-position-vertical:absolute;mso-position-vertical-relative:text" o:gfxdata="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">
-                <v:imagedata r:id="rId48" o:title=""/>
+                <v:imagedata r:id="rId76" o:title=""/>
               </v:shape>
             </w:pict>
           </mc:Fallback>
@@ -3370,7 +3910,7 @@
                 <wp:cNvGraphicFramePr/>
                 <a:graphic xmlns:a="http://schemas.openxmlformats.org/drawingml/2006/main">
                   <a:graphicData uri="http://schemas.microsoft.com/office/word/2010/wordprocessingInk">
-                    <w14:contentPart bwMode="auto" r:id="rId49">
+                    <w14:contentPart bwMode="auto" r:id="rId77">
                       <w14:nvContentPartPr>
                         <w14:cNvContentPartPr/>
                       </w14:nvContentPartPr>
@@ -3387,7 +3927,7 @@
           <mc:Fallback>
             <w:pict>
               <v:shape id="Ink 14" o:spid="_x0000_s1026" type="#_x0000_t75" style="position:absolute;margin-left:435.25pt;margin-top:15.5pt;width:5.65pt;height:14.55pt;z-index:251670528;visibility:visible;mso-wrap-style:square;mso-wrap-distance-left:9pt;mso-wrap-distance-top:0;mso-wrap-distance-right:9pt;mso-wrap-distance-bottom:0;mso-position-horizontal:absolute;mso-position-horizontal-relative:text;mso-position-vertical:absolute;mso-position-vertical-relative:text" o:gfxdata="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">
-                <v:imagedata r:id="rId50" o:title=""/>
+                <v:imagedata r:id="rId78" o:title=""/>
               </v:shape>
             </w:pict>
           </mc:Fallback>
@@ -3421,7 +3961,7 @@
                 <wp:cNvGraphicFramePr/>
                 <a:graphic xmlns:a="http://schemas.openxmlformats.org/drawingml/2006/main">
                   <a:graphicData uri="http://schemas.microsoft.com/office/word/2010/wordprocessingInk">
-                    <w14:contentPart bwMode="auto" r:id="rId51">
+                    <w14:contentPart bwMode="auto" r:id="rId79">
                       <w14:nvContentPartPr>
                         <w14:cNvContentPartPr/>
                       </w14:nvContentPartPr>
@@ -3438,7 +3978,7 @@
           <mc:Fallback>
             <w:pict>
               <v:shape id="Ink 13" o:spid="_x0000_s1026" type="#_x0000_t75" style="position:absolute;margin-left:404.25pt;margin-top:16.25pt;width:31.05pt;height:16.2pt;z-index:251669504;visibility:visible;mso-wrap-style:square;mso-wrap-distance-left:9pt;mso-wrap-distance-top:0;mso-wrap-distance-right:9pt;mso-wrap-distance-bottom:0;mso-position-horizontal:absolute;mso-position-horizontal-relative:text;mso-position-vertical:absolute;mso-position-vertical-relative:text" o:gfxdata="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">
-                <v:imagedata r:id="rId52" o:title=""/>
+                <v:imagedata r:id="rId80" o:title=""/>
               </v:shape>
             </w:pict>
           </mc:Fallback>
@@ -3472,7 +4012,7 @@
                 <wp:cNvGraphicFramePr/>
                 <a:graphic xmlns:a="http://schemas.openxmlformats.org/drawingml/2006/main">
                   <a:graphicData uri="http://schemas.microsoft.com/office/word/2010/wordprocessingInk">
-                    <w14:contentPart bwMode="auto" r:id="rId53">
+                    <w14:contentPart bwMode="auto" r:id="rId81">
                       <w14:nvContentPartPr>
                         <w14:cNvContentPartPr/>
                       </w14:nvContentPartPr>
@@ -3489,7 +4029,7 @@
           <mc:Fallback>
             <w:pict>
               <v:shape id="Ink 12" o:spid="_x0000_s1026" type="#_x0000_t75" style="position:absolute;margin-left:383.85pt;margin-top:10.35pt;width:26.9pt;height:28.4pt;z-index:251668480;visibility:visible;mso-wrap-style:square;mso-wrap-distance-left:9pt;mso-wrap-distance-top:0;mso-wrap-distance-right:9pt;mso-wrap-distance-bottom:0;mso-position-horizontal:absolute;mso-position-horizontal-relative:text;mso-position-vertical:absolute;mso-position-vertical-relative:text" o:gfxdata="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">
-                <v:imagedata r:id="rId54" o:title=""/>
+                <v:imagedata r:id="rId82" o:title=""/>
               </v:shape>
             </w:pict>
           </mc:Fallback>
@@ -3523,7 +4063,7 @@
                 <wp:cNvGraphicFramePr/>
                 <a:graphic xmlns:a="http://schemas.openxmlformats.org/drawingml/2006/main">
                   <a:graphicData uri="http://schemas.microsoft.com/office/word/2010/wordprocessingInk">
-                    <w14:contentPart bwMode="auto" r:id="rId55">
+                    <w14:contentPart bwMode="auto" r:id="rId83">
                       <w14:nvContentPartPr>
                         <w14:cNvContentPartPr/>
                       </w14:nvContentPartPr>
@@ -3540,7 +4080,7 @@
           <mc:Fallback>
             <w:pict>
               <v:shape id="Ink 11" o:spid="_x0000_s1026" type="#_x0000_t75" style="position:absolute;margin-left:372.75pt;margin-top:14.85pt;width:19.15pt;height:17.5pt;z-index:251667456;visibility:visible;mso-wrap-style:square;mso-wrap-distance-left:9pt;mso-wrap-distance-top:0;mso-wrap-distance-right:9pt;mso-wrap-distance-bottom:0;mso-position-horizontal:absolute;mso-position-horizontal-relative:text;mso-position-vertical:absolute;mso-position-vertical-relative:text" o:gfxdata="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">
-                <v:imagedata r:id="rId56" o:title=""/>
+                <v:imagedata r:id="rId84" o:title=""/>
               </v:shape>
             </w:pict>
           </mc:Fallback>
@@ -3574,7 +4114,7 @@
                 <wp:cNvGraphicFramePr/>
                 <a:graphic xmlns:a="http://schemas.openxmlformats.org/drawingml/2006/main">
                   <a:graphicData uri="http://schemas.microsoft.com/office/word/2010/wordprocessingInk">
-                    <w14:contentPart bwMode="auto" r:id="rId57">
+                    <w14:contentPart bwMode="auto" r:id="rId85">
                       <w14:nvContentPartPr>
                         <w14:cNvContentPartPr/>
                       </w14:nvContentPartPr>
@@ -3591,7 +4131,7 @@
           <mc:Fallback>
             <w:pict>
               <v:shape id="Ink 10" o:spid="_x0000_s1026" type="#_x0000_t75" style="position:absolute;margin-left:353.3pt;margin-top:9.35pt;width:22.9pt;height:26.95pt;z-index:251666432;visibility:visible;mso-wrap-style:square;mso-wrap-distance-left:9pt;mso-wrap-distance-top:0;mso-wrap-distance-right:9pt;mso-wrap-distance-bottom:0;mso-position-horizontal:absolute;mso-position-horizontal-relative:text;mso-position-vertical:absolute;mso-position-vertical-relative:text" o:gfxdata="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">
-                <v:imagedata r:id="rId58" o:title=""/>
+                <v:imagedata r:id="rId86" o:title=""/>
               </v:shape>
             </w:pict>
           </mc:Fallback>
@@ -3625,7 +4165,7 @@
                 <wp:cNvGraphicFramePr/>
                 <a:graphic xmlns:a="http://schemas.openxmlformats.org/drawingml/2006/main">
                   <a:graphicData uri="http://schemas.microsoft.com/office/word/2010/wordprocessingInk">
-                    <w14:contentPart bwMode="auto" r:id="rId59">
+                    <w14:contentPart bwMode="auto" r:id="rId87">
                       <w14:nvContentPartPr>
                         <w14:cNvContentPartPr/>
                       </w14:nvContentPartPr>
@@ -3642,7 +4182,7 @@
           <mc:Fallback>
             <w:pict>
               <v:shape id="Ink 9" o:spid="_x0000_s1026" type="#_x0000_t75" style="position:absolute;margin-left:344.55pt;margin-top:11.55pt;width:15.55pt;height:17.7pt;z-index:251665408;visibility:visible;mso-wrap-style:square;mso-wrap-distance-left:9pt;mso-wrap-distance-top:0;mso-wrap-distance-right:9pt;mso-wrap-distance-bottom:0;mso-position-horizontal:absolute;mso-position-horizontal-relative:text;mso-position-vertical:absolute;mso-position-vertical-relative:text" o:gfxdata="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">
-                <v:imagedata r:id="rId60" o:title=""/>
+                <v:imagedata r:id="rId88" o:title=""/>
               </v:shape>
             </w:pict>
           </mc:Fallback>
@@ -3676,7 +4216,7 @@
                 <wp:cNvGraphicFramePr/>
                 <a:graphic xmlns:a="http://schemas.openxmlformats.org/drawingml/2006/main">
                   <a:graphicData uri="http://schemas.microsoft.com/office/word/2010/wordprocessingInk">
-                    <w14:contentPart bwMode="auto" r:id="rId61">
+                    <w14:contentPart bwMode="auto" r:id="rId89">
                       <w14:nvContentPartPr>
                         <w14:cNvContentPartPr/>
                       </w14:nvContentPartPr>
@@ -3693,7 +4233,7 @@
           <mc:Fallback>
             <w:pict>
               <v:shape id="Ink 8" o:spid="_x0000_s1026" type="#_x0000_t75" style="position:absolute;margin-left:336.6pt;margin-top:12.45pt;width:4.4pt;height:22.6pt;z-index:251664384;visibility:visible;mso-wrap-style:square;mso-wrap-distance-left:9pt;mso-wrap-distance-top:0;mso-wrap-distance-right:9pt;mso-wrap-distance-bottom:0;mso-position-horizontal:absolute;mso-position-horizontal-relative:text;mso-position-vertical:absolute;mso-position-vertical-relative:text" o:gfxdata="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">
-                <v:imagedata r:id="rId62" o:title=""/>
+                <v:imagedata r:id="rId90" o:title=""/>
               </v:shape>
             </w:pict>
           </mc:Fallback>
@@ -3727,7 +4267,7 @@
                 <wp:cNvGraphicFramePr/>
                 <a:graphic xmlns:a="http://schemas.openxmlformats.org/drawingml/2006/main">
                   <a:graphicData uri="http://schemas.microsoft.com/office/word/2010/wordprocessingInk">
-                    <w14:contentPart bwMode="auto" r:id="rId63">
+                    <w14:contentPart bwMode="auto" r:id="rId91">
                       <w14:nvContentPartPr>
                         <w14:cNvContentPartPr/>
                       </w14:nvContentPartPr>
@@ -3744,7 +4284,7 @@
           <mc:Fallback>
             <w:pict>
               <v:shape id="Ink 3" o:spid="_x0000_s1026" type="#_x0000_t75" style="position:absolute;margin-left:118pt;margin-top:14.15pt;width:13.8pt;height:2.7pt;z-index:251661312;visibility:visible;mso-wrap-style:square;mso-wrap-distance-left:9pt;mso-wrap-distance-top:0;mso-wrap-distance-right:9pt;mso-wrap-distance-bottom:0;mso-position-horizontal:absolute;mso-position-horizontal-relative:text;mso-position-vertical:absolute;mso-position-vertical-relative:text" o:gfxdata="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">
-                <v:imagedata r:id="rId64" o:title=""/>
+                <v:imagedata r:id="rId92" o:title=""/>
               </v:shape>
             </w:pict>
           </mc:Fallback>
@@ -3800,7 +4340,7 @@
                 <wp:cNvGraphicFramePr/>
                 <a:graphic xmlns:a="http://schemas.openxmlformats.org/drawingml/2006/main">
                   <a:graphicData uri="http://schemas.microsoft.com/office/word/2010/wordprocessingInk">
-                    <w14:contentPart bwMode="auto" r:id="rId65">
+                    <w14:contentPart bwMode="auto" r:id="rId93">
                       <w14:nvContentPartPr>
                         <w14:cNvContentPartPr/>
                       </w14:nvContentPartPr>
@@ -3817,7 +4357,7 @@
           <mc:Fallback>
             <w:pict>
               <v:shape id="Ink 28" o:spid="_x0000_s1026" type="#_x0000_t75" style="position:absolute;margin-left:80.55pt;margin-top:18.65pt;width:33.05pt;height:27.85pt;z-index:251684864;visibility:visible;mso-wrap-style:square;mso-wrap-distance-left:9pt;mso-wrap-distance-top:0;mso-wrap-distance-right:9pt;mso-wrap-distance-bottom:0;mso-position-horizontal:absolute;mso-position-horizontal-relative:text;mso-position-vertical:absolute;mso-position-vertical-relative:text" o:gfxdata="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">
-                <v:imagedata r:id="rId66" o:title=""/>
+                <v:imagedata r:id="rId94" o:title=""/>
               </v:shape>
             </w:pict>
           </mc:Fallback>
@@ -3849,7 +4389,7 @@
                 <wp:cNvGraphicFramePr/>
                 <a:graphic xmlns:a="http://schemas.openxmlformats.org/drawingml/2006/main">
                   <a:graphicData uri="http://schemas.microsoft.com/office/word/2010/wordprocessingInk">
-                    <w14:contentPart bwMode="auto" r:id="rId67">
+                    <w14:contentPart bwMode="auto" r:id="rId95">
                       <w14:nvContentPartPr>
                         <w14:cNvContentPartPr/>
                       </w14:nvContentPartPr>
@@ -3866,7 +4406,7 @@
           <mc:Fallback>
             <w:pict>
               <v:shape id="Ink 7" o:spid="_x0000_s1026" type="#_x0000_t75" style="position:absolute;margin-left:197.35pt;margin-top:-2.7pt;width:72.1pt;height:10.2pt;z-index:251663360;visibility:visible;mso-wrap-style:square;mso-wrap-distance-left:9pt;mso-wrap-distance-top:0;mso-wrap-distance-right:9pt;mso-wrap-distance-bottom:0;mso-position-horizontal:absolute;mso-position-horizontal-relative:text;mso-position-vertical:absolute;mso-position-vertical-relative:text" o:gfxdata="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">
-                <v:imagedata r:id="rId68" o:title=""/>
+                <v:imagedata r:id="rId96" o:title=""/>
               </v:shape>
             </w:pict>
           </mc:Fallback>
@@ -3898,7 +4438,7 @@
                 <wp:cNvGraphicFramePr/>
                 <a:graphic xmlns:a="http://schemas.openxmlformats.org/drawingml/2006/main">
                   <a:graphicData uri="http://schemas.microsoft.com/office/word/2010/wordprocessingInk">
-                    <w14:contentPart bwMode="auto" r:id="rId69">
+                    <w14:contentPart bwMode="auto" r:id="rId97">
                       <w14:nvContentPartPr>
                         <w14:cNvContentPartPr/>
                       </w14:nvContentPartPr>
@@ -3915,7 +4455,7 @@
           <mc:Fallback>
             <w:pict>
               <v:shape id="Ink 6" o:spid="_x0000_s1026" type="#_x0000_t75" style="position:absolute;margin-left:163.05pt;margin-top:-6pt;width:44.2pt;height:11.25pt;z-index:251662336;visibility:visible;mso-wrap-style:square;mso-wrap-distance-left:9pt;mso-wrap-distance-top:0;mso-wrap-distance-right:9pt;mso-wrap-distance-bottom:0;mso-position-horizontal:absolute;mso-position-horizontal-relative:text;mso-position-vertical:absolute;mso-position-vertical-relative:text" o:gfxdata="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">
-                <v:imagedata r:id="rId70" o:title=""/>
+                <v:imagedata r:id="rId98" o:title=""/>
               </v:shape>
             </w:pict>
           </mc:Fallback>
@@ -3947,7 +4487,7 @@
                 <wp:cNvGraphicFramePr/>
                 <a:graphic xmlns:a="http://schemas.openxmlformats.org/drawingml/2006/main">
                   <a:graphicData uri="http://schemas.microsoft.com/office/word/2010/wordprocessingInk">
-                    <w14:contentPart bwMode="auto" r:id="rId71">
+                    <w14:contentPart bwMode="auto" r:id="rId99">
                       <w14:nvContentPartPr>
                         <w14:cNvContentPartPr/>
                       </w14:nvContentPartPr>
@@ -3964,7 +4504,7 @@
           <mc:Fallback>
             <w:pict>
               <v:shape id="Ink 2" o:spid="_x0000_s1026" type="#_x0000_t75" style="position:absolute;margin-left:75.45pt;margin-top:-7.05pt;width:61.55pt;height:13.9pt;z-index:251660288;visibility:visible;mso-wrap-style:square;mso-wrap-distance-left:9pt;mso-wrap-distance-top:0;mso-wrap-distance-right:9pt;mso-wrap-distance-bottom:0;mso-position-horizontal:absolute;mso-position-horizontal-relative:text;mso-position-vertical:absolute;mso-position-vertical-relative:text" o:gfxdata="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">
-                <v:imagedata r:id="rId72" o:title=""/>
+                <v:imagedata r:id="rId100" o:title=""/>
               </v:shape>
             </w:pict>
           </mc:Fallback>
@@ -3996,7 +4536,7 @@
                 <wp:cNvGraphicFramePr/>
                 <a:graphic xmlns:a="http://schemas.openxmlformats.org/drawingml/2006/main">
                   <a:graphicData uri="http://schemas.microsoft.com/office/word/2010/wordprocessingInk">
-                    <w14:contentPart bwMode="auto" r:id="rId73">
+                    <w14:contentPart bwMode="auto" r:id="rId101">
                       <w14:nvContentPartPr>
                         <w14:cNvContentPartPr/>
                       </w14:nvContentPartPr>
@@ -4013,7 +4553,7 @@
           <mc:Fallback>
             <w:pict>
               <v:shape id="Ink 1" o:spid="_x0000_s1026" type="#_x0000_t75" style="position:absolute;margin-left:68.65pt;margin-top:-8.5pt;width:15.75pt;height:17.25pt;z-index:251659264;visibility:visible;mso-wrap-style:square;mso-wrap-distance-left:9pt;mso-wrap-distance-top:0;mso-wrap-distance-right:9pt;mso-wrap-distance-bottom:0;mso-position-horizontal:absolute;mso-position-horizontal-relative:text;mso-position-vertical:absolute;mso-position-vertical-relative:text" o:gfxdata="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">
-                <v:imagedata r:id="rId74" o:title=""/>
+                <v:imagedata r:id="rId102" o:title=""/>
               </v:shape>
             </w:pict>
           </mc:Fallback>
@@ -4059,25 +4599,7 @@
           <w:sz w:val="28"/>
           <w:szCs w:val="24"/>
         </w:rPr>
-        <w:t>Date</w:t>
-      </w:r>
-      <w:proofErr w:type="gramStart"/>
-      <w:r>
-        <w:rPr>
-          <w:rFonts w:ascii="Calibri" w:hAnsi="Calibri" w:cs="Calibri"/>
-          <w:sz w:val="28"/>
-          <w:szCs w:val="24"/>
-        </w:rPr>
-        <w:t>:_</w:t>
-      </w:r>
-      <w:proofErr w:type="gramEnd"/>
-      <w:r>
-        <w:rPr>
-          <w:rFonts w:ascii="Calibri" w:hAnsi="Calibri" w:cs="Calibri"/>
-          <w:sz w:val="28"/>
-          <w:szCs w:val="24"/>
-        </w:rPr>
-        <w:t>______________</w:t>
+        <w:t>Date:_______________</w:t>
       </w:r>
     </w:p>
     <w:p>
@@ -4118,7 +4640,7 @@
                 <wp:cNvGraphicFramePr/>
                 <a:graphic xmlns:a="http://schemas.openxmlformats.org/drawingml/2006/main">
                   <a:graphicData uri="http://schemas.microsoft.com/office/word/2010/wordprocessingInk">
-                    <w14:contentPart bwMode="auto" r:id="rId75">
+                    <w14:contentPart bwMode="auto" r:id="rId103">
                       <w14:nvContentPartPr>
                         <w14:cNvContentPartPr/>
                       </w14:nvContentPartPr>
@@ -4135,7 +4657,7 @@
           <mc:Fallback>
             <w:pict>
               <v:shape id="Ink 38" o:spid="_x0000_s1026" type="#_x0000_t75" style="position:absolute;margin-left:419.95pt;margin-top:-6pt;width:17.2pt;height:17.85pt;z-index:251695104;visibility:visible;mso-wrap-style:square;mso-wrap-distance-left:9pt;mso-wrap-distance-top:0;mso-wrap-distance-right:9pt;mso-wrap-distance-bottom:0;mso-position-horizontal:absolute;mso-position-horizontal-relative:text;mso-position-vertical:absolute;mso-position-vertical-relative:text" o:gfxdata="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">
-                <v:imagedata r:id="rId76" o:title=""/>
+                <v:imagedata r:id="rId104" o:title=""/>
               </v:shape>
             </w:pict>
           </mc:Fallback>
@@ -4167,7 +4689,7 @@
                 <wp:cNvGraphicFramePr/>
                 <a:graphic xmlns:a="http://schemas.openxmlformats.org/drawingml/2006/main">
                   <a:graphicData uri="http://schemas.microsoft.com/office/word/2010/wordprocessingInk">
-                    <w14:contentPart bwMode="auto" r:id="rId77">
+                    <w14:contentPart bwMode="auto" r:id="rId105">
                       <w14:nvContentPartPr>
                         <w14:cNvContentPartPr/>
                       </w14:nvContentPartPr>
@@ -4184,7 +4706,7 @@
           <mc:Fallback>
             <w:pict>
               <v:shape id="Ink 37" o:spid="_x0000_s1026" type="#_x0000_t75" style="position:absolute;margin-left:415.7pt;margin-top:-4.6pt;width:1.7pt;height:13.05pt;z-index:251694080;visibility:visible;mso-wrap-style:square;mso-wrap-distance-left:9pt;mso-wrap-distance-top:0;mso-wrap-distance-right:9pt;mso-wrap-distance-bottom:0;mso-position-horizontal:absolute;mso-position-horizontal-relative:text;mso-position-vertical:absolute;mso-position-vertical-relative:text" o:gfxdata="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">
-                <v:imagedata r:id="rId78" o:title=""/>
+                <v:imagedata r:id="rId106" o:title=""/>
               </v:shape>
             </w:pict>
           </mc:Fallback>
@@ -4216,7 +4738,7 @@
                 <wp:cNvGraphicFramePr/>
                 <a:graphic xmlns:a="http://schemas.openxmlformats.org/drawingml/2006/main">
                   <a:graphicData uri="http://schemas.microsoft.com/office/word/2010/wordprocessingInk">
-                    <w14:contentPart bwMode="auto" r:id="rId79">
+                    <w14:contentPart bwMode="auto" r:id="rId107">
                       <w14:nvContentPartPr>
                         <w14:cNvContentPartPr/>
                       </w14:nvContentPartPr>
@@ -4233,7 +4755,7 @@
           <mc:Fallback>
             <w:pict>
               <v:shape id="Ink 36" o:spid="_x0000_s1026" type="#_x0000_t75" style="position:absolute;margin-left:402.35pt;margin-top:-4.05pt;width:10.05pt;height:14.35pt;z-index:251693056;visibility:visible;mso-wrap-style:square;mso-wrap-distance-left:9pt;mso-wrap-distance-top:0;mso-wrap-distance-right:9pt;mso-wrap-distance-bottom:0;mso-position-horizontal:absolute;mso-position-horizontal-relative:text;mso-position-vertical:absolute;mso-position-vertical-relative:text" o:gfxdata="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">
-                <v:imagedata r:id="rId80" o:title=""/>
+                <v:imagedata r:id="rId108" o:title=""/>
               </v:shape>
             </w:pict>
           </mc:Fallback>
@@ -4265,7 +4787,7 @@
                 <wp:cNvGraphicFramePr/>
                 <a:graphic xmlns:a="http://schemas.openxmlformats.org/drawingml/2006/main">
                   <a:graphicData uri="http://schemas.microsoft.com/office/word/2010/wordprocessingInk">
-                    <w14:contentPart bwMode="auto" r:id="rId81">
+                    <w14:contentPart bwMode="auto" r:id="rId109">
                       <w14:nvContentPartPr>
                         <w14:cNvContentPartPr/>
                       </w14:nvContentPartPr>
@@ -4282,7 +4804,7 @@
           <mc:Fallback>
             <w:pict>
               <v:shape id="Ink 35" o:spid="_x0000_s1026" type="#_x0000_t75" style="position:absolute;margin-left:389.75pt;margin-top:-4.4pt;width:13.15pt;height:15.55pt;z-index:251692032;visibility:visible;mso-wrap-style:square;mso-wrap-distance-left:9pt;mso-wrap-distance-top:0;mso-wrap-distance-right:9pt;mso-wrap-distance-bottom:0;mso-position-horizontal:absolute;mso-position-horizontal-relative:text;mso-position-vertical:absolute;mso-position-vertical-relative:text" o:gfxdata="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">
-                <v:imagedata r:id="rId82" o:title=""/>
+                <v:imagedata r:id="rId110" o:title=""/>
               </v:shape>
             </w:pict>
           </mc:Fallback>
@@ -4314,7 +4836,7 @@
                 <wp:cNvGraphicFramePr/>
                 <a:graphic xmlns:a="http://schemas.openxmlformats.org/drawingml/2006/main">
                   <a:graphicData uri="http://schemas.microsoft.com/office/word/2010/wordprocessingInk">
-                    <w14:contentPart bwMode="auto" r:id="rId83">
+                    <w14:contentPart bwMode="auto" r:id="rId111">
                       <w14:nvContentPartPr>
                         <w14:cNvContentPartPr/>
                       </w14:nvContentPartPr>
@@ -4331,7 +4853,7 @@
           <mc:Fallback>
             <w:pict>
               <v:shape id="Ink 34" o:spid="_x0000_s1026" type="#_x0000_t75" style="position:absolute;margin-left:376.2pt;margin-top:-6.55pt;width:12pt;height:19.4pt;z-index:251691008;visibility:visible;mso-wrap-style:square;mso-wrap-distance-left:9pt;mso-wrap-distance-top:0;mso-wrap-distance-right:9pt;mso-wrap-distance-bottom:0;mso-position-horizontal:absolute;mso-position-horizontal-relative:text;mso-position-vertical:absolute;mso-position-vertical-relative:text" o:gfxdata="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">
-                <v:imagedata r:id="rId84" o:title=""/>
+                <v:imagedata r:id="rId112" o:title=""/>
               </v:shape>
             </w:pict>
           </mc:Fallback>
@@ -4363,7 +4885,7 @@
                 <wp:cNvGraphicFramePr/>
                 <a:graphic xmlns:a="http://schemas.openxmlformats.org/drawingml/2006/main">
                   <a:graphicData uri="http://schemas.microsoft.com/office/word/2010/wordprocessingInk">
-                    <w14:contentPart bwMode="auto" r:id="rId85">
+                    <w14:contentPart bwMode="auto" r:id="rId113">
                       <w14:nvContentPartPr>
                         <w14:cNvContentPartPr/>
                       </w14:nvContentPartPr>
@@ -4380,7 +4902,7 @@
           <mc:Fallback>
             <w:pict>
               <v:shape id="Ink 33" o:spid="_x0000_s1026" type="#_x0000_t75" style="position:absolute;margin-left:364.6pt;margin-top:-3.9pt;width:11.85pt;height:13.15pt;z-index:251689984;visibility:visible;mso-wrap-style:square;mso-wrap-distance-left:9pt;mso-wrap-distance-top:0;mso-wrap-distance-right:9pt;mso-wrap-distance-bottom:0;mso-position-horizontal:absolute;mso-position-horizontal-relative:text;mso-position-vertical:absolute;mso-position-vertical-relative:text" o:gfxdata="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">
-                <v:imagedata r:id="rId86" o:title=""/>
+                <v:imagedata r:id="rId114" o:title=""/>
               </v:shape>
             </w:pict>
           </mc:Fallback>
@@ -4412,7 +4934,7 @@
                 <wp:cNvGraphicFramePr/>
                 <a:graphic xmlns:a="http://schemas.openxmlformats.org/drawingml/2006/main">
                   <a:graphicData uri="http://schemas.microsoft.com/office/word/2010/wordprocessingInk">
-                    <w14:contentPart bwMode="auto" r:id="rId87">
+                    <w14:contentPart bwMode="auto" r:id="rId115">
                       <w14:nvContentPartPr>
                         <w14:cNvContentPartPr/>
                       </w14:nvContentPartPr>
@@ -4429,7 +4951,7 @@
           <mc:Fallback>
             <w:pict>
               <v:shape id="Ink 32" o:spid="_x0000_s1026" type="#_x0000_t75" style="position:absolute;margin-left:351.6pt;margin-top:-7.85pt;width:10.65pt;height:20.65pt;z-index:251688960;visibility:visible;mso-wrap-style:square;mso-wrap-distance-left:9pt;mso-wrap-distance-top:0;mso-wrap-distance-right:9pt;mso-wrap-distance-bottom:0;mso-position-horizontal:absolute;mso-position-horizontal-relative:text;mso-position-vertical:absolute;mso-position-vertical-relative:text" o:gfxdata="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">
-                <v:imagedata r:id="rId88" o:title=""/>
+                <v:imagedata r:id="rId116" o:title=""/>
               </v:shape>
             </w:pict>
           </mc:Fallback>
@@ -4461,7 +4983,7 @@
                 <wp:cNvGraphicFramePr/>
                 <a:graphic xmlns:a="http://schemas.openxmlformats.org/drawingml/2006/main">
                   <a:graphicData uri="http://schemas.microsoft.com/office/word/2010/wordprocessingInk">
-                    <w14:contentPart bwMode="auto" r:id="rId89">
+                    <w14:contentPart bwMode="auto" r:id="rId117">
                       <w14:nvContentPartPr>
                         <w14:cNvContentPartPr/>
                       </w14:nvContentPartPr>
@@ -4478,7 +5000,7 @@
           <mc:Fallback>
             <w:pict>
               <v:shape id="Ink 31" o:spid="_x0000_s1026" type="#_x0000_t75" style="position:absolute;margin-left:340.3pt;margin-top:-3.35pt;width:12.55pt;height:12.45pt;z-index:251687936;visibility:visible;mso-wrap-style:square;mso-wrap-distance-left:9pt;mso-wrap-distance-top:0;mso-wrap-distance-right:9pt;mso-wrap-distance-bottom:0;mso-position-horizontal:absolute;mso-position-horizontal-relative:text;mso-position-vertical:absolute;mso-position-vertical-relative:text" o:gfxdata="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">
-                <v:imagedata r:id="rId90" o:title=""/>
+                <v:imagedata r:id="rId118" o:title=""/>
               </v:shape>
             </w:pict>
           </mc:Fallback>
@@ -4510,7 +5032,7 @@
                 <wp:cNvGraphicFramePr/>
                 <a:graphic xmlns:a="http://schemas.openxmlformats.org/drawingml/2006/main">
                   <a:graphicData uri="http://schemas.microsoft.com/office/word/2010/wordprocessingInk">
-                    <w14:contentPart bwMode="auto" r:id="rId91">
+                    <w14:contentPart bwMode="auto" r:id="rId119">
                       <w14:nvContentPartPr>
                         <w14:cNvContentPartPr/>
                       </w14:nvContentPartPr>
@@ -4527,7 +5049,7 @@
           <mc:Fallback>
             <w:pict>
               <v:shape id="Ink 30" o:spid="_x0000_s1026" type="#_x0000_t75" style="position:absolute;margin-left:335.85pt;margin-top:-5pt;width:2.1pt;height:17.8pt;z-index:251686912;visibility:visible;mso-wrap-style:square;mso-wrap-distance-left:9pt;mso-wrap-distance-top:0;mso-wrap-distance-right:9pt;mso-wrap-distance-bottom:0;mso-position-horizontal:absolute;mso-position-horizontal-relative:text;mso-position-vertical:absolute;mso-position-vertical-relative:text" o:gfxdata="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">
-                <v:imagedata r:id="rId92" o:title=""/>
+                <v:imagedata r:id="rId120" o:title=""/>
               </v:shape>
             </w:pict>
           </mc:Fallback>
@@ -4559,7 +5081,7 @@
                 <wp:cNvGraphicFramePr/>
                 <a:graphic xmlns:a="http://schemas.openxmlformats.org/drawingml/2006/main">
                   <a:graphicData uri="http://schemas.microsoft.com/office/word/2010/wordprocessingInk">
-                    <w14:contentPart bwMode="auto" r:id="rId93">
+                    <w14:contentPart bwMode="auto" r:id="rId121">
                       <w14:nvContentPartPr>
                         <w14:cNvContentPartPr/>
                       </w14:nvContentPartPr>
@@ -4576,7 +5098,7 @@
           <mc:Fallback>
             <w:pict>
               <v:shape id="Ink 29" o:spid="_x0000_s1026" type="#_x0000_t75" style="position:absolute;margin-left:101.25pt;margin-top:-10.05pt;width:137.55pt;height:40.15pt;z-index:251685888;visibility:visible;mso-wrap-style:square;mso-wrap-distance-left:9pt;mso-wrap-distance-top:0;mso-wrap-distance-right:9pt;mso-wrap-distance-bottom:0;mso-position-horizontal:absolute;mso-position-horizontal-relative:text;mso-position-vertical:absolute;mso-position-vertical-relative:text" o:gfxdata="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">
-                <v:imagedata r:id="rId94" o:title=""/>
+                <v:imagedata r:id="rId122" o:title=""/>
               </v:shape>
             </w:pict>
           </mc:Fallback>
@@ -4608,7 +5130,7 @@
                 <wp:cNvGraphicFramePr/>
                 <a:graphic xmlns:a="http://schemas.openxmlformats.org/drawingml/2006/main">
                   <a:graphicData uri="http://schemas.microsoft.com/office/word/2010/wordprocessingInk">
-                    <w14:contentPart bwMode="auto" r:id="rId95">
+                    <w14:contentPart bwMode="auto" r:id="rId123">
                       <w14:nvContentPartPr>
                         <w14:cNvContentPartPr/>
                       </w14:nvContentPartPr>
@@ -4625,7 +5147,7 @@
           <mc:Fallback>
             <w:pict>
               <v:shape id="Ink 25" o:spid="_x0000_s1026" type="#_x0000_t75" style="position:absolute;margin-left:404.55pt;margin-top:26.45pt;width:11.5pt;height:15.55pt;z-index:251681792;visibility:visible;mso-wrap-style:square;mso-wrap-distance-left:9pt;mso-wrap-distance-top:0;mso-wrap-distance-right:9pt;mso-wrap-distance-bottom:0;mso-position-horizontal:absolute;mso-position-horizontal-relative:text;mso-position-vertical:absolute;mso-position-vertical-relative:text" o:gfxdata="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">
-                <v:imagedata r:id="rId96" o:title=""/>
+                <v:imagedata r:id="rId124" o:title=""/>
               </v:shape>
             </w:pict>
           </mc:Fallback>
@@ -4662,25 +5184,7 @@
           <w:sz w:val="28"/>
           <w:szCs w:val="24"/>
         </w:rPr>
-        <w:t>Date</w:t>
-      </w:r>
-      <w:proofErr w:type="gramStart"/>
-      <w:r>
-        <w:rPr>
-          <w:rFonts w:ascii="Calibri" w:hAnsi="Calibri" w:cs="Calibri"/>
-          <w:sz w:val="28"/>
-          <w:szCs w:val="24"/>
-        </w:rPr>
-        <w:t>:_</w:t>
-      </w:r>
-      <w:proofErr w:type="gramEnd"/>
-      <w:r>
-        <w:rPr>
-          <w:rFonts w:ascii="Calibri" w:hAnsi="Calibri" w:cs="Calibri"/>
-          <w:sz w:val="28"/>
-          <w:szCs w:val="24"/>
-        </w:rPr>
-        <w:t>______________</w:t>
+        <w:t>Date:_______________</w:t>
       </w:r>
     </w:p>
     <w:p>
@@ -4716,7 +5220,7 @@
                 <wp:cNvGraphicFramePr/>
                 <a:graphic xmlns:a="http://schemas.openxmlformats.org/drawingml/2006/main">
                   <a:graphicData uri="http://schemas.microsoft.com/office/word/2010/wordprocessingInk">
-                    <w14:contentPart bwMode="auto" r:id="rId97">
+                    <w14:contentPart bwMode="auto" r:id="rId125">
                       <w14:nvContentPartPr>
                         <w14:cNvContentPartPr/>
                       </w14:nvContentPartPr>
@@ -4733,7 +5237,7 @@
           <mc:Fallback>
             <w:pict>
               <v:shape id="Ink 55" o:spid="_x0000_s1026" type="#_x0000_t75" style="position:absolute;margin-left:582.8pt;margin-top:52.45pt;width:2.15pt;height:6.65pt;z-index:251709440;visibility:visible;mso-wrap-style:square;mso-wrap-distance-left:9pt;mso-wrap-distance-top:0;mso-wrap-distance-right:9pt;mso-wrap-distance-bottom:0;mso-position-horizontal:absolute;mso-position-horizontal-relative:text;mso-position-vertical:absolute;mso-position-vertical-relative:text" o:gfxdata="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">
-                <v:imagedata r:id="rId98" o:title=""/>
+                <v:imagedata r:id="rId126" o:title=""/>
               </v:shape>
             </w:pict>
           </mc:Fallback>
@@ -4765,7 +5269,7 @@
                 <wp:cNvGraphicFramePr/>
                 <a:graphic xmlns:a="http://schemas.openxmlformats.org/drawingml/2006/main">
                   <a:graphicData uri="http://schemas.microsoft.com/office/word/2010/wordprocessingInk">
-                    <w14:contentPart bwMode="auto" r:id="rId99">
+                    <w14:contentPart bwMode="auto" r:id="rId127">
                       <w14:nvContentPartPr>
                         <w14:cNvContentPartPr/>
                       </w14:nvContentPartPr>
@@ -4782,7 +5286,7 @@
           <mc:Fallback>
             <w:pict>
               <v:shape id="Ink 54" o:spid="_x0000_s1026" type="#_x0000_t75" style="position:absolute;margin-left:574.45pt;margin-top:50.45pt;width:49.45pt;height:6.1pt;z-index:251708416;visibility:visible;mso-wrap-style:square;mso-wrap-distance-left:9pt;mso-wrap-distance-top:0;mso-wrap-distance-right:9pt;mso-wrap-distance-bottom:0;mso-position-horizontal:absolute;mso-position-horizontal-relative:text;mso-position-vertical:absolute;mso-position-vertical-relative:text" o:gfxdata="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">
-                <v:imagedata r:id="rId100" o:title=""/>
+                <v:imagedata r:id="rId128" o:title=""/>
               </v:shape>
             </w:pict>
           </mc:Fallback>
@@ -4814,7 +5318,7 @@
                 <wp:cNvGraphicFramePr/>
                 <a:graphic xmlns:a="http://schemas.openxmlformats.org/drawingml/2006/main">
                   <a:graphicData uri="http://schemas.microsoft.com/office/word/2010/wordprocessingInk">
-                    <w14:contentPart bwMode="auto" r:id="rId101">
+                    <w14:contentPart bwMode="auto" r:id="rId129">
                       <w14:nvContentPartPr>
                         <w14:cNvContentPartPr/>
                       </w14:nvContentPartPr>
@@ -4831,7 +5335,7 @@
           <mc:Fallback>
             <w:pict>
               <v:shape id="Ink 27" o:spid="_x0000_s1026" type="#_x0000_t75" style="position:absolute;margin-left:426pt;margin-top:-9.1pt;width:20.95pt;height:18.5pt;z-index:251683840;visibility:visible;mso-wrap-style:square;mso-wrap-distance-left:9pt;mso-wrap-distance-top:0;mso-wrap-distance-right:9pt;mso-wrap-distance-bottom:0;mso-position-horizontal:absolute;mso-position-horizontal-relative:text;mso-position-vertical:absolute;mso-position-vertical-relative:text" o:gfxdata="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">
-                <v:imagedata r:id="rId102" o:title=""/>
+                <v:imagedata r:id="rId130" o:title=""/>
               </v:shape>
             </w:pict>
           </mc:Fallback>
@@ -4863,7 +5367,7 @@
                 <wp:cNvGraphicFramePr/>
                 <a:graphic xmlns:a="http://schemas.openxmlformats.org/drawingml/2006/main">
                   <a:graphicData uri="http://schemas.microsoft.com/office/word/2010/wordprocessingInk">
-                    <w14:contentPart bwMode="auto" r:id="rId103">
+                    <w14:contentPart bwMode="auto" r:id="rId131">
                       <w14:nvContentPartPr>
                         <w14:cNvContentPartPr/>
                       </w14:nvContentPartPr>
@@ -4880,7 +5384,7 @@
           <mc:Fallback>
             <w:pict>
               <v:shape id="Ink 26" o:spid="_x0000_s1026" type="#_x0000_t75" style="position:absolute;margin-left:420.4pt;margin-top:-5.45pt;width:2.45pt;height:16.95pt;z-index:251682816;visibility:visible;mso-wrap-style:square;mso-wrap-distance-left:9pt;mso-wrap-distance-top:0;mso-wrap-distance-right:9pt;mso-wrap-distance-bottom:0;mso-position-horizontal:absolute;mso-position-horizontal-relative:text;mso-position-vertical:absolute;mso-position-vertical-relative:text" o:gfxdata="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">
-                <v:imagedata r:id="rId104" o:title=""/>
+                <v:imagedata r:id="rId132" o:title=""/>
               </v:shape>
             </w:pict>
           </mc:Fallback>
@@ -4912,7 +5416,7 @@
                 <wp:cNvGraphicFramePr/>
                 <a:graphic xmlns:a="http://schemas.openxmlformats.org/drawingml/2006/main">
                   <a:graphicData uri="http://schemas.microsoft.com/office/word/2010/wordprocessingInk">
-                    <w14:contentPart bwMode="auto" r:id="rId105">
+                    <w14:contentPart bwMode="auto" r:id="rId133">
                       <w14:nvContentPartPr>
                         <w14:cNvContentPartPr/>
                       </w14:nvContentPartPr>
@@ -4929,7 +5433,7 @@
           <mc:Fallback>
             <w:pict>
               <v:shape id="Ink 24" o:spid="_x0000_s1026" type="#_x0000_t75" style="position:absolute;margin-left:389.9pt;margin-top:-6.85pt;width:15.05pt;height:17.45pt;z-index:251680768;visibility:visible;mso-wrap-style:square;mso-wrap-distance-left:9pt;mso-wrap-distance-top:0;mso-wrap-distance-right:9pt;mso-wrap-distance-bottom:0;mso-position-horizontal:absolute;mso-position-horizontal-relative:text;mso-position-vertical:absolute;mso-position-vertical-relative:text" o:gfxdata="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">
-                <v:imagedata r:id="rId106" o:title=""/>
+                <v:imagedata r:id="rId134" o:title=""/>
               </v:shape>
             </w:pict>
           </mc:Fallback>
@@ -4961,7 +5465,7 @@
                 <wp:cNvGraphicFramePr/>
                 <a:graphic xmlns:a="http://schemas.openxmlformats.org/drawingml/2006/main">
                   <a:graphicData uri="http://schemas.microsoft.com/office/word/2010/wordprocessingInk">
-                    <w14:contentPart bwMode="auto" r:id="rId107">
+                    <w14:contentPart bwMode="auto" r:id="rId135">
                       <w14:nvContentPartPr>
                         <w14:cNvContentPartPr/>
                       </w14:nvContentPartPr>
@@ -4978,7 +5482,7 @@
           <mc:Fallback>
             <w:pict>
               <v:shape id="Ink 23" o:spid="_x0000_s1026" type="#_x0000_t75" style="position:absolute;margin-left:376.5pt;margin-top:-9.9pt;width:9.85pt;height:24.7pt;z-index:251679744;visibility:visible;mso-wrap-style:square;mso-wrap-distance-left:9pt;mso-wrap-distance-top:0;mso-wrap-distance-right:9pt;mso-wrap-distance-bottom:0;mso-position-horizontal:absolute;mso-position-horizontal-relative:text;mso-position-vertical:absolute;mso-position-vertical-relative:text" o:gfxdata="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">
-                <v:imagedata r:id="rId108" o:title=""/>
+                <v:imagedata r:id="rId136" o:title=""/>
               </v:shape>
             </w:pict>
           </mc:Fallback>
@@ -5010,7 +5514,7 @@
                 <wp:cNvGraphicFramePr/>
                 <a:graphic xmlns:a="http://schemas.openxmlformats.org/drawingml/2006/main">
                   <a:graphicData uri="http://schemas.microsoft.com/office/word/2010/wordprocessingInk">
-                    <w14:contentPart bwMode="auto" r:id="rId109">
+                    <w14:contentPart bwMode="auto" r:id="rId137">
                       <w14:nvContentPartPr>
                         <w14:cNvContentPartPr/>
                       </w14:nvContentPartPr>
@@ -5027,7 +5531,7 @@
           <mc:Fallback>
             <w:pict>
               <v:shape id="Ink 22" o:spid="_x0000_s1026" type="#_x0000_t75" style="position:absolute;margin-left:362.15pt;margin-top:-6.25pt;width:13.2pt;height:15.8pt;z-index:251678720;visibility:visible;mso-wrap-style:square;mso-wrap-distance-left:9pt;mso-wrap-distance-top:0;mso-wrap-distance-right:9pt;mso-wrap-distance-bottom:0;mso-position-horizontal:absolute;mso-position-horizontal-relative:text;mso-position-vertical:absolute;mso-position-vertical-relative:text" o:gfxdata="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">
-                <v:imagedata r:id="rId110" o:title=""/>
+                <v:imagedata r:id="rId138" o:title=""/>
               </v:shape>
             </w:pict>
           </mc:Fallback>
@@ -5059,7 +5563,7 @@
                 <wp:cNvGraphicFramePr/>
                 <a:graphic xmlns:a="http://schemas.openxmlformats.org/drawingml/2006/main">
                   <a:graphicData uri="http://schemas.microsoft.com/office/word/2010/wordprocessingInk">
-                    <w14:contentPart bwMode="auto" r:id="rId111">
+                    <w14:contentPart bwMode="auto" r:id="rId139">
                       <w14:nvContentPartPr>
                         <w14:cNvContentPartPr/>
                       </w14:nvContentPartPr>
@@ -5076,7 +5580,7 @@
           <mc:Fallback>
             <w:pict>
               <v:shape id="Ink 21" o:spid="_x0000_s1026" type="#_x0000_t75" style="position:absolute;margin-left:348.6pt;margin-top:-7.1pt;width:10.75pt;height:30.25pt;z-index:251677696;visibility:visible;mso-wrap-style:square;mso-wrap-distance-left:9pt;mso-wrap-distance-top:0;mso-wrap-distance-right:9pt;mso-wrap-distance-bottom:0;mso-position-horizontal:absolute;mso-position-horizontal-relative:text;mso-position-vertical:absolute;mso-position-vertical-relative:text" o:gfxdata="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">
-                <v:imagedata r:id="rId112" o:title=""/>
+                <v:imagedata r:id="rId140" o:title=""/>
               </v:shape>
             </w:pict>
           </mc:Fallback>
@@ -5108,7 +5612,7 @@
                 <wp:cNvGraphicFramePr/>
                 <a:graphic xmlns:a="http://schemas.openxmlformats.org/drawingml/2006/main">
                   <a:graphicData uri="http://schemas.microsoft.com/office/word/2010/wordprocessingInk">
-                    <w14:contentPart bwMode="auto" r:id="rId113">
+                    <w14:contentPart bwMode="auto" r:id="rId141">
                       <w14:nvContentPartPr>
                         <w14:cNvContentPartPr/>
                       </w14:nvContentPartPr>
@@ -5125,7 +5629,7 @@
           <mc:Fallback>
             <w:pict>
               <v:shape id="Ink 20" o:spid="_x0000_s1026" type="#_x0000_t75" style="position:absolute;margin-left:340.1pt;margin-top:-7.4pt;width:8.5pt;height:21.1pt;z-index:251676672;visibility:visible;mso-wrap-style:square;mso-wrap-distance-left:9pt;mso-wrap-distance-top:0;mso-wrap-distance-right:9pt;mso-wrap-distance-bottom:0;mso-position-horizontal:absolute;mso-position-horizontal-relative:text;mso-position-vertical:absolute;mso-position-vertical-relative:text" o:gfxdata="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">
-                <v:imagedata r:id="rId114" o:title=""/>
+                <v:imagedata r:id="rId142" o:title=""/>
               </v:shape>
             </w:pict>
           </mc:Fallback>
@@ -5157,7 +5661,7 @@
                 <wp:cNvGraphicFramePr/>
                 <a:graphic xmlns:a="http://schemas.openxmlformats.org/drawingml/2006/main">
                   <a:graphicData uri="http://schemas.microsoft.com/office/word/2010/wordprocessingInk">
-                    <w14:contentPart bwMode="auto" r:id="rId115">
+                    <w14:contentPart bwMode="auto" r:id="rId143">
                       <w14:nvContentPartPr>
                         <w14:cNvContentPartPr/>
                       </w14:nvContentPartPr>
@@ -5174,7 +5678,7 @@
           <mc:Fallback>
             <w:pict>
               <v:shape id="Ink 19" o:spid="_x0000_s1026" type="#_x0000_t75" style="position:absolute;margin-left:333.65pt;margin-top:-6.7pt;width:1.7pt;height:18.75pt;z-index:251675648;visibility:visible;mso-wrap-style:square;mso-wrap-distance-left:9pt;mso-wrap-distance-top:0;mso-wrap-distance-right:9pt;mso-wrap-distance-bottom:0;mso-position-horizontal:absolute;mso-position-horizontal-relative:text;mso-position-vertical:absolute;mso-position-vertical-relative:text" o:gfxdata="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">
-                <v:imagedata r:id="rId116" o:title=""/>
+                <v:imagedata r:id="rId144" o:title=""/>
               </v:shape>
             </w:pict>
           </mc:Fallback>
@@ -5206,7 +5710,7 @@
                 <wp:cNvGraphicFramePr/>
                 <a:graphic xmlns:a="http://schemas.openxmlformats.org/drawingml/2006/main">
                   <a:graphicData uri="http://schemas.microsoft.com/office/word/2010/wordprocessingInk">
-                    <w14:contentPart bwMode="auto" r:id="rId117">
+                    <w14:contentPart bwMode="auto" r:id="rId145">
                       <w14:nvContentPartPr>
                         <w14:cNvContentPartPr/>
                       </w14:nvContentPartPr>
@@ -5223,7 +5727,7 @@
           <mc:Fallback>
             <w:pict>
               <v:shape id="Ink 18" o:spid="_x0000_s1026" type="#_x0000_t75" style="position:absolute;margin-left:140.25pt;margin-top:-13.95pt;width:71.35pt;height:28.05pt;z-index:251674624;visibility:visible;mso-wrap-style:square;mso-wrap-distance-left:9pt;mso-wrap-distance-top:0;mso-wrap-distance-right:9pt;mso-wrap-distance-bottom:0;mso-position-horizontal:absolute;mso-position-horizontal-relative:text;mso-position-vertical:absolute;mso-position-vertical-relative:text" o:gfxdata="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">
-                <v:imagedata r:id="rId118" o:title=""/>
+                <v:imagedata r:id="rId146" o:title=""/>
               </v:shape>
             </w:pict>
           </mc:Fallback>
@@ -5255,7 +5759,7 @@
                 <wp:cNvGraphicFramePr/>
                 <a:graphic xmlns:a="http://schemas.openxmlformats.org/drawingml/2006/main">
                   <a:graphicData uri="http://schemas.microsoft.com/office/word/2010/wordprocessingInk">
-                    <w14:contentPart bwMode="auto" r:id="rId119">
+                    <w14:contentPart bwMode="auto" r:id="rId147">
                       <w14:nvContentPartPr>
                         <w14:cNvContentPartPr/>
                       </w14:nvContentPartPr>
@@ -5272,7 +5776,7 @@
           <mc:Fallback>
             <w:pict>
               <v:shape id="Ink 17" o:spid="_x0000_s1026" type="#_x0000_t75" style="position:absolute;margin-left:67.9pt;margin-top:-11.85pt;width:56.35pt;height:25.1pt;z-index:251673600;visibility:visible;mso-wrap-style:square;mso-wrap-distance-left:9pt;mso-wrap-distance-top:0;mso-wrap-distance-right:9pt;mso-wrap-distance-bottom:0;mso-position-horizontal:absolute;mso-position-horizontal-relative:text;mso-position-vertical:absolute;mso-position-vertical-relative:text" o:gfxdata="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">
-                <v:imagedata r:id="rId120" o:title=""/>
+                <v:imagedata r:id="rId148" o:title=""/>
               </v:shape>
             </w:pict>
           </mc:Fallback>
@@ -5304,7 +5808,7 @@
                 <wp:cNvGraphicFramePr/>
                 <a:graphic xmlns:a="http://schemas.openxmlformats.org/drawingml/2006/main">
                   <a:graphicData uri="http://schemas.microsoft.com/office/word/2010/wordprocessingInk">
-                    <w14:contentPart bwMode="auto" r:id="rId121">
+                    <w14:contentPart bwMode="auto" r:id="rId149">
                       <w14:nvContentPartPr>
                         <w14:cNvContentPartPr/>
                       </w14:nvContentPartPr>
@@ -5321,7 +5825,7 @@
           <mc:Fallback>
             <w:pict>
               <v:shape id="Ink 16" o:spid="_x0000_s1026" type="#_x0000_t75" style="position:absolute;margin-left:62.1pt;margin-top:-9.25pt;width:8.55pt;height:21.95pt;z-index:251672576;visibility:visible;mso-wrap-style:square;mso-wrap-distance-left:9pt;mso-wrap-distance-top:0;mso-wrap-distance-right:9pt;mso-wrap-distance-bottom:0;mso-position-horizontal:absolute;mso-position-horizontal-relative:text;mso-position-vertical:absolute;mso-position-vertical-relative:text" o:gfxdata="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">
-                <v:imagedata r:id="rId122" o:title=""/>
+                <v:imagedata r:id="rId150" o:title=""/>
               </v:shape>
             </w:pict>
           </mc:Fallback>
@@ -5860,15 +6364,15 @@
           <inkml:channelProperty channel="F" name="resolution" value="0" units="1/dev"/>
         </inkml:channelProperties>
       </inkml:inkSource>
-      <inkml:timestamp xml:id="ts0" timeString="2012-10-02T16:46:36.112"/>
+      <inkml:timestamp xml:id="ts0" timeString="2012-10-09T16:19:15.847"/>
     </inkml:context>
     <inkml:brush xml:id="br0">
-      <inkml:brushProperty name="width" value="0.03333" units="cm"/>
-      <inkml:brushProperty name="height" value="0.03333" units="cm"/>
+      <inkml:brushProperty name="width" value="0.04667" units="cm"/>
+      <inkml:brushProperty name="height" value="0.04667" units="cm"/>
       <inkml:brushProperty name="fitToCurve" value="1"/>
     </inkml:brush>
   </inkml:definitions>
-  <inkml:trace contextRef="#ctx0" brushRef="#br0">128 0 7353,'-43'22'4644,"22"5"0,-2 6-387,7 12-1032,-2-5-1806,13 11-645,4-6-129,5-3 0,8-5-387,4 0 0,3-6-387,-1-6-516,7 1-2064,-8-11-1677,-3-3 0,-14-12-516,0 0-258</inkml:trace>
+  <inkml:trace contextRef="#ctx0" brushRef="#br0">1 100 4128,'-3'-21'4902,"3"7"0,2-1-258,1-4-3354,15 10 0,-4-4-129,12 8-129,-5 2-387,5 3 129,-6 8-258,0 11-129,-8 4-129,-4 7 0,-8 5 0,-4 4-129,-12-1 0,-3-2 129,0-2-258,0-3 129,6-7 0,8-4 0,10-8 0,24-8 129,20-4 0,23-10-258,20 0-774,11-7-3870,6-5-387,-12-2-387,-21-4-645</inkml:trace>
 </inkml:ink>
 </file>
 
@@ -5888,15 +6392,15 @@
           <inkml:channelProperty channel="F" name="resolution" value="0" units="1/dev"/>
         </inkml:channelProperties>
       </inkml:inkSource>
-      <inkml:timestamp xml:id="ts0" timeString="2012-10-02T16:46:34.442"/>
+      <inkml:timestamp xml:id="ts0" timeString="2012-10-09T16:19:15.489"/>
     </inkml:context>
     <inkml:brush xml:id="br0">
-      <inkml:brushProperty name="width" value="0.03333" units="cm"/>
-      <inkml:brushProperty name="height" value="0.03333" units="cm"/>
+      <inkml:brushProperty name="width" value="0.04667" units="cm"/>
+      <inkml:brushProperty name="height" value="0.04667" units="cm"/>
       <inkml:brushProperty name="fitToCurve" value="1"/>
     </inkml:brush>
   </inkml:definitions>
-  <inkml:trace contextRef="#ctx0" brushRef="#br0">44 75 258,'7'-28'3096,"-1"17"0,-6-1-129,2 1-129,-2 11-516,0-13-129,0 13-387,0 0-387,0 0-387,0 0 129,0 0-387,-10 0-129,8 10 129,-4 0 0,4 9-129,-6 1 129,5 9 129,-4 3-129,3 10 0,-3 4-129,4 8 129,-2 0-258,4 3 0,0-2-129,1 0-129,0-3-129,0-8 129,5-8-258,-2-5 129,1-8-129,-2-4-129,0-5-258,-2-14-645,0 0-2322,9-6-1419,-6-14-258,-3-9-129,3-4-645</inkml:trace>
+  <inkml:trace contextRef="#ctx0" brushRef="#br0">219 8 3096,'5'-12'4386,"-5"12"387,0 0-129,-7 1-3096,-13 12-258,6 14 129,-10 0 0,3 9-258,-2 0-516,-1 4 0,1 0-645,2-6 0,7-1-903,-3-14-1677,11-5-1806,6-14-516,0 0-129,15-20-387</inkml:trace>
 </inkml:ink>
 </file>
 
@@ -5916,15 +6420,15 @@
           <inkml:channelProperty channel="F" name="resolution" value="0" units="1/dev"/>
         </inkml:channelProperties>
       </inkml:inkSource>
-      <inkml:timestamp xml:id="ts0" timeString="2012-10-02T16:46:40.527"/>
+      <inkml:timestamp xml:id="ts0" timeString="2012-10-09T16:19:15.177"/>
     </inkml:context>
     <inkml:brush xml:id="br0">
-      <inkml:brushProperty name="width" value="0.03333" units="cm"/>
-      <inkml:brushProperty name="height" value="0.03333" units="cm"/>
+      <inkml:brushProperty name="width" value="0.04667" units="cm"/>
+      <inkml:brushProperty name="height" value="0.04667" units="cm"/>
       <inkml:brushProperty name="fitToCurve" value="1"/>
     </inkml:brush>
   </inkml:definitions>
-  <inkml:trace contextRef="#ctx0" brushRef="#br0">80 22 5547,'0'0'4644,"0"-13"0,0 13-129,15-5-1161,4 1-1161,17 4-1032,3 0-258,9 1-258,0 2 0,-1 8-258,-7 0 0,-10 6 0,-16 6-129,-14 6 0,-19 2 0,-17 4 0,-13 2 0,-7 0 0,-3-1 0,3 2 0,6-9 0,9-1 0,11-5 0,15-4-129,10-3 129,11-6-128,11-5-130,11-4 0,12-1 0,6-2 0,8-5 0,0-2 0,6 0 0,-2 1 0,-2 1 0,-6 1 0,-7 1 0,-8 2 0,-6 1 0,-7 2 0,-7 0 0,-4 0 0,-11 0 0,15 3 0,-15-3 0,13 8 0,-13-8 0,12 11-904,3 0-3224,-15-11-903,0 0-258,10 0-387,-7-10-516</inkml:trace>
+  <inkml:trace contextRef="#ctx0" brushRef="#br0">491 45 7611,'15'-49'4902,"-15"49"-258,0 0-258,-15 5-3612,-6 36-387,-6 18-129,-4 16 129,-8 12 129,-3 14 258,-5 3-258,-1 5 0,1-5-258,3-8 129,5-11-258,5-12 129,7-15-258,4-14-129,9-10-516,3-20-1032,11-14-2838,0 0-516,8 0-129,2-15-387</inkml:trace>
 </inkml:ink>
 </file>
 
@@ -5944,15 +6448,15 @@
           <inkml:channelProperty channel="F" name="resolution" value="0" units="1/dev"/>
         </inkml:channelProperties>
       </inkml:inkSource>
-      <inkml:timestamp xml:id="ts0" timeString="2012-10-02T16:46:39.996"/>
+      <inkml:timestamp xml:id="ts0" timeString="2012-10-09T16:19:14.757"/>
     </inkml:context>
     <inkml:brush xml:id="br0">
-      <inkml:brushProperty name="width" value="0.03333" units="cm"/>
-      <inkml:brushProperty name="height" value="0.03333" units="cm"/>
+      <inkml:brushProperty name="width" value="0.04667" units="cm"/>
+      <inkml:brushProperty name="height" value="0.04667" units="cm"/>
       <inkml:brushProperty name="fitToCurve" value="1"/>
     </inkml:brush>
   </inkml:definitions>
-  <inkml:trace contextRef="#ctx0" brushRef="#br0">212 0 6837,'0'7'4902,"-7"14"258,-18 1-516,0 13-1290,-11-2-1161,8 12-645,-3-5-387,8 6-387,3-5-129,7-2-516,11-3-129,2-6-387,9-1-774,-1-12-2709,12-5-903,-2-12-129,3-5-387,-3-15-516</inkml:trace>
+  <inkml:trace contextRef="#ctx0" brushRef="#br0">279 163 2580,'12'-31'1806,"-5"13"-516,0 4 516,-3-7 0,4 5 0,-7-5 0,3 8-129,-5-2-387,1 15-129,-20-15-387,3 15 129,-9 0-258,-1 10 0,-9 5 0,0 8-129,-4 1 258,7 5-129,2-3 0,12 0-258,5-6 129,14-2 0,10-9-129,16-9-258,9-5-129,9-10 129,5-5-129,3-2 0,-5-1-129,-2 3 129,-13 2-129,-8 8 258,-10 8-129,-14 9 129,-11 18 129,-15 11 0,-7 13 0,-9 6 0,-1 6 129,-2 2-129,0-1 0,7-8 0,3-5-258,6-11 129,8-8-129,4-9 0,5-5-129,12-16-258,-4 16-903,4-16-3612,20-15 129,3-3-516,3-4-645</inkml:trace>
 </inkml:ink>
 </file>
 
@@ -5972,15 +6476,15 @@
           <inkml:channelProperty channel="F" name="resolution" value="0" units="1/dev"/>
         </inkml:channelProperties>
       </inkml:inkSource>
-      <inkml:timestamp xml:id="ts0" timeString="2012-10-02T16:46:39.731"/>
+      <inkml:timestamp xml:id="ts0" timeString="2012-10-09T16:19:11.379"/>
     </inkml:context>
     <inkml:brush xml:id="br0">
-      <inkml:brushProperty name="width" value="0.03333" units="cm"/>
-      <inkml:brushProperty name="height" value="0.03333" units="cm"/>
+      <inkml:brushProperty name="width" value="0.04667" units="cm"/>
+      <inkml:brushProperty name="height" value="0.04667" units="cm"/>
       <inkml:brushProperty name="fitToCurve" value="1"/>
     </inkml:brush>
   </inkml:definitions>
-  <inkml:trace contextRef="#ctx0" brushRef="#br0">672-3 6966,'6'-10'5031,"-16"16"-258,-17 14-258,-5 22-903,-22 0-1419,0 22-516,-15 0-387,-2 9-387,-3-3-129,7-1-258,3-7-129,10-3-257,9-9-130,13-8 0,13-6 0,12-10-646,10 3-1160,8-16-2580,11-6-645,2-10-129,10-11-387</inkml:trace>
+  <inkml:trace contextRef="#ctx0" brushRef="#br0">484 212 9933,'58'-109'5289,"-40"60"-387,-8 15-129,-10 13-4257,0 21 0,-29 29 0,0 24 0,-9 21 0,-10 23 0,-6 20-129,-5 18 129,-1 6-258,2-3 0,6-8-258,5-17 0,8-17-258,7-24-774,20-22-3741,-1-25-516,13-25 0,0 0-645</inkml:trace>
 </inkml:ink>
 </file>
 
@@ -6000,15 +6504,15 @@
           <inkml:channelProperty channel="F" name="resolution" value="0" units="1/dev"/>
         </inkml:channelProperties>
       </inkml:inkSource>
-      <inkml:timestamp xml:id="ts0" timeString="2012-10-02T16:46:39.419"/>
+      <inkml:timestamp xml:id="ts0" timeString="2012-10-09T16:19:11.098"/>
     </inkml:context>
     <inkml:brush xml:id="br0">
-      <inkml:brushProperty name="width" value="0.03333" units="cm"/>
-      <inkml:brushProperty name="height" value="0.03333" units="cm"/>
+      <inkml:brushProperty name="width" value="0.04667" units="cm"/>
+      <inkml:brushProperty name="height" value="0.04667" units="cm"/>
       <inkml:brushProperty name="fitToCurve" value="1"/>
     </inkml:brush>
   </inkml:definitions>
-  <inkml:trace contextRef="#ctx0" brushRef="#br0">110 0 4128,'0'0'4515,"11"3"0,13-3-129,17 0-1161,-5 0-903,16 1-387,-8-1-516,6 6-387,-14-2-387,-4 6 0,-16 2-387,-14 5 0,-9 2-129,-18 2 0,-10 1 0,-7 3 0,-5-1 129,-4 1 0,-4-1 0,5-1 0,4-3 0,10-1 129,5-2-129,11-2-129,11-3 129,9-12-129,11 14 0,13-12 0,7-2 0,3 0 1,3-2-130,-1-4 0,1-1 0,-3 0 0,-2 0 0,-5-1 0,-2 0-388,-1-1-257,0 1-387,-8-7-1548,6 6-2064,-6-7-258,2 2-387,-1-5 0</inkml:trace>
+  <inkml:trace contextRef="#ctx0" brushRef="#br0">234 5 9288,'22'-12'4773,"-27"25"-129,-24 13-129,-10 11-3999,-6 11-258,2 8 0,2-2 129,9 0-129,11-10 0,17-14 0,8-15-129,22-15 129,11-13-129,12-18-129,2-7 258,1-10-258,-8-3 0,-8 1-129,-9 7 129,-11 8-129,-11 9 0,-5 10 129,-10 9-129,-6 7-129,2 19-774,-3 3-3483,10 2 0,3-3-774,4-3 0</inkml:trace>
 </inkml:ink>
 </file>
 
@@ -6028,15 +6532,15 @@
           <inkml:channelProperty channel="F" name="resolution" value="0" units="1/dev"/>
         </inkml:channelProperties>
       </inkml:inkSource>
-      <inkml:timestamp xml:id="ts0" timeString="2012-10-02T16:46:38.920"/>
+      <inkml:timestamp xml:id="ts0" timeString="2012-10-09T16:19:10.803"/>
     </inkml:context>
     <inkml:brush xml:id="br0">
-      <inkml:brushProperty name="width" value="0.03333" units="cm"/>
-      <inkml:brushProperty name="height" value="0.03333" units="cm"/>
+      <inkml:brushProperty name="width" value="0.04667" units="cm"/>
+      <inkml:brushProperty name="height" value="0.04667" units="cm"/>
       <inkml:brushProperty name="fitToCurve" value="1"/>
     </inkml:brush>
   </inkml:definitions>
-  <inkml:trace contextRef="#ctx0" brushRef="#br0">699 1 3354,'21'-14'4773,"-21"14"-129,0 0 0,-21 26-903,-9 18-1032,-22 0-645,3 18-258,-14 0-387,2 10-387,-6-4-129,3 4-387,-1-8-129,7-3-129,7-6-129,8-6-258,7-5 0,6-11-516,15 0-645,0-16-2838,16-4-774,13-13 0,9-4-387,6-17-516</inkml:trace>
+  <inkml:trace contextRef="#ctx0" brushRef="#br0">375 126 4128,'22'-44'4257,"-13"19"258,0-1-1419,1 9-1806,-5 2-387,-5 15 0,0 0 0,0 0 0,0 21-258,-14 18 129,-12 8-258,-9 17 0,-8 5-129,-4 8 0,-7 0-129,3-3 258,2-10-258,8-11 129,6-13-258,11-12 0,11-14-387,13-14-516,0 0-1290,21-28-2451,6 0-258,5-7-387,6-4-129</inkml:trace>
 </inkml:ink>
 </file>
 
@@ -6056,15 +6560,15 @@
           <inkml:channelProperty channel="F" name="resolution" value="0" units="1/dev"/>
         </inkml:channelProperties>
       </inkml:inkSource>
-      <inkml:timestamp xml:id="ts0" timeString="2012-10-02T16:46:38.577"/>
+      <inkml:timestamp xml:id="ts0" timeString="2012-10-09T16:19:08.748"/>
     </inkml:context>
     <inkml:brush xml:id="br0">
-      <inkml:brushProperty name="width" value="0.03333" units="cm"/>
-      <inkml:brushProperty name="height" value="0.03333" units="cm"/>
+      <inkml:brushProperty name="width" value="0.04667" units="cm"/>
+      <inkml:brushProperty name="height" value="0.04667" units="cm"/>
       <inkml:brushProperty name="fitToCurve" value="1"/>
     </inkml:brush>
   </inkml:definitions>
-  <inkml:trace contextRef="#ctx0" brushRef="#br0">195 0 3999,'-20'11'4644,"-2"7"0,4 5 0,-8 1-1161,14 14-903,-6-6-645,17 7-645,1-6-258,15-4-387,14-8-129,17-6-129,6-11-129,12-7 0,4-13 0,-1-8-129,-6-8 0,-10-4 0,-17-1-129,-22 3 0,-14 1 129,-28 10 0,-22 4-258,-13 7 129,-11 9-129,-4 3-129,2 7-258,8 3-258,16 8-387,7-6-1419,31 6-1935,12-3-129,17 0-129,20-6-516</inkml:trace>
+  <inkml:trace contextRef="#ctx0" brushRef="#br0">250 547 11094,'-42'8'5160,"16"1"-645,3 1-129,1 5-4128,2-1-645,2 1 0,7 0 0,11-15 258,-15 17 129,15-17 258,-13 5 129,13-5-129,-11 0 129,11 0-129,0 0 0,0 0-129,0 0-129,0 0 129,0 0-129,5 0 129,-5 0-129,17-4 0,-4 2 0,-3-5 129,-10 7-129,17-22 129,-15 7-129,-2-1 0,-1 0 0,-10 0 129,-3 3 0,-3 6 0,0 5-129,0 2 129,2 12 0,5 5 0,2 5-129,8 1 129,5-2-129,12-6 129,8-5-129,6-8 0,5-2-129,1-9 129,-1-6-129,-4-1 129,-5 2-129,-7 2 129,-7 7 0,-13 5 0,0 0 0,6 18 129,-6 2-129,0 2 0,0 2 129,9-4 0,5-4-129,7-8 0,5-8 0,4-3 0,1-11 0,-1-5 0,-3-1 0,-6 2 0,-4 3 0,-6 7 129,-11 8-129,0 0 129,11 25 0,-10 3 0,1 7 0,2 4 0,1 6-129,2-3 129,1-4-129,3-10 0,-2-9-129,-9-19 129,12 4 0,-12-10-129,-3-10 0,-6 1 129,-8-1 0,0 6 129,0 4-129,17 6 258,-11 4-129,18 6 0,20-4 129,20-6-129,24-6 129,18-16-129,15-16 0,9-14-129,2-10 129,-3-6-258,-12 0 258,-18 5-258,-24 9 129,-21 14 0,-22 18 129,-15 22 129,-3 7-129,-2 24 258,8 6-129,37-1 387,45-14-387,58-18 129,62-16-129,60-27-258,43-20-129,21-21-516,10 2-1419,-28-10-3354,-31 18-129,-56 14-516,-51 25-516</inkml:trace>
 </inkml:ink>
 </file>
 
@@ -6084,15 +6588,15 @@
           <inkml:channelProperty channel="F" name="resolution" value="0" units="1/dev"/>
         </inkml:channelProperties>
       </inkml:inkSource>
-      <inkml:timestamp xml:id="ts0" timeString="2012-10-02T16:46:38.171"/>
+      <inkml:timestamp xml:id="ts0" timeString="2012-10-09T16:19:07.782"/>
     </inkml:context>
     <inkml:brush xml:id="br0">
-      <inkml:brushProperty name="width" value="0.03333" units="cm"/>
-      <inkml:brushProperty name="height" value="0.03333" units="cm"/>
+      <inkml:brushProperty name="width" value="0.04667" units="cm"/>
+      <inkml:brushProperty name="height" value="0.04667" units="cm"/>
       <inkml:brushProperty name="fitToCurve" value="1"/>
     </inkml:brush>
   </inkml:definitions>
-  <inkml:trace contextRef="#ctx0" brushRef="#br0">0 46 516,'27'-29'3096,"-15"18"516,1 4-387,0 7 129,-13 0-258,12 9-387,-12 4-387,2 15-516,-3-3-258,1 17-258,-8-4-516,5 5-129,-5-1-129,0-2-129,-1-5 0,2-2-258,2-4-129,5-9-258,4-1-774,-4-19-2967,22 14-387,-6-14-258,3-8-516</inkml:trace>
+  <inkml:trace contextRef="#ctx0" brushRef="#br0">437 215 1806,'0'-85'3870,"0"44"774,-1 2-774,-7 15-903,-11 2-903,2 20-774,-15 4-387,-2 26-129,-10 10-387,-3 19 0,-6 15 0,3 14-129,5 4 129,7 2-129,8-7 258,14-9-258,13-16-129,9-19 0,16-23 0,10-22 0,2-21 0,3-17 0,-1-10 0,-6-6-129,-6 2 129,-5 5-258,-6 9 258,-3 11-129,-1 14 129,1 14 0,6 12 0,3 16 0,4 8 0,3 3 129,0 3-258,0-3 129,-5-3-129,-3-5 129,-8-7-129,-7-3 0,-3-5 0,-2-1 0,-5 1-258,-1-1 0,4 3-903,4-15-3483,0 13-129,13-13-387,12-9-516</inkml:trace>
 </inkml:ink>
 </file>
 
@@ -6112,15 +6616,15 @@
           <inkml:channelProperty channel="F" name="resolution" value="0" units="1/dev"/>
         </inkml:channelProperties>
       </inkml:inkSource>
-      <inkml:timestamp xml:id="ts0" timeString="2012-10-02T16:46:36.829"/>
+      <inkml:timestamp xml:id="ts0" timeString="2012-10-09T16:19:06.724"/>
     </inkml:context>
     <inkml:brush xml:id="br0">
-      <inkml:brushProperty name="width" value="0.03333" units="cm"/>
-      <inkml:brushProperty name="height" value="0.03333" units="cm"/>
+      <inkml:brushProperty name="width" value="0.04667" units="cm"/>
+      <inkml:brushProperty name="height" value="0.04667" units="cm"/>
       <inkml:brushProperty name="fitToCurve" value="1"/>
     </inkml:brush>
   </inkml:definitions>
-  <inkml:trace contextRef="#ctx0" brushRef="#br0">381 124 8256,'-73'-37'4515,"50"19"-258,9-3-129,14 11-1806,14-4-903,31 8-387,17-4-129,22 10-129,15 0-129,17 7 0,6 5 0,12 9-258,-4 5 0,-14 6-129,-20 4-129,-24 5 0,-23 1-129,-30 3 129,-22-3 0,-34 0-129,-28-4 129,-18-4 0,-12-7 0,-8-5 0,-1-6 0,11-8 0,12-2 0,17-6-129,22 0 129,23 0-129,19 0 0,31 1 0,23 7 0,23 5 0,12 8 0,12 6 0,7 5 0,-3 4 0,-4 3 0,-16 2 0,-25 2 129,-27 1-129,-29 0 0,-23-4 129,-37-3 0,-28-1 0,-29-4 1,-21-4-130,-17-6 0,-7-5 0,-3-8 0,8-3 0,12-6 0,20-4 0,24-6 0,31-6 0,32-4 0,34-4 0,32-4 0,43-4 0,40-1 0,43 0 0,40-1 0,35 1 0,25 1 0,14 6 0,10 3 0,-11 4 0,-17 6 0,-28 9 0,-34 2 0,-32 2 0,-32 9 0,-31 1 0,-21 9-1807,-30-7-2708,-7 0-903,-13-8 0,-4-4-645</inkml:trace>
+  <inkml:trace contextRef="#ctx0" brushRef="#br0">171 113 10191,'44'-62'5160,"-32"38"-516,-5 9 129,-7 3-4386,0 12-258,0 0-129,-11 5 0,1 9 0,-3 2 0,0 4 0,-9 1 0,-2 3 0,-1 5 258,-1-4 0,0 2 0,3-4 129,2-1-129,5-2 129,12-2 0,7-7 0,22-5-129,19-6 0,21-2 0,11-7-129,7 1 0,-1 1-129,-10 5 0,-23 2-129,-30 15 0,-29 12-129,-38 8 129,-25 4-258,-15-1 129,1 0-258,5-12-774,24-4-3612,30-19 0,28-3-387,27-23-516</inkml:trace>
 </inkml:ink>
 </file>
 
@@ -6168,15 +6672,15 @@
           <inkml:channelProperty channel="F" name="resolution" value="0" units="1/dev"/>
         </inkml:channelProperties>
       </inkml:inkSource>
-      <inkml:timestamp xml:id="ts0" timeString="2012-10-02T16:46:35.878"/>
+      <inkml:timestamp xml:id="ts0" timeString="2012-10-09T16:19:06.303"/>
     </inkml:context>
     <inkml:brush xml:id="br0">
-      <inkml:brushProperty name="width" value="0.03333" units="cm"/>
-      <inkml:brushProperty name="height" value="0.03333" units="cm"/>
+      <inkml:brushProperty name="width" value="0.04667" units="cm"/>
+      <inkml:brushProperty name="height" value="0.04667" units="cm"/>
       <inkml:brushProperty name="fitToCurve" value="1"/>
     </inkml:brush>
   </inkml:definitions>
-  <inkml:trace contextRef="#ctx0" brushRef="#br0">1006 31 5805,'17'-19'4128,"-17"19"0,0-12-129,-18 8-1290,-1 9-903,-20 3-645,-4 11 129,-20 2-258,-10 14 129,-16 4-258,-8 10-129,-11 1 0,5 5-258,0 0 0,10 5-129,16-4 0,20-4-129,22-7 0,29-5 0,23-7 0,34-7 1,26-10-259,29-10 0,16-6 0,14-10 0,7-11 0,-3-5 0,-3 0 0,-18-1 0,-24 3 0,-25 2 0,-29 6 0,-29 3 0,-22 6 0,-33 2 0,-20 3 0,-19 1 0,-11 1 0,-7 0 0,-2 2 0,8 2 0,12 0 0,17-2 0,17 2 0,23-4-517,25 0-386,25-2-645,37-2-2064,12-12-1419,16 1 129,11-10-258,12-1-258</inkml:trace>
+  <inkml:trace contextRef="#ctx0" brushRef="#br0">220 339 6450,'5'-53'4515,"-3"36"-258,-2 17-129,0 0-3741,-6 32-129,-3 20 129,-9 10 129,-6 16 129,-8 2 129,-1 3-129,-4-11-129,6-11 0,5-24-129,14-29 129,12-28-258,12-34 0,20-24 0,16-23-258,8-12-129,6-6 0,3 8 129,-3 15-129,-8 21 0,-8 28 129,-12 27-129,-11 30 258,-12 31 0,-11 25 129,-1 15-129,-11 6 129,1-5-129,2-11 0,2-17 129,7-27-129,0-27-129,23-19 0,2-32 129,7-18-129,0-8 0,5-1-129,-7 8 0,-2 14 129,-9 14 129,-5 22 0,-14 20-129,15 24 129,-14 21 258,0 15-129,-1 9 129,4 3-129,5-3-129,3-12 0,9-20 0,8-21-129,6-16-129,5-29-129,4-20-129,-1-16 0,-2 0 0,-6 2-129,-6 14 387,-9 19 0,-10 26 129,-7 22 387,-3 31-129,0 28 129,-4 11 0,3 5 0,1-3-129,4-11-129,11-20-129,3-23-129,6-23-258,-4-25-129,5-18-903,-11-21-3483,2-6-129,-6-8-258,-2 6-387</inkml:trace>
 </inkml:ink>
 </file>
 
@@ -6196,15 +6700,15 @@
           <inkml:channelProperty channel="F" name="resolution" value="0" units="1/dev"/>
         </inkml:channelProperties>
       </inkml:inkSource>
-      <inkml:timestamp xml:id="ts0" timeString="2012-10-02T16:46:35.300"/>
+      <inkml:timestamp xml:id="ts0" timeString="2012-10-09T16:19:05.369"/>
     </inkml:context>
     <inkml:brush xml:id="br0">
-      <inkml:brushProperty name="width" value="0.03333" units="cm"/>
-      <inkml:brushProperty name="height" value="0.03333" units="cm"/>
+      <inkml:brushProperty name="width" value="0.04667" units="cm"/>
+      <inkml:brushProperty name="height" value="0.04667" units="cm"/>
       <inkml:brushProperty name="fitToCurve" value="1"/>
     </inkml:brush>
   </inkml:definitions>
-  <inkml:trace contextRef="#ctx0" brushRef="#br0">495 128 3354,'-25'-10'3870,"25"10"-258,-3-11-387,3-1-258,17 5-516,0-9-387,23 6-387,2-9-129,21 8-516,4-4-258,18 7-129,4-1-129,5 9-129,-4 0-129,-6 11 0,-13 5-129,-14 8-129,-16 5 258,-23 2-129,-18 7 0,-21 2 0,-19 3 0,-14-1 0,-11 1-129,-7-4 129,-7-3 0,3-6-129,2-5 0,11-8 129,8-4-129,17-6 0,14-2 129,24-5-129,15 1 0,30 0 0,26 2 0,22 6 129,16 4-129,12 4 0,3 9 0,-3 4 0,-14 5 0,-20 5 129,-27 1-129,-28 3 129,-28 0 0,-27 3 0,-30-6 129,-27 0 0,-23-5 129,-17-2-129,-16-7 0,-13-6 0,-8-6 1,-1-7-259,4-2 0,12-6 0,14 0 0,19-7-130,25-1-515,26-10-387,39 7-2193,19-15-1677,32-2-258,29-9-258,27-3-387</inkml:trace>
+  <inkml:trace contextRef="#ctx0" brushRef="#br0">20 1028 6450,'-13'-13'4773,"13"13"-387,-11-14-387,11 14-3483,0 0-258,3-12-258,9 8 129,1-1 129,3-5 0,3 3 0,3-6 0,5-3 258,3-5-258,2-1 129,0-4-258,0 0 0,-2 0 0,-4 3-129,-5 2 129,-5 5-129,-16 16 129,0 0 0,0 0 0,-5 29 0,-14 6 0,0 11 129,-3-1 0,3 2 0,6-7 0,11-13 0,9-21-129,19-17 129,12-30-129,15-22 0,4-17 129,7-15-387,-1-12 129,-2-6-129,-2 0 129,-8 8-129,-6 11 129,-6 18 0,-6 13 0,-2 18 129,-6 22 0,-4 24 0,-10 32-129,-9 26 129,-5 20 0,-13 14-129,-3 5 0,-4-2 0,3-11 0,3-27 0,7-23 0,10-35-129,2-22 129,18-29-129,9-15 0,3-8 129,5-1 0,-1 9 0,-6 15 129,-1 19 0,-9 25-129,-9 23 129,-11 33 129,-7 31 0,-15 24-129,-9 18 129,-4 8-258,-2-4 258,3-12-129,3-18 129,9-25-129,7-37-129,15-34 0,-1-13 0,4-33 129,14-16-258,0-7 129,3 1-129,-2 5 129,1 11 0,-1 12 0,-1 15 0,1 16 0,1 9 0,6 5 0,5-2 0,11-3-129,7-15-516,15 1-2193,2-19-2193,7-4 129,5-7-903,2 4 258</inkml:trace>
 </inkml:ink>
 </file>
 
@@ -6224,15 +6728,15 @@
           <inkml:channelProperty channel="F" name="resolution" value="0" units="1/dev"/>
         </inkml:channelProperties>
       </inkml:inkSource>
-      <inkml:timestamp xml:id="ts0" timeString="2012-10-02T16:44:34.777"/>
+      <inkml:timestamp xml:id="ts0" timeString="2012-10-09T16:19:04.404"/>
     </inkml:context>
     <inkml:brush xml:id="br0">
-      <inkml:brushProperty name="width" value="0.03333" units="cm"/>
-      <inkml:brushProperty name="height" value="0.03333" units="cm"/>
+      <inkml:brushProperty name="width" value="0.04667" units="cm"/>
+      <inkml:brushProperty name="height" value="0.04667" units="cm"/>
       <inkml:brushProperty name="fitToCurve" value="1"/>
     </inkml:brush>
   </inkml:definitions>
-  <inkml:trace contextRef="#ctx0" brushRef="#br0">-1 125 7998,'4'-19'5031,"-2"7"-387,5 1 129,1-8-1677,9 9-1548,0-7-774,8 6 129,1 1-645,8 4 129,2 2-129,4 1-258,1 3 0,-1 1 129,-3 10 0,-6 4-258,-8 5 258,-7 5-258,-12 6 129,-4 4-129,-15 4 129,-9 4 0,-10 1 0,-5 0 258,-4-4-258,1-6 258,1-5-129,3-6 129,4-7-129,9-10 129,10-6-258,15 0 0,-5-19 0,10 5 0,12-5 0,8 3 0,6 1 0,5 6 0,1 6 0,3 3 0,2 8 0,2 6-258,1 6-129,-1-5-1290,9 10-2838,-6-7-258,5 1-516,-6-9-387</inkml:trace>
+  <inkml:trace contextRef="#ctx0" brushRef="#br0">284 634 4902,'19'5'4515,"-19"-5"-387,0 0-129,0 0-3096,0 13-516,0-13-258,-10 11 0,0-9 0,-5 0 129,-8-4 129,-1-4 0,-8-10 129,-1-4 0,-4-7 129,0-8-129,5-9-258,8-3 0,6-6 0,10-4-258,8-4 0,20-1 129,11 2-258,15 6 258,10 6-129,7 12 129,6 10-129,4 15 0,-2 11 129,-11 23-129,-7 18 0,-17 20 0,-20 17 129,-17 18 0,-25 17 0,-18 8 0,-12 3-129,-9-1 258,-7-5 258,3-14-258,10-15 0,8-19 0,13-20 0,11-18-129,10-15 129,17-17-129,0 0-129,4-24-129,9-1 129,3-1-129,1 2 0,2 1 129,-2 2-129,0 4 129,-1 5-129,-2 3 129,1 1 0,0 1 0,1 1-129,-5 0-258,4 6-1290,-4-4-2838,-11 4-387,16-14-258,-13 3-516</inkml:trace>
 </inkml:ink>
 </file>
 
@@ -6252,15 +6756,15 @@
           <inkml:channelProperty channel="F" name="resolution" value="0" units="1/dev"/>
         </inkml:channelProperties>
       </inkml:inkSource>
-      <inkml:timestamp xml:id="ts0" timeString="2012-10-02T16:44:34.309"/>
+      <inkml:timestamp xml:id="ts0" timeString="2012-10-09T16:19:07.082"/>
     </inkml:context>
     <inkml:brush xml:id="br0">
-      <inkml:brushProperty name="width" value="0.03333" units="cm"/>
-      <inkml:brushProperty name="height" value="0.03333" units="cm"/>
+      <inkml:brushProperty name="width" value="0.04667" units="cm"/>
+      <inkml:brushProperty name="height" value="0.04667" units="cm"/>
       <inkml:brushProperty name="fitToCurve" value="1"/>
     </inkml:brush>
   </inkml:definitions>
-  <inkml:trace contextRef="#ctx0" brushRef="#br0">55 86 3225,'29'-26'4515,"-15"12"-129,2 1 387,-6-4-1548,7 12-645,-11-6-645,-6 11-258,0 0-258,10 18-645,-13 2 129,-7 13-387,-8 6-129,-1 8-258,-3 3 129,0 5-258,-1-1-387,4-6-387,9 1-3096,2-17-903,8-8-129,0-24-387,12 9-387</inkml:trace>
+  <inkml:trace contextRef="#ctx0" brushRef="#br0">191 137 5160,'-51'-11'5160,"27"5"-129,-4-2-387,2 6-2967,-2-5-258,11 6-258,-1-5-129,18 6-387,0 0-516,12-23-1806,29 11-2709,20-6-516,12-3-387,5-1-516</inkml:trace>
 </inkml:ink>
 </file>
 
@@ -6280,7 +6784,7 @@
           <inkml:channelProperty channel="F" name="resolution" value="0" units="1/dev"/>
         </inkml:channelProperties>
       </inkml:inkSource>
-      <inkml:timestamp xml:id="ts0" timeString="2012-10-02T16:44:34.060"/>
+      <inkml:timestamp xml:id="ts0" timeString="2012-10-02T16:46:36.112"/>
     </inkml:context>
     <inkml:brush xml:id="br0">
       <inkml:brushProperty name="width" value="0.03333" units="cm"/>
@@ -6288,7 +6792,7 @@
       <inkml:brushProperty name="fitToCurve" value="1"/>
     </inkml:brush>
   </inkml:definitions>
-  <inkml:trace contextRef="#ctx0" brushRef="#br0">92 104 8514,'-14'-13'4515,"14"13"-258,0-19-129,6 4-2064,20 3-516,0-3-774,9 3 0,2 2-516,2 4 129,2 5-258,-5 1-129,-5 13 129,-8 8-129,-8 7 0,-10 8-129,-6 7 129,-16 5-129,-12 2 129,-7 2 129,-9 0-258,-6-5 129,0-5 0,2-7 0,6-9 0,8-10 0,9-9 0,11-7 0,15 0 0,6-21-129,19 4 129,11-5 0,9 2 0,10 0 0,6 5 0,3 4 0,4 2 0,-2 4 0,-2 1 0,-2 2 0,-4-3 0,-3 1 0,-6-5 0,-3-4 0,-4-3 129,-5-4 0,-4-3 0,-4-2-129,-8 2 129,-10 0 0,-7 3 129,-5 7-129,-19 4 0,-7 9 129,-9 5 0,-7 12 0,-2 3-129,1 6 129,5 1-129,10 0 0,10-5 0,13-5-129,7-6 129,20-10-129,10-1 0,9-6 0,6-5-129,0-3 129,1-1-129,-4-1-129,-3 2-258,-10-5-645,3 7-2838,-13-6-645,0 5-258,-9-5-129</inkml:trace>
+  <inkml:trace contextRef="#ctx0" brushRef="#br0">128 0 7353,'-43'22'4644,"22"5"0,-2 6-387,7 12-1032,-2-5-1806,13 11-645,4-6-129,5-3 0,8-5-387,4 0 0,3-6-387,-1-6-516,7 1-2064,-8-11-1677,-3-3 0,-14-12-516,0 0-258</inkml:trace>
 </inkml:ink>
 </file>
 
@@ -6308,7 +6812,7 @@
           <inkml:channelProperty channel="F" name="resolution" value="0" units="1/dev"/>
         </inkml:channelProperties>
       </inkml:inkSource>
-      <inkml:timestamp xml:id="ts0" timeString="2012-10-02T16:44:33.077"/>
+      <inkml:timestamp xml:id="ts0" timeString="2012-10-02T16:46:34.442"/>
     </inkml:context>
     <inkml:brush xml:id="br0">
       <inkml:brushProperty name="width" value="0.03333" units="cm"/>
@@ -6316,7 +6820,7 @@
       <inkml:brushProperty name="fitToCurve" value="1"/>
     </inkml:brush>
   </inkml:definitions>
-  <inkml:trace contextRef="#ctx0" brushRef="#br0">909 25 5289,'11'-29'4902,"-11"29"-387,0 0 0,-9 0-1161,-13 9-903,2 24-774,-15 0-258,-4 19-774,-13 7 0,-10 13-258,-12 13 0,-10 12-258,-8 5 0,-1-4-129,3-2-645,5-16-2580,21-7-1290,13-25-387,19-16-258,16-28-516</inkml:trace>
+  <inkml:trace contextRef="#ctx0" brushRef="#br0">44 75 258,'7'-28'3096,"-1"17"0,-6-1-129,2 1-129,-2 11-516,0-13-129,0 13-387,0 0-387,0 0-387,0 0 129,0 0-387,-10 0-129,8 10 129,-4 0 0,4 9-129,-6 1 129,5 9 129,-4 3-129,3 10 0,-3 4-129,4 8 129,-2 0-258,4 3 0,0-2-129,1 0-129,0-3-129,0-8 129,5-8-258,-2-5 129,1-8-129,-2-4-129,0-5-258,-2-14-645,0 0-2322,9-6-1419,-6-14-258,-3-9-129,3-4-645</inkml:trace>
 </inkml:ink>
 </file>
 
@@ -6336,7 +6840,7 @@
           <inkml:channelProperty channel="F" name="resolution" value="0" units="1/dev"/>
         </inkml:channelProperties>
       </inkml:inkSource>
-      <inkml:timestamp xml:id="ts0" timeString="2012-10-02T16:44:32.702"/>
+      <inkml:timestamp xml:id="ts0" timeString="2012-10-02T16:46:40.527"/>
     </inkml:context>
     <inkml:brush xml:id="br0">
       <inkml:brushProperty name="width" value="0.03333" units="cm"/>
@@ -6344,7 +6848,7 @@
       <inkml:brushProperty name="fitToCurve" value="1"/>
     </inkml:brush>
   </inkml:definitions>
-  <inkml:trace contextRef="#ctx0" brushRef="#br0">125 119 8127,'-12'-3'5031,"-5"-13"-645,17 5 258,0-5-1548,9 3-1548,6-5-903,9 5 0,3-1-258,6 6-258,-1 3 0,6 5 0,-4 3-129,-4 10-129,-5 7 258,-7 9-258,-11 5 129,-7 9-258,-11 3 258,-14 7-129,-9 0 258,-8 3 129,-7-3-129,-2-2 129,4-10 129,3-8 0,5-11-129,11-14 0,10-8 0,12-12-258,9-10 0,16-5 0,8-2 0,7 1 0,4 5 0,5 9 0,3 3-129,0 8 129,0 3-258,4 7 0,-1 6-258,-3-5-516,4 9-1677,-9-14-1935,0 3 0,-8-6-645,-1-5 0</inkml:trace>
+  <inkml:trace contextRef="#ctx0" brushRef="#br0">80 22 5547,'0'0'4644,"0"-13"0,0 13-129,15-5-1161,4 1-1161,17 4-1032,3 0-258,9 1-258,0 2 0,-1 8-258,-7 0 0,-10 6 0,-16 6-129,-14 6 0,-19 2 0,-17 4 0,-13 2 0,-7 0 0,-3-1 0,3 2 0,6-9 0,9-1 0,11-5 0,15-4-129,10-3 129,11-6-128,11-5-130,11-4 0,12-1 0,6-2 0,8-5 0,0-2 0,6 0 0,-2 1 0,-2 1 0,-6 1 0,-7 1 0,-8 2 0,-6 1 0,-7 2 0,-7 0 0,-4 0 0,-11 0 0,15 3 0,-15-3 0,13 8 0,-13-8 0,12 11-904,3 0-3224,-15-11-903,0 0-258,10 0-387,-7-10-516</inkml:trace>
 </inkml:ink>
 </file>
 
@@ -6364,7 +6868,7 @@
           <inkml:channelProperty channel="F" name="resolution" value="0" units="1/dev"/>
         </inkml:channelProperties>
       </inkml:inkSource>
-      <inkml:timestamp xml:id="ts0" timeString="2012-10-02T16:44:32.094"/>
+      <inkml:timestamp xml:id="ts0" timeString="2012-10-02T16:46:39.996"/>
     </inkml:context>
     <inkml:brush xml:id="br0">
       <inkml:brushProperty name="width" value="0.03333" units="cm"/>
@@ -6372,7 +6876,7 @@
       <inkml:brushProperty name="fitToCurve" value="1"/>
     </inkml:brush>
   </inkml:definitions>
-  <inkml:trace contextRef="#ctx0" brushRef="#br0">728 89 5676,'22'-43'4773,"-15"22"-129,-1 9-258,-6-2-1032,0 14-903,0 0-645,-11 20-387,-8 5-387,-6 15-516,-11 9 258,-12 13-387,-14 10-129,-11 15 0,-7 6-129,-7 5 0,2-5-258,5-9 0,13-7-774,9-21-2193,26-9-1548,13-26-258,19-21-258,11-9-516</inkml:trace>
+  <inkml:trace contextRef="#ctx0" brushRef="#br0">212 0 6837,'0'7'4902,"-7"14"258,-18 1-516,0 13-1290,-11-2-1161,8 12-645,-3-5-387,8 6-387,3-5-129,7-2-516,11-3-129,2-6-387,9-1-774,-1-12-2709,12-5-903,-2-12-129,3-5-387,-3-15-516</inkml:trace>
 </inkml:ink>
 </file>
 
@@ -6392,7 +6896,7 @@
           <inkml:channelProperty channel="F" name="resolution" value="0" units="1/dev"/>
         </inkml:channelProperties>
       </inkml:inkSource>
-      <inkml:timestamp xml:id="ts0" timeString="2012-10-02T16:44:31.735"/>
+      <inkml:timestamp xml:id="ts0" timeString="2012-10-02T16:46:39.731"/>
     </inkml:context>
     <inkml:brush xml:id="br0">
       <inkml:brushProperty name="width" value="0.03333" units="cm"/>
@@ -6400,7 +6904,7 @@
       <inkml:brushProperty name="fitToCurve" value="1"/>
     </inkml:brush>
   </inkml:definitions>
-  <inkml:trace contextRef="#ctx0" brushRef="#br0">376 273 5547,'34'-64'4644,"-24"27"-129,0 3-129,-9-7-1161,0 11-774,-10-3-774,-6 14-516,-12 5-387,-4 14-129,-10 13-258,-2 16-258,-4 9 258,0 13-258,1 9 0,6 6-258,5 4 129,9-4-258,10-7 258,11-10 0,8-12-258,15-15 258,12-16 0,7-17 0,11-21-129,1-12 129,5-8 129,-3-6 0,-5-1 0,-5 5-129,-6 9-129,-9 4-387,-3 17-1419,-10 3-2322,0 13-258,-13 8-387,17 0-258</inkml:trace>
+  <inkml:trace contextRef="#ctx0" brushRef="#br0">672-3 6966,'6'-10'5031,"-16"16"-258,-17 14-258,-5 22-903,-22 0-1419,0 22-516,-15 0-387,-2 9-387,-3-3-129,7-1-258,3-7-129,10-3-257,9-9-130,13-8 0,13-6 0,12-10-646,10 3-1160,8-16-2580,11-6-645,2-10-129,10-11-387</inkml:trace>
 </inkml:ink>
 </file>
 
@@ -6420,7 +6924,7 @@
           <inkml:channelProperty channel="F" name="resolution" value="0" units="1/dev"/>
         </inkml:channelProperties>
       </inkml:inkSource>
-      <inkml:timestamp xml:id="ts0" timeString="2012-10-02T16:44:31.204"/>
+      <inkml:timestamp xml:id="ts0" timeString="2012-10-02T16:46:39.419"/>
     </inkml:context>
     <inkml:brush xml:id="br0">
       <inkml:brushProperty name="width" value="0.03333" units="cm"/>
@@ -6428,7 +6932,7 @@
       <inkml:brushProperty name="fitToCurve" value="1"/>
     </inkml:brush>
   </inkml:definitions>
-  <inkml:trace contextRef="#ctx0" brushRef="#br0">69 50 4644,'27'-42'4257,"-17"32"0,-10 10-129,15 5-903,-15 11-903,0 22-774,-5 5-129,0 14-774,-8 8-129,-1 8-258,-4 8-258,1 0-516,3 4-1161,-3-14-2451,8-5-258,1-16-258,7-13-258</inkml:trace>
+  <inkml:trace contextRef="#ctx0" brushRef="#br0">110 0 4128,'0'0'4515,"11"3"0,13-3-129,17 0-1161,-5 0-903,16 1-387,-8-1-516,6 6-387,-14-2-387,-4 6 0,-16 2-387,-14 5 0,-9 2-129,-18 2 0,-10 1 0,-7 3 0,-5-1 129,-4 1 0,-4-1 0,5-1 0,4-3 0,10-1 129,5-2-129,11-2-129,11-3 129,9-12-129,11 14 0,13-12 0,7-2 0,3 0 1,3-2-130,-1-4 0,1-1 0,-3 0 0,-2 0 0,-5-1 0,-2 0-388,-1-1-257,0 1-387,-8-7-1548,6 6-2064,-6-7-258,2 2-387,-1-5 0</inkml:trace>
 </inkml:ink>
 </file>
 
@@ -6476,7 +6980,7 @@
           <inkml:channelProperty channel="F" name="resolution" value="0" units="1/dev"/>
         </inkml:channelProperties>
       </inkml:inkSource>
-      <inkml:timestamp xml:id="ts0" timeString="2012-10-02T16:44:14.183"/>
+      <inkml:timestamp xml:id="ts0" timeString="2012-10-02T16:46:38.920"/>
     </inkml:context>
     <inkml:brush xml:id="br0">
       <inkml:brushProperty name="width" value="0.03333" units="cm"/>
@@ -6484,7 +6988,7 @@
       <inkml:brushProperty name="fitToCurve" value="1"/>
     </inkml:brush>
   </inkml:definitions>
-  <inkml:trace contextRef="#ctx0" brushRef="#br0">28 52 13158,'-28'-29'5289,"38"17"-516,32 5-387,17 3-4773,15 4-3483,12 0-516,4 0-645,3 0-516</inkml:trace>
+  <inkml:trace contextRef="#ctx0" brushRef="#br0">699 1 3354,'21'-14'4773,"-21"14"-129,0 0 0,-21 26-903,-9 18-1032,-22 0-645,3 18-258,-14 0-387,2 10-387,-6-4-129,3 4-387,-1-8-129,7-3-129,7-6-129,8-6-258,7-5 0,6-11-516,15 0-645,0-16-2838,16-4-774,13-13 0,9-4-387,6-17-516</inkml:trace>
 </inkml:ink>
 </file>
 
@@ -6504,7 +7008,7 @@
           <inkml:channelProperty channel="F" name="resolution" value="0" units="1/dev"/>
         </inkml:channelProperties>
       </inkml:inkSource>
-      <inkml:timestamp xml:id="ts0" timeString="2012-10-02T16:45:35.312"/>
+      <inkml:timestamp xml:id="ts0" timeString="2012-10-02T16:46:38.577"/>
     </inkml:context>
     <inkml:brush xml:id="br0">
       <inkml:brushProperty name="width" value="0.03333" units="cm"/>
@@ -6512,7 +7016,7 @@
       <inkml:brushProperty name="fitToCurve" value="1"/>
     </inkml:brush>
   </inkml:definitions>
-  <inkml:trace contextRef="#ctx0" brushRef="#br0">447 46 1677,'0'0'3225,"2"-12"0,-2 12-516,0 0-387,0 0-387,0 0-129,0 0-516,-6 14 0,3 6-258,-6-1-258,2 12 258,-7 5-258,3 12 0,-7 3 0,0 10 0,-6 1-129,1 5-129,-6-1 0,2 3-129,-3-11 129,2-3-258,-3-7 0,5-4 0,0-12-129,3-7 0,1-4 0,4-6-129,1-3 0,3-3 0,2-1-129,12-8 129,-13 11-129,13-11 0,0 0 0,0 11 0,0-11 129,12 6-129,2-6 0,6-3 129,3-7 0,7-5 0,3-3 0,4-6 0,5-6 0,0-7-129,1-5 129,1-6 0,1-2-129,-2-3 129,0 2-129,-3-2 129,-1 4 0,-5 2-129,-3 3 129,-4 4-129,-4 2 129,-4 1 0,-6 0 0,-3 1-129,-3 1 129,-5 1 0,-2 4 0,0 3 0,-10 6 0,-6 5 0,-6 9 0,-6 7 0,-6 9-129,-4 14 129,-2 10-129,-2 8 129,1 6-129,5 4 129,7 2-129,7-4 129,13-6 0,9-3 0,6-7 0,16-13 129,15-7 0,10-8 129,10-5-129,10-11 129,2-5 0,9-2-129,1-2-258,-2-4-645,1 13-3225,-14 0-645,-8 11 0,-14 0-774</inkml:trace>
+  <inkml:trace contextRef="#ctx0" brushRef="#br0">195 0 3999,'-20'11'4644,"-2"7"0,4 5 0,-8 1-1161,14 14-903,-6-6-645,17 7-645,1-6-258,15-4-387,14-8-129,17-6-129,6-11-129,12-7 0,4-13 0,-1-8-129,-6-8 0,-10-4 0,-17-1-129,-22 3 0,-14 1 129,-28 10 0,-22 4-258,-13 7 129,-11 9-129,-4 3-129,2 7-258,8 3-258,16 8-387,7-6-1419,31 6-1935,12-3-129,17 0-129,20-6-516</inkml:trace>
 </inkml:ink>
 </file>
 
@@ -6532,7 +7036,7 @@
           <inkml:channelProperty channel="F" name="resolution" value="0" units="1/dev"/>
         </inkml:channelProperties>
       </inkml:inkSource>
-      <inkml:timestamp xml:id="ts0" timeString="2012-10-02T16:44:25.432"/>
+      <inkml:timestamp xml:id="ts0" timeString="2012-10-02T16:46:38.171"/>
     </inkml:context>
     <inkml:brush xml:id="br0">
       <inkml:brushProperty name="width" value="0.03333" units="cm"/>
@@ -6540,7 +7044,7 @@
       <inkml:brushProperty name="fitToCurve" value="1"/>
     </inkml:brush>
   </inkml:definitions>
-  <inkml:trace contextRef="#ctx0" brushRef="#br0">452 149 2709,'22'-22'4128,"-12"6"0,-6-1-258,-4-5-774,-1 6-903,-17-4-645,-1 11-129,-14 1-387,-6 8-129,-12 6-258,0 14-129,-5 6-258,0 8 0,3 5-129,9 3 0,7 0-129,15-8 0,14-4-129,9-14 129,21-10-129,14-8-129,9-16 129,9-10 0,4-6 129,0-2-129,-5 0 129,-6 3-129,-11 6 129,-10 6 0,-14 9 0,-12 12 129,0 0 0,-9 0 0,-6 12 0,-3 4 0,0 2 0,4 2 129,1-2-129,9 1-129,4-4 129,12-4-129,9-9 0,14-3-129,11-11 0,7-7 0,8-5 0,1-5-129,-4-2 129,-7 3 129,-5 3 129,-17 8 0,-13 5 129,-16 12 129,0 0-129,-9 0 129,-9 9-129,2 5 0,1 1-129,6 0 0,7 0-258,3-4 0,15-2-129,10-6 0,7 0-129,6-3 129,3-3-129,0-4 129,0-1 129,-6 1 0,-5 2 129,-8 1 129,-8 3 0,-15 1 0,14 0 129,-14 0 0,0 10-129,0-10 129,2 15-129,-2-15 0,21 12-129,-2-8 0,7-2-129,4-2 129,6 0 0,0 0-129,-2 0 129,-5-1 0,-5 0 0,-5 1 0,-19 0 0,14 4 0,-14-4 129,0 0-129,0 14 0,0-14 0,9 3 0,7-3 0,6-5 0,3-3-129,4 1 0,-1 0 0,-3 1 129,-5 3-129,-7 3 129,-13 0 0,4 13 0,-5 2 129,-6-1 0,2 1 0,2-1-129,3-2 129,15-5 0,10-5 0,10-2-129,12-2 129,7-7 0,15 0 0,7-1-129,7-1 0,7 4-903,0-6-3225,10 4-258,3-5-387,13 3-258</inkml:trace>
+  <inkml:trace contextRef="#ctx0" brushRef="#br0">0 46 516,'27'-29'3096,"-15"18"516,1 4-387,0 7 129,-13 0-258,12 9-387,-12 4-387,2 15-516,-3-3-258,1 17-258,-8-4-516,5 5-129,-5-1-129,0-2-129,-1-5 0,2-2-258,2-4-129,5-9-258,4-1-774,-4-19-2967,22 14-387,-6-14-258,3-8-516</inkml:trace>
 </inkml:ink>
 </file>
 
@@ -6560,7 +7064,7 @@
           <inkml:channelProperty channel="F" name="resolution" value="0" units="1/dev"/>
         </inkml:channelProperties>
       </inkml:inkSource>
-      <inkml:timestamp xml:id="ts0" timeString="2012-10-02T16:44:24.137"/>
+      <inkml:timestamp xml:id="ts0" timeString="2012-10-02T16:46:36.829"/>
     </inkml:context>
     <inkml:brush xml:id="br0">
       <inkml:brushProperty name="width" value="0.03333" units="cm"/>
@@ -6568,7 +7072,7 @@
       <inkml:brushProperty name="fitToCurve" value="1"/>
     </inkml:brush>
   </inkml:definitions>
-  <inkml:trace contextRef="#ctx0" brushRef="#br0">-3 158 6450,'-3'-20'4644,"3"20"-258,1-22-774,13 12-1290,-2-10-387,16 6-903,3-5 0,6 5-516,5 0 0,6 4-258,-2 3 0,1 4-129,-5 4 0,-12 11-129,-10 4-129,-10 7 129,-10 6-129,-12 5 129,-9 4-129,-5 0 258,-4-2-258,4 1 129,3-7 0,10-4 0,8-8 0,5-18 0,25 7 0,7-9 0,9-9 0,6-7 0,3 0 129,-1 0-129,-4 4 0,-5 6 0,-10 5 0,-10 3 0,-8 12 129,-5 2-129,-5 1 129,3 0-129,5-3 129,6-4 0,10-8-129,13-6 129,13-14-129,19-5 129,10-5-129,7-3-129,1 2 0,-3-2-516,0 8-1161,-11 3-2451,-9 6-258,-16-3-258,-4 2-258</inkml:trace>
+  <inkml:trace contextRef="#ctx0" brushRef="#br0">381 124 8256,'-73'-37'4515,"50"19"-258,9-3-129,14 11-1806,14-4-903,31 8-387,17-4-129,22 10-129,15 0-129,17 7 0,6 5 0,12 9-258,-4 5 0,-14 6-129,-20 4-129,-24 5 0,-23 1-129,-30 3 129,-22-3 0,-34 0-129,-28-4 129,-18-4 0,-12-7 0,-8-5 0,-1-6 0,11-8 0,12-2 0,17-6-129,22 0 129,23 0-129,19 0 0,31 1 0,23 7 0,23 5 0,12 8 0,12 6 0,7 5 0,-3 4 0,-4 3 0,-16 2 0,-25 2 129,-27 1-129,-29 0 0,-23-4 129,-37-3 0,-28-1 0,-29-4 1,-21-4-130,-17-6 0,-7-5 0,-3-8 0,8-3 0,12-6 0,20-4 0,24-6 0,31-6 0,32-4 0,34-4 0,32-4 0,43-4 0,40-1 0,43 0 0,40-1 0,35 1 0,25 1 0,14 6 0,10 3 0,-11 4 0,-17 6 0,-28 9 0,-34 2 0,-32 2 0,-32 9 0,-31 1 0,-21 9-1807,-30-7-2708,-7 0-903,-13-8 0,-4-4-645</inkml:trace>
 </inkml:ink>
 </file>
 
@@ -6588,7 +7092,7 @@
           <inkml:channelProperty channel="F" name="resolution" value="0" units="1/dev"/>
         </inkml:channelProperties>
       </inkml:inkSource>
-      <inkml:timestamp xml:id="ts0" timeString="2012-10-02T16:44:13.933"/>
+      <inkml:timestamp xml:id="ts0" timeString="2012-10-02T16:46:35.878"/>
     </inkml:context>
     <inkml:brush xml:id="br0">
       <inkml:brushProperty name="width" value="0.03333" units="cm"/>
@@ -6596,7 +7100,7 @@
       <inkml:brushProperty name="fitToCurve" value="1"/>
     </inkml:brush>
   </inkml:definitions>
-  <inkml:trace contextRef="#ctx0" brushRef="#br0">677-3 1935,'0'0'3999,"-17"0"387,-3 4-129,-7 9-903,-11 1-645,-7 13-645,-15-1-516,-3 11-258,-9 1-516,0 10-129,1-3-258,10 4 129,6-5-387,16-3 258,12-6-258,17-9 0,12-11-258,21-15 0,16-3 0,15-18-129,14-9 0,8-7 0,7-1 0,-6-3 0,-3 8 129,-11 6-129,-12 5 258,-16 11-129,-15 6 258,-20 5-129,8 14 129,-10 4 0,-9 4 129,-2 2 0,2 2-129,3 0 129,3-4-129,5-3 129,7-5-129,12-7-129,9-7 129,9-2 0,7-10-129,7-3 0,2 1 0,2-2-129,-2 3 129,-8 3-129,-9 4 129,-7 5-129,-10 1 0,-9 6 129,-10-6 0,1 18 129,-1-18-129,-3 20 0,3-20-129,1 16 129,13-10 0,7-2 0,10-2 0,6-2-129,10 0 129,2 0-129,6-2 129,-4 0-129,-7 2 129,-7 0-129,-6 1 129,-7 5-129,-8 2 129,-4-1 0,-12-7 0,16 11 0,-2-11 0,4 2 0,8-2 0,5-1 0,7-3 0,5-2-129,3 2 0,0-1-258,3 5-645,-7-7-1935,6 6-1290,-4-5-258,5 0-387,-3-2-258</inkml:trace>
+  <inkml:trace contextRef="#ctx0" brushRef="#br0">1006 31 5805,'17'-19'4128,"-17"19"0,0-12-129,-18 8-1290,-1 9-903,-20 3-645,-4 11 129,-20 2-258,-10 14 129,-16 4-258,-8 10-129,-11 1 0,5 5-258,0 0 0,10 5-129,16-4 0,20-4-129,22-7 0,29-5 0,23-7 0,34-7 1,26-10-259,29-10 0,16-6 0,14-10 0,7-11 0,-3-5 0,-3 0 0,-18-1 0,-24 3 0,-25 2 0,-29 6 0,-29 3 0,-22 6 0,-33 2 0,-20 3 0,-19 1 0,-11 1 0,-7 0 0,-2 2 0,8 2 0,12 0 0,17-2 0,17 2 0,23-4-517,25 0-386,25-2-645,37-2-2064,12-12-1419,16 1 129,11-10-258,12-1-258</inkml:trace>
 </inkml:ink>
 </file>
 
@@ -6616,7 +7120,7 @@
           <inkml:channelProperty channel="F" name="resolution" value="0" units="1/dev"/>
         </inkml:channelProperties>
       </inkml:inkSource>
-      <inkml:timestamp xml:id="ts0" timeString="2012-10-02T16:44:13.075"/>
+      <inkml:timestamp xml:id="ts0" timeString="2012-10-02T16:46:35.300"/>
     </inkml:context>
     <inkml:brush xml:id="br0">
       <inkml:brushProperty name="width" value="0.03333" units="cm"/>
@@ -6624,7 +7128,7 @@
       <inkml:brushProperty name="fitToCurve" value="1"/>
     </inkml:brush>
   </inkml:definitions>
-  <inkml:trace contextRef="#ctx0" brushRef="#br0">26 166 6063,'9'-37'4902,"5"18"-516,3-1-129,11 2-1548,-1-7-903,15 10-258,-2 0-903,7 6-129,0 3-258,-1 6-129,1 0 0,-5 6-129,-6 5 129,-10 5-387,-11 6 387,-11 2-387,-7 5 387,-17 7-258,-14 3 258,-12 7 0,-12 6-129,-4 4 258,-5-2-258,4-3 129,4-4-516,7-13-2064,20-6-1935,14-17-129,18-11-258,10-19-516</inkml:trace>
+  <inkml:trace contextRef="#ctx0" brushRef="#br0">494 128 3354,'-25'-10'3870,"25"10"-258,-3-11-387,3-1-258,17 5-516,0-9-387,23 6-387,2-9-129,21 8-516,4-4-258,18 7-129,3-1-129,6 9-129,-4 0-129,-6 11 0,-13 5-129,-14 8-129,-16 5 258,-23 2-129,-18 7 0,-21 2 0,-19 3 0,-14-1 0,-11 1-129,-7-4 129,-7-3 0,3-6-129,2-5 0,12-8 129,7-4-129,17-6 0,14-2 129,24-5-129,15 1 0,30 0 0,26 2 0,21 6 129,17 4-129,12 4 0,3 9 0,-3 4 0,-15 5 0,-19 5 129,-27 1-129,-28 3 129,-28 0 0,-27 3 0,-30-6 129,-27 0 0,-23-5 129,-16-2-129,-17-7 0,-13-6 0,-8-6 1,0-7-259,3-2 0,12-6 0,15 0 0,18-7-130,25-1-515,26-10-387,39 7-2193,19-15-1677,32-2-258,29-9-258,27-3-387</inkml:trace>
 </inkml:ink>
 </file>
 
@@ -6644,7 +7148,7 @@
           <inkml:channelProperty channel="F" name="resolution" value="0" units="1/dev"/>
         </inkml:channelProperties>
       </inkml:inkSource>
-      <inkml:timestamp xml:id="ts0" timeString="2012-10-02T16:45:46.030"/>
+      <inkml:timestamp xml:id="ts0" timeString="2012-10-02T16:44:34.777"/>
     </inkml:context>
     <inkml:brush xml:id="br0">
       <inkml:brushProperty name="width" value="0.03333" units="cm"/>
@@ -6652,7 +7156,7 @@
       <inkml:brushProperty name="fitToCurve" value="1"/>
     </inkml:brush>
   </inkml:definitions>
-  <inkml:trace contextRef="#ctx0" brushRef="#br0">0 47 7224,'11'-10'4515,"-11"10"-258,21-3-387,-11-8-774,15 11-774,-6-8-516,7 4-516,-2-3-129,7 5-258,-5 0 0,4 3-387,-5 7 0,-3 10-128,-8 8-388,-7 12 0,-7 6 0,-9 8 0,-10 2 0,-12 4 0,-4-3 0,-1-4 0,3-9 0,5-10 0,6-11 0,12-8 0,10-13 0,0 0 0,26-4 0,3-6 0,6-1 0,6 2 0,6 4 0,3 5 0,-1 0 0,-2 3 0,-3 8 0,-3 4 0,-2 8-904,-14-7-3482,-3 4-774,-13-7-129,-2-2-516</inkml:trace>
+  <inkml:trace contextRef="#ctx0" brushRef="#br0">-1 125 7998,'4'-19'5031,"-2"7"-387,5 1 129,1-8-1677,9 9-1548,0-7-774,8 6 129,1 1-645,8 4 129,2 2-129,4 1-258,1 3 0,-1 1 129,-3 10 0,-6 4-258,-8 5 258,-7 5-258,-12 6 129,-4 4-129,-15 4 129,-9 4 0,-10 1 0,-5 0 258,-4-4-258,1-6 258,1-5-129,3-6 129,4-7-129,9-10 129,10-6-258,15 0 0,-5-19 0,10 5 0,12-5 0,8 3 0,6 1 0,5 6 0,1 6 0,3 3 0,2 8 0,2 6-258,1 6-129,-1-5-1290,9 10-2838,-6-7-258,5 1-516,-6-9-387</inkml:trace>
 </inkml:ink>
 </file>
 
@@ -6672,7 +7176,7 @@
           <inkml:channelProperty channel="F" name="resolution" value="0" units="1/dev"/>
         </inkml:channelProperties>
       </inkml:inkSource>
-      <inkml:timestamp xml:id="ts0" timeString="2012-10-02T16:45:45.281"/>
+      <inkml:timestamp xml:id="ts0" timeString="2012-10-02T16:44:34.309"/>
     </inkml:context>
     <inkml:brush xml:id="br0">
       <inkml:brushProperty name="width" value="0.03333" units="cm"/>
@@ -6680,7 +7184,7 @@
       <inkml:brushProperty name="fitToCurve" value="1"/>
     </inkml:brush>
   </inkml:definitions>
-  <inkml:trace contextRef="#ctx0" brushRef="#br0">-1 0 11352,'5'37'4773,"-5"-6"-258,3 9-258,-3 2-2580,0 6-645,0 0-387,1 1-516,0-7-387,-1-10-1548,0-4-2322,0-11-387,0-2-129,0-15-258</inkml:trace>
+  <inkml:trace contextRef="#ctx0" brushRef="#br0">55 86 3225,'29'-26'4515,"-15"12"-129,2 1 387,-6-4-1548,7 12-645,-11-6-645,-6 11-258,0 0-258,10 18-645,-13 2 129,-7 13-387,-8 6-129,-1 8-258,-3 3 129,0 5-258,-1-1-387,4-6-387,9 1-3096,2-17-903,8-8-129,0-24-387,12 9-387</inkml:trace>
 </inkml:ink>
 </file>
 
@@ -6700,7 +7204,7 @@
           <inkml:channelProperty channel="F" name="resolution" value="0" units="1/dev"/>
         </inkml:channelProperties>
       </inkml:inkSource>
-      <inkml:timestamp xml:id="ts0" timeString="2012-10-02T16:45:45.016"/>
+      <inkml:timestamp xml:id="ts0" timeString="2012-10-02T16:44:34.060"/>
     </inkml:context>
     <inkml:brush xml:id="br0">
       <inkml:brushProperty name="width" value="0.03333" units="cm"/>
@@ -6708,7 +7212,7 @@
       <inkml:brushProperty name="fitToCurve" value="1"/>
     </inkml:brush>
   </inkml:definitions>
-  <inkml:trace contextRef="#ctx0" brushRef="#br0">201 58 6708,'10'-15'4386,"-10"15"129,-10-7-387,1 14-1161,-12 2-774,5 9-903,-10 4-645,1 9-129,-4 3-129,5 3-258,0 4-129,8 2 129,7 2-129,8-4 0,3-7 0,15-8 0,9-9 0,8-11 129,3-9 258,4-16-129,-2-14 258,-3-13-129,-8-7 129,-3-2 129,-14-1-129,-8 5 0,-10 4-258,-13 11 0,-11 7-129,-2 13-258,0 14-129,0 2-645,12 18-2709,2-3-1161,14 10-258,5-3-387,11 5-129</inkml:trace>
+  <inkml:trace contextRef="#ctx0" brushRef="#br0">92 104 8514,'-14'-13'4515,"14"13"-258,0-19-129,6 4-2064,20 3-516,0-3-774,9 3 0,2 2-516,2 4 129,2 5-258,-5 1-129,-5 13 129,-8 8-129,-8 7 0,-10 8-129,-6 7 129,-16 5-129,-12 2 129,-7 2 129,-9 0-258,-6-5 129,0-5 0,2-7 0,6-9 0,8-10 0,9-9 0,11-7 0,15 0 0,6-21-129,19 4 129,11-5 0,9 2 0,10 0 0,6 5 0,3 4 0,4 2 0,-2 4 0,-2 1 0,-2 2 0,-4-3 0,-3 1 0,-6-5 0,-3-4 0,-4-3 129,-5-4 0,-4-3 0,-4-2-129,-8 2 129,-10 0 0,-7 3 129,-5 7-129,-19 4 0,-7 9 129,-9 5 0,-7 12 0,-2 3-129,1 6 129,5 1-129,10 0 0,10-5 0,13-5-129,7-6 129,20-10-129,10-1 0,9-6 0,6-5-129,0-3 129,1-1-129,-4-1-129,-3 2-258,-10-5-645,3 7-2838,-13-6-645,0 5-258,-9-5-129</inkml:trace>
 </inkml:ink>
 </file>
 
@@ -6728,7 +7232,7 @@
           <inkml:channelProperty channel="F" name="resolution" value="0" units="1/dev"/>
         </inkml:channelProperties>
       </inkml:inkSource>
-      <inkml:timestamp xml:id="ts0" timeString="2012-10-02T16:45:44.579"/>
+      <inkml:timestamp xml:id="ts0" timeString="2012-10-02T16:44:33.077"/>
     </inkml:context>
     <inkml:brush xml:id="br0">
       <inkml:brushProperty name="width" value="0.03333" units="cm"/>
@@ -6736,7 +7240,7 @@
       <inkml:brushProperty name="fitToCurve" value="1"/>
     </inkml:brush>
   </inkml:definitions>
-  <inkml:trace contextRef="#ctx0" brushRef="#br0">51 104 2580,'0'0'4128,"0"0"0,0 0-387,5-12-387,1-4-516,11 8-645,-4-12-129,10 10-774,-2-7-129,5 8-258,-2-1-129,2 9-129,-4 1-258,-2 8 0,-6 11 0,-6 11-129,-8 6-129,-6 9 0,-13 5 0,-8 3 0,-6 2-129,-5-3 129,-3-6-129,1-9 0,6-9 0,10-8-129,10-8 129,14-12 0,0 0 0,19-5 0,9-5 0,7 0 0,6-3 129,2 2-129,0-1 0,-3 1-129,0 3-129,-9-3-645,5 5-2580,-15-8-1161,2 4-258,-12-3-258,4 6-387</inkml:trace>
+  <inkml:trace contextRef="#ctx0" brushRef="#br0">909 25 5289,'11'-29'4902,"-11"29"-387,0 0 0,-9 0-1161,-13 9-903,2 24-774,-15 0-258,-4 19-774,-13 7 0,-10 13-258,-12 13 0,-10 12-258,-8 5 0,-1-4-129,3-2-645,5-16-2580,21-7-1290,13-25-387,19-16-258,16-28-516</inkml:trace>
 </inkml:ink>
 </file>
 
@@ -6784,7 +7288,7 @@
           <inkml:channelProperty channel="F" name="resolution" value="0" units="1/dev"/>
         </inkml:channelProperties>
       </inkml:inkSource>
-      <inkml:timestamp xml:id="ts0" timeString="2012-10-02T16:45:43.799"/>
+      <inkml:timestamp xml:id="ts0" timeString="2012-10-02T16:44:32.702"/>
     </inkml:context>
     <inkml:brush xml:id="br0">
       <inkml:brushProperty name="width" value="0.03333" units="cm"/>
@@ -6792,7 +7296,7 @@
       <inkml:brushProperty name="fitToCurve" value="1"/>
     </inkml:brush>
   </inkml:definitions>
-  <inkml:trace contextRef="#ctx0" brushRef="#br0">361 13 4902,'14'-16'5031,"-14"16"-129,0 0-129,0 0-774,-7 10-903,-5 22-903,-16 7-774,-2 17-129,-11 4-387,-2 13-644,-7 3-259,3-1 0,5-6 0,8-11 0,9-15 0,8-17-1549,17-4-2966,0-22-645,21-3 129,5-18-645</inkml:trace>
+  <inkml:trace contextRef="#ctx0" brushRef="#br0">125 119 8127,'-12'-3'5031,"-5"-13"-645,17 5 258,0-5-1548,9 3-1548,6-5-903,9 5 0,3-1-258,6 6-258,-1 3 0,6 5 0,-4 3-129,-4 10-129,-5 7 258,-7 9-258,-11 5 129,-7 9-258,-11 3 258,-14 7-129,-9 0 258,-8 3 129,-7-3-129,-2-2 129,4-10 129,3-8 0,5-11-129,11-14 0,10-8 0,12-12-258,9-10 0,16-5 0,8-2 0,7 1 0,4 5 0,5 9 0,3 3-129,0 8 129,0 3-258,4 7 0,-1 6-258,-3-5-516,4 9-1677,-9-14-1935,0 3 0,-8-6-645,-1-5 0</inkml:trace>
 </inkml:ink>
 </file>
 
@@ -6812,7 +7316,7 @@
           <inkml:channelProperty channel="F" name="resolution" value="0" units="1/dev"/>
         </inkml:channelProperties>
       </inkml:inkSource>
-      <inkml:timestamp xml:id="ts0" timeString="2012-10-02T16:45:43.347"/>
+      <inkml:timestamp xml:id="ts0" timeString="2012-10-02T16:44:32.094"/>
     </inkml:context>
     <inkml:brush xml:id="br0">
       <inkml:brushProperty name="width" value="0.03333" units="cm"/>
@@ -6820,7 +7324,7 @@
       <inkml:brushProperty name="fitToCurve" value="1"/>
     </inkml:brush>
   </inkml:definitions>
-  <inkml:trace contextRef="#ctx0" brushRef="#br0">0 67 2967,'7'-14'3741,"3"8"387,3-5-516,6 8-387,-4-8-645,13 7-258,-10-7-516,12 10-258,-8-5-387,4 6-258,-7 3-129,0 10-129,-8 4-129,-2 11-258,-8 7 0,-1 6-129,-12 3 0,-4 3-129,-7-3 0,-4-2 0,0-5 0,-1-10-129,4-10 129,6-8 0,7-7 0,11-2 0,0-9 129,16-3 0,8-1 0,6 2 0,4-1 0,1 5 0,-1 3-129,2-1-129,-3 5-516,-7-4-1032,4 4-2580,-12-3-516,1 3-258,-19 0-258</inkml:trace>
+  <inkml:trace contextRef="#ctx0" brushRef="#br0">728 89 5676,'22'-43'4773,"-15"22"-129,-1 9-258,-6-2-1032,0 14-903,0 0-645,-11 20-387,-8 5-387,-6 15-516,-11 9 258,-12 13-387,-14 10-129,-11 15 0,-7 6-129,-7 5 0,2-5-258,5-9 0,13-7-774,9-21-2193,26-9-1548,13-26-258,19-21-258,11-9-516</inkml:trace>
 </inkml:ink>
 </file>
 
@@ -6840,7 +7344,7 @@
           <inkml:channelProperty channel="F" name="resolution" value="0" units="1/dev"/>
         </inkml:channelProperties>
       </inkml:inkSource>
-      <inkml:timestamp xml:id="ts0" timeString="2012-10-02T16:45:42.411"/>
+      <inkml:timestamp xml:id="ts0" timeString="2012-10-02T16:44:31.735"/>
     </inkml:context>
     <inkml:brush xml:id="br0">
       <inkml:brushProperty name="width" value="0.03333" units="cm"/>
@@ -6848,7 +7352,7 @@
       <inkml:brushProperty name="fitToCurve" value="1"/>
     </inkml:brush>
   </inkml:definitions>
-  <inkml:trace contextRef="#ctx0" brushRef="#br0">336 0 9933,'-19'28'4902,"-6"2"-129,-1 21-258,-9 2-1677,1 22-1161,-9 0-516,5 9-516,0-5-258,7-5-129,6-12-258,9-18-516,9-11-903,7-33-2967,17 2-387,3-21-129,9-10-645</inkml:trace>
+  <inkml:trace contextRef="#ctx0" brushRef="#br0">375 273 5547,'34'-64'4644,"-24"27"-129,0 3-129,-9-7-1161,0 11-774,-10-3-774,-6 14-516,-12 5-387,-4 14-129,-10 13-258,-2 16-258,-3 9 258,-1 13-258,1 9 0,6 6-258,5 3 129,9-3-258,10-7 258,11-10 0,8-12-258,15-15 258,12-16 0,7-17 0,11-21-129,1-12 129,5-8 129,-4-6 0,-4-1 0,-5 6-129,-6 8-129,-9 4-387,-3 17-1419,-10 3-2322,0 13-258,-13 8-387,17 0-258</inkml:trace>
 </inkml:ink>
 </file>
 
@@ -6868,7 +7372,7 @@
           <inkml:channelProperty channel="F" name="resolution" value="0" units="1/dev"/>
         </inkml:channelProperties>
       </inkml:inkSource>
-      <inkml:timestamp xml:id="ts0" timeString="2012-10-02T16:45:41.958"/>
+      <inkml:timestamp xml:id="ts0" timeString="2012-10-02T16:44:31.204"/>
     </inkml:context>
     <inkml:brush xml:id="br0">
       <inkml:brushProperty name="width" value="0.03333" units="cm"/>
@@ -6876,7 +7380,7 @@
       <inkml:brushProperty name="fitToCurve" value="1"/>
     </inkml:brush>
   </inkml:definitions>
-  <inkml:trace contextRef="#ctx0" brushRef="#br0">132 13 4902,'0'-12'4257,"0"12"-129,-14 0-258,0 2-1032,5 17-645,-12 2-645,5 13-516,-2 0-387,2 8-387,4 0 129,5 1-387,4-3 129,3-2-129,12-8 0,7-4 129,10-9-129,7-8 0,4-9 258,4-7 129,2-15 0,-2-8 129,-3-11 0,-7-1 129,-11-4-129,-7 5 129,-13 4-129,-4 6-129,-16 8-258,-8 8 0,-6 9-258,-4 4-387,7 6-903,-4 1-2967,13 8-387,0-4-129,12 9-387</inkml:trace>
+  <inkml:trace contextRef="#ctx0" brushRef="#br0">68 50 4644,'27'-42'4257,"-17"32"0,-10 10-129,15 5-903,-15 11-903,0 22-774,-5 5-129,0 14-774,-8 8-129,-1 8-258,-4 8-258,2 0-516,2 4-1161,-3-14-2451,8-5-258,1-16-258,7-13-258</inkml:trace>
 </inkml:ink>
 </file>
 
@@ -6896,7 +7400,7 @@
           <inkml:channelProperty channel="F" name="resolution" value="0" units="1/dev"/>
         </inkml:channelProperties>
       </inkml:inkSource>
-      <inkml:timestamp xml:id="ts0" timeString="2012-10-02T16:45:41.490"/>
+      <inkml:timestamp xml:id="ts0" timeString="2012-10-02T16:44:14.183"/>
     </inkml:context>
     <inkml:brush xml:id="br0">
       <inkml:brushProperty name="width" value="0.03333" units="cm"/>
@@ -6904,7 +7408,7 @@
       <inkml:brushProperty name="fitToCurve" value="1"/>
     </inkml:brush>
   </inkml:definitions>
-  <inkml:trace contextRef="#ctx0" brushRef="#br0">0 0 5805,'0'0'5031,"11"8"-387,-5 12-129,-5 1-903,4 18-1290,-5-2-387,5 13-903,-5 0-129,1 7-387,-1-3 0,0-1-258,-2-1-129,1-10 0,-2-4-258,0-10-129,2-5-516,-3-12-258,4 0-903,0-11-2709,0-10 0,0-8-258,5 3-129</inkml:trace>
+  <inkml:trace contextRef="#ctx0" brushRef="#br0">28 52 13158,'-28'-29'5289,"38"17"-516,32 5-387,17 3-4773,15 4-3483,12 0-516,4 0-645,3 0-516</inkml:trace>
 </inkml:ink>
 </file>
 
@@ -6924,7 +7428,7 @@
           <inkml:channelProperty channel="F" name="resolution" value="0" units="1/dev"/>
         </inkml:channelProperties>
       </inkml:inkSource>
-      <inkml:timestamp xml:id="ts0" timeString="2012-10-02T16:45:38.822"/>
+      <inkml:timestamp xml:id="ts0" timeString="2012-10-02T16:45:35.312"/>
     </inkml:context>
     <inkml:brush xml:id="br0">
       <inkml:brushProperty name="width" value="0.03333" units="cm"/>
@@ -6932,7 +7436,7 @@
       <inkml:brushProperty name="fitToCurve" value="1"/>
     </inkml:brush>
   </inkml:definitions>
-  <inkml:trace contextRef="#ctx0" brushRef="#br0">223 426 258,'-35'-8'3354,"10"3"258,1 5-645,-4 5-903,-2-1-129,7 7-645,-2 2-774,9 3 129,1 0-258,13 4 0,2-3 0,17-2-129,7-5-129,7-4 129,9-6 129,6-3 0,4-14 0,6-9 0,-4-9 0,-1-3 129,-6 0-129,-3-1 0,-10 4-129,-7 4 0,-10 4-129,-3 10 258,-10 3-129,-2 14 129,0 0 0,-12 0 0,0 1 129,1 12-258,-3-2 0,2 6-129,-2 3 0,1 1-129,-1 5 0,1 1 0,-1 4 0,-2 3-129,1 2 0,-1-2 0,6-1 0,3-6 0,3-6 0,4-8 129,0-13-258,23 2 258,-2-6-129,5-15 129,4-4 0,2-6 129,7-2-258,2-5 258,3-4-129,2-2 258,4-4-258,1-4 129,-1 1-129,-3 3 0,-5 0 129,-2 4-129,-6 5 0,-7 10 129,-8 8-129,-7 12 129,-12 7-129,0 0 129,0 0-129,0 17 129,-12-4 0,0 0 0,1-5 0,0 0 0,0 1 0,5 2-129,6-11 129,-7 20-129,1-6 0,-3 3 0,-1 5 0,-4 5 0,-5 7 129,-10 10-129,-4 8 0,-9 11 129,-8 7 129,-6 15-129,-6 8 129,-7 10 0,-6 3 0,0-1 129,0-5 0,4-5 0,9-13-129,9-14 129,9-16-129,13-15-129,14-18 0,17-19 0,0 0-129,17-25 0,10-6 0,11-11-129,8-10 129,8-8-129,8-12 129,6-7 0,6-13 0,7-3-129,5-8 129,0 2 0,3 1 0,1 5 0,-3 10 0,-6 12 0,-5 11 0,-7 10 0,-6 12 0,-9 5 0,-6 8 0,-11 5 0,-8 8-129,-6 3 129,-6 5 0,-17 6 0,0 0 0,0 0 0,0 0 0,-7 12-129,-5 0 129,-1 2 0,-1-1 129,-2 5-129,1 3 0,-1-1 0,-1 2 0,0 1 0,-2 1 0,-1 4 0,-4 3 129,-4 2-129,-6 6 0,-6 8 0,-5 5 129,-5 8-129,-3 1 129,-2 3 0,3 1-129,5 0 0,4-3 129,7-9-129,9-8 0,11-8 0,7-7 0,8-10 0,3-10 0,11-10 0,7-8 0,6-12 0,6-12 0,2-10 0,7-9 0,3-12 0,6-11 0,1-2 129,1-2-129,-1 3 0,-1 7-129,-3 4 129,-3 9 0,-6 11 0,-9 14-129,-7 11 129,-6 6 0,-16 13 0,0 0 129,0 0-129,-7 16 129,-13 10-129,-3 10 129,-6 7-129,-2 7 0,-3 8 0,-3 6 0,2 1 0,-1 0 0,6-7 0,5-6 0,7-9 0,8-12 0,10-14 0,6-11-129,13-13 129,9-18 0,3-10 0,7-12 0,2-12-129,7-6 129,-2-5-129,2 1 129,-6 5 0,-2 9 0,-8 12 0,-9 14-129,-22 29 258,0 0-129,-3 20 0,-22 17 129,-7 10-129,-2 3 129,0 4-129,3-3 0,7-5 0,9-8 0,9-12 0,11-12 0,13-13-129,13-7 129,8-18 0,9-16 0,8-14 0,9-11-129,4-15 129,0 4 0,-2 5 129,-8 9-129,-13 13 0,-11 19 0,-19 23 0,-16 18 129,-20 30-129,-18 11 129,-10 11-258,-8 5 258,-2 6-258,2 2 258,4-5-129,9-6 0,12-10 0,13-11-129,15-13 129,7-17 0,23-14 0,12-22 0,14-23 0,13-15-129,6-15 258,10-10-258,0-2 129,-5 5 0,-10 7 129,-10 15-258,-19 23 258,-17 22-129,-21 15 0,-18 33 0,-21 16 0,-12 8 129,-11 12-129,-3 1 129,0 1-129,6-8 0,11-10 0,17-8 0,15-19 0,16-10 0,18-16 0,19-19 0,14-24 0,15-13 0,7-15 0,6-8-129,0 0 258,-2 2-258,-9 7 258,-12 12-129,-10 18 0,-20 18 0,-26 22 0,0 13 129,-27 18-129,-13 14 0,-13 13 0,-7 9 129,-6 5-129,0 3 129,6 1-129,7-7 129,10-6-129,12-9 129,19-16-129,12-15 0,17-21 129,18-11-129,14-25 129,10-17-129,11-13 0,5-10 0,2-2 0,-3 3 0,-5 8 0,-10 7 0,-12 15 129,-14 15-129,-19 17 129,-14 11-129,-19 20 0,-16 9 0,-11 10-129,-7 11 258,-7 6-387,-1 3 258,2-1 0,7 0 0,13-8 0,11-6 0,18-15 0,10-14-129,24-15 129,17-15 0,15-21 0,14-13 0,11-8 0,5-8 0,1-5 0,-1 8 0,-9 6 129,-10 13-129,-18 15 0,-21 13 0,-28 15 0,0 13 0,-27 18 0,-19 10 129,-13 10-129,-9 5 0,-2 2-129,6-1 129,11-5 0,11-10 0,22-13 0,15-14 0,22-15 0,23-23 0,17-16 0,15-13 0,10-14 0,2-1 0,-3 2 0,-7 4 0,-12 13 129,-18 15-258,-17 15 129,-27 18 0,-2 15 0,-29 17 0,-16 8-129,-8 16 258,-9 0-258,-4 2 129,7-1 0,8-8 0,16-11 0,18-11 0,18-16 0,12-12 0,30-25 0,15-14-129,17-11 258,7-7-129,7-2 0,-1 0 0,-3 6 0,-10 10 0,-16 15 0,-17 11 0,-21 18 0,-19 4 0,-16 18 0,-21 14 0,-14 5-129,-4 7 0,-7 1 129,2-2 0,8-2-129,12-10 129,14-8-129,14-12 129,12-15-129,17-6 0,16-17 129,13-5 0,7-8-129,3-1 0,0 1 129,-4 4-129,-10 6 0,-11 8 129,-15 7-129,-16 11 0,0 0 0,-27 12 129,-7 5 0,-4 3-129,-4 2 0,1-1 258,2 0-258,7-1 129,1-3-129,6-2 129,6-2-129,2-4 129,4-3 0,3 5 0,10-11 0,-18 16-129,18-16 129,-9 23 0,9-11 0,0 4 0,11-6 129,10-2 0,13-4 258,14-5 0,27-16 129,24-5 0,29-7 129,23-2 0,23 5-257,9 1-388,7 4-517,11 14-2966,-19-2-1290,-12 9-258,-27 0-645,-22 0-258</inkml:trace>
+  <inkml:trace contextRef="#ctx0" brushRef="#br0">447 46 1677,'0'0'3225,"2"-12"0,-2 12-516,0 0-387,0 0-387,0 0-129,0 0-516,-6 14 0,3 6-258,-6-1-258,2 12 258,-7 5-258,3 12 0,-7 3 0,0 10 0,-6 1-129,1 5-129,-6-1 0,2 3-129,-3-11 129,2-3-258,-3-7 0,5-4 0,0-12-129,3-7 0,1-4 0,4-6-129,1-3 0,3-3 0,2-1-129,12-8 129,-13 11-129,13-11 0,0 0 0,0 11 0,0-11 129,12 6-129,2-6 0,6-3 129,3-7 0,7-5 0,3-3 0,4-6 0,5-6 0,0-7-129,1-5 129,1-6 0,1-2-129,-2-3 129,0 2-129,-3-2 129,-1 4 0,-5 2-129,-3 3 129,-4 4-129,-4 2 129,-4 1 0,-6 0 0,-3 1-129,-3 1 129,-5 1 0,-2 4 0,0 3 0,-10 6 0,-6 5 0,-6 9 0,-6 7 0,-6 9-129,-4 14 129,-2 10-129,-2 8 129,1 6-129,5 4 129,7 2-129,7-4 129,13-6 0,9-3 0,6-7 0,16-13 129,15-7 0,10-8 129,10-5-129,10-11 129,2-5 0,9-2-129,1-2-258,-2-4-645,1 13-3225,-14 0-645,-8 11 0,-14 0-774</inkml:trace>
 </inkml:ink>
 </file>
 
@@ -6952,7 +7456,7 @@
           <inkml:channelProperty channel="F" name="resolution" value="0" units="1/dev"/>
         </inkml:channelProperties>
       </inkml:inkSource>
-      <inkml:timestamp xml:id="ts0" timeString="2012-10-02T16:45:12.487"/>
+      <inkml:timestamp xml:id="ts0" timeString="2012-10-02T16:44:25.432"/>
     </inkml:context>
     <inkml:brush xml:id="br0">
       <inkml:brushProperty name="width" value="0.03333" units="cm"/>
@@ -6960,7 +7464,7 @@
       <inkml:brushProperty name="fitToCurve" value="1"/>
     </inkml:brush>
   </inkml:definitions>
-  <inkml:trace contextRef="#ctx0" brushRef="#br0">183 0 3612,'-26'27'3999,"7"3"129,-7 7-774,-3 2-1548,8 11-129,-6-2-258,13 7 129,-2-7-129,13 3-387,2-11-129,8-6-387,9-5-129,11-10-129,6-12 0,4-7-258,5-4 0,0-12-129,1-4 0,-6-6-129,-7-1 0,-8-2 0,-9 3 0,-10 1 0,-6 7 129,-13 1-387,-5 9 0,-9 0-387,3 8-774,-10 0-1677,5 5-903,6-1-258,7-2-387</inkml:trace>
+  <inkml:trace contextRef="#ctx0" brushRef="#br0">452 149 2709,'22'-22'4128,"-12"6"0,-6-1-258,-4-5-774,-1 6-903,-17-4-645,-1 11-129,-14 1-387,-6 8-129,-12 6-258,0 14-129,-5 6-258,0 8 0,3 5-129,9 3 0,7 0-129,15-8 0,14-4-129,9-14 129,21-10-129,14-8-129,9-16 129,9-10 0,4-6 129,0-2-129,-5 0 129,-6 3-129,-11 6 129,-10 6 0,-14 9 0,-12 12 129,0 0 0,-9 0 0,-6 12 0,-3 4 0,0 2 0,4 2 129,1-2-129,9 1-129,4-4 129,12-4-129,9-9 0,14-3-129,11-11 0,7-7 0,8-5 0,1-5-129,-4-2 129,-7 3 129,-5 3 129,-17 8 0,-13 5 129,-16 12 129,0 0-129,-9 0 129,-9 9-129,2 5 0,1 1-129,6 0 0,7 0-258,3-4 0,15-2-129,10-6 0,7 0-129,6-3 129,3-3-129,0-4 129,0-1 129,-6 1 0,-5 2 129,-8 1 129,-8 3 0,-15 1 0,14 0 129,-14 0 0,0 10-129,0-10 129,2 15-129,-2-15 0,21 12-129,-2-8 0,7-2-129,4-2 129,6 0 0,0 0-129,-2 0 129,-5-1 0,-5 0 0,-5 1 0,-19 0 0,14 4 0,-14-4 129,0 0-129,0 14 0,0-14 0,9 3 0,7-3 0,6-5 0,3-3-129,4 1 0,-1 0 0,-3 1 129,-5 3-129,-7 3 129,-13 0 0,4 13 0,-5 2 129,-6-1 0,2 1 0,2-1-129,3-2 129,15-5 0,10-5 0,10-2-129,12-2 129,7-7 0,15 0 0,7-1-129,7-1 0,7 4-903,0-6-3225,10 4-258,3-5-387,13 3-258</inkml:trace>
 </inkml:ink>
 </file>
 
@@ -6980,7 +7484,7 @@
           <inkml:channelProperty channel="F" name="resolution" value="0" units="1/dev"/>
         </inkml:channelProperties>
       </inkml:inkSource>
-      <inkml:timestamp xml:id="ts0" timeString="2012-10-02T16:46:49.139"/>
+      <inkml:timestamp xml:id="ts0" timeString="2012-10-02T16:44:24.137"/>
     </inkml:context>
     <inkml:brush xml:id="br0">
       <inkml:brushProperty name="width" value="0.03333" units="cm"/>
@@ -6988,7 +7492,7 @@
       <inkml:brushProperty name="fitToCurve" value="1"/>
     </inkml:brush>
   </inkml:definitions>
-  <inkml:trace contextRef="#ctx0" brushRef="#br0">51 0 1,'9'20'0,"-8"-8"128,-1 1-256,0 1 128,-5 5 0,-3 1 0,1 2 0,-2 0 0,1-2 0,1-2 0,-1-2 0,4-4 0,4-12 0,-5 13 0,5-13 0,0 0 0,0 0 0,0 0 0,0 0 0,0 0 0,0 0 0,0 0 0,0 0 0,0 0 0,0 0 0,0 0 0,0 0 0,0 0 0,0 0 0,0 0 0,0 0 0,0 0 0,0 0 0,0 0 0,0 0 0,0 0 0,0 0 0</inkml:trace>
+  <inkml:trace contextRef="#ctx0" brushRef="#br0">-3 158 6450,'-3'-20'4644,"3"20"-258,1-22-774,13 12-1290,-2-10-387,16 6-903,3-5 0,6 5-516,5 0 0,6 4-258,-2 3 0,1 4-129,-5 4 0,-12 11-129,-10 4-129,-10 7 129,-10 6-129,-12 5 129,-9 4-129,-5 0 258,-4-2-258,4 1 129,3-7 0,10-4 0,8-8 0,5-18 0,25 7 0,7-9 0,9-9 0,6-7 0,3 0 129,-1 0-129,-4 4 0,-5 6 0,-10 5 0,-10 3 0,-8 12 129,-5 2-129,-5 1 129,3 0-129,5-3 129,6-4 0,10-8-129,13-6 129,13-14-129,19-5 129,10-5-129,7-3-129,1 2 0,-3-2-516,0 8-1161,-11 3-2451,-9 6-258,-16-3-258,-4 2-258</inkml:trace>
 </inkml:ink>
 </file>
 
@@ -7008,7 +7512,7 @@
           <inkml:channelProperty channel="F" name="resolution" value="0" units="1/dev"/>
         </inkml:channelProperties>
       </inkml:inkSource>
-      <inkml:timestamp xml:id="ts0" timeString="2012-10-02T16:46:47.267"/>
+      <inkml:timestamp xml:id="ts0" timeString="2012-10-02T16:44:13.933"/>
     </inkml:context>
     <inkml:brush xml:id="br0">
       <inkml:brushProperty name="width" value="0.03333" units="cm"/>
@@ -7016,7 +7520,7 @@
       <inkml:brushProperty name="fitToCurve" value="1"/>
     </inkml:brush>
   </inkml:definitions>
-  <inkml:trace contextRef="#ctx0" brushRef="#br0">1710 60 32767,'0'0'0,"-116"21"0,32-9 0,-8 5 0,-17-2 0,-9 3 0,-1-4 0,6-3 0,7-5 0,7-4 0,3-2 0,5-2 0,8-7 0,7-2 0,12-4 0,5-1 0,6-2 0,4-1 0,5 0-32766,5 0 32766,1 2 0,6 0 0,2 3 0</inkml:trace>
+  <inkml:trace contextRef="#ctx0" brushRef="#br0">677-3 1935,'0'0'3999,"-17"0"387,-3 4-129,-7 9-903,-11 1-645,-7 13-645,-15-1-516,-3 11-258,-9 1-516,0 10-129,1-3-258,10 4 129,6-5-387,16-3 258,12-6-258,17-9 0,12-11-258,21-15 0,16-3 0,15-18-129,14-9 0,8-7 0,7-1 0,-6-3 0,-3 8 129,-11 6-129,-12 5 258,-16 11-129,-15 6 258,-20 5-129,8 14 129,-10 4 0,-9 4 129,-2 2 0,2 2-129,3 0 129,3-4-129,5-3 129,7-5-129,12-7-129,9-7 129,9-2 0,7-10-129,7-3 0,2 1 0,2-2-129,-2 3 129,-8 3-129,-9 4 129,-7 5-129,-10 1 0,-9 6 129,-10-6 0,1 18 129,-1-18-129,-3 20 0,3-20-129,1 16 129,13-10 0,7-2 0,10-2 0,6-2-129,10 0 129,2 0-129,6-2 129,-4 0-129,-7 2 129,-7 0-129,-6 1 129,-7 5-129,-8 2 129,-4-1 0,-12-7 0,16 11 0,-2-11 0,4 2 0,8-2 0,5-1 0,7-3 0,5-2-129,3 2 0,0-1-258,3 5-645,-7-7-1935,6 6-1290,-4-5-258,5 0-387,-3-2-258</inkml:trace>
 </inkml:ink>
 </file>
 
@@ -7036,7 +7540,7 @@
           <inkml:channelProperty channel="F" name="resolution" value="0" units="1/dev"/>
         </inkml:channelProperties>
       </inkml:inkSource>
-      <inkml:timestamp xml:id="ts0" timeString="2012-10-02T16:45:13.329"/>
+      <inkml:timestamp xml:id="ts0" timeString="2012-10-02T16:44:13.075"/>
     </inkml:context>
     <inkml:brush xml:id="br0">
       <inkml:brushProperty name="width" value="0.03333" units="cm"/>
@@ -7044,7 +7548,7 @@
       <inkml:brushProperty name="fitToCurve" value="1"/>
     </inkml:brush>
   </inkml:definitions>
-  <inkml:trace contextRef="#ctx0" brushRef="#br0">111 11 5547,'37'-12'4515,"-19"12"-387,3 5-129,0 15-2451,-6 2-1032,3 12 0,-6 3 129,1 7 129,-11 5-129,-2 10-129,-6-2 129,-7 5 0,-10-7-129,-2-1 0,-5-9-258,-1-9-129,-2-11-129,4-15-129,2-10 0,3-9 0,9-11 0,6-7 129,7-4-129,6 0 129,15-1 258,8 6 0,9 3 129,10 9 0,2 2 258,9 9-129,0 2-129,2 2 0,-1 7-129,-3 3-129,-5 0-129,-2 1-387,-3 4-1032,-13-6-2967,-2 4-387,-10-2-387,-10 1-258</inkml:trace>
+  <inkml:trace contextRef="#ctx0" brushRef="#br0">26 166 6063,'9'-37'4902,"5"18"-516,3-1-129,11 2-1548,-1-7-903,15 10-258,-2 0-903,7 6-129,0 3-258,-1 6-129,1 0 0,-5 6-129,-6 5 129,-10 5-387,-11 6 387,-11 2-387,-7 5 387,-17 7-258,-14 3 258,-12 7 0,-12 6-129,-4 4 258,-5-2-258,4-3 129,4-4-516,7-13-2064,20-6-1935,14-17-129,18-11-258,10-19-516</inkml:trace>
 </inkml:ink>
 </file>
 
@@ -7092,7 +7596,7 @@
           <inkml:channelProperty channel="F" name="resolution" value="0" units="1/dev"/>
         </inkml:channelProperties>
       </inkml:inkSource>
-      <inkml:timestamp xml:id="ts0" timeString="2012-10-02T16:45:12.861"/>
+      <inkml:timestamp xml:id="ts0" timeString="2012-10-02T16:45:46.030"/>
     </inkml:context>
     <inkml:brush xml:id="br0">
       <inkml:brushProperty name="width" value="0.03333" units="cm"/>
@@ -7100,7 +7604,7 @@
       <inkml:brushProperty name="fitToCurve" value="1"/>
     </inkml:brush>
   </inkml:definitions>
-  <inkml:trace contextRef="#ctx0" brushRef="#br0">8 0 7353,'18'19'4386,"-13"-1"-258,-1 8-903,-4-1-1935,4 16-387,-4 3 0,0 10 0,-3-1-387,0 4 0,-7-3 0,5-3-129,-3-5-129,3-10-258,3-9-258,0-16-1032,2-11-1935,7 5-1161,1-14-258,-1-11-387,3-3 0</inkml:trace>
+  <inkml:trace contextRef="#ctx0" brushRef="#br0">0 47 7224,'11'-10'4515,"-11"10"-258,21-3-387,-11-8-774,15 11-774,-6-8-516,7 4-516,-2-3-129,7 5-258,-5 0 0,4 3-387,-5 7 0,-3 10-128,-8 8-388,-7 12 0,-7 6 0,-9 8 0,-10 2 0,-12 4 0,-4-3 0,-1-4 0,3-9 0,5-10 0,6-11 0,12-8 0,10-13 0,0 0 0,26-4 0,3-6 0,6-1 0,6 2 0,6 4 0,3 5 0,-1 0 0,-2 3 0,-3 8 0,-3 4 0,-2 8-904,-14-7-3482,-3 4-774,-13-7-129,-2-2-516</inkml:trace>
 </inkml:ink>
 </file>
 
@@ -7120,7 +7624,7 @@
           <inkml:channelProperty channel="F" name="resolution" value="0" units="1/dev"/>
         </inkml:channelProperties>
       </inkml:inkSource>
-      <inkml:timestamp xml:id="ts0" timeString="2012-10-02T16:45:12.081"/>
+      <inkml:timestamp xml:id="ts0" timeString="2012-10-02T16:45:45.281"/>
     </inkml:context>
     <inkml:brush xml:id="br0">
       <inkml:brushProperty name="width" value="0.03333" units="cm"/>
@@ -7128,7 +7632,7 @@
       <inkml:brushProperty name="fitToCurve" value="1"/>
     </inkml:brush>
   </inkml:definitions>
-  <inkml:trace contextRef="#ctx0" brushRef="#br0">174 0 7224,'35'10'4515,"-19"4"-387,3 6-129,-5 9-2451,-3 0-1290,4 5 0,-6 6-129,-2 0 0,-7 4-129,-1 3 129,-13 0 0,-7 2 0,-10-3 0,-2-3 129,-5-8 129,0-9-129,0-10 129,6-9-129,4-7 129,11-12-258,11-8 0,6-6 0,17-1-129,10-2 0,11 2 0,6 3 129,6 4 0,3 7 0,-1 6 129,-3 7-129,-5 9 129,-7 8 0,-8 6-129,-10 5 129,-6 0-258,-8-1 0,-5-2-387,-3-8-387,0-1-1161,-9-11-2580,12-5-129,-10-6-258,10-9-258</inkml:trace>
+  <inkml:trace contextRef="#ctx0" brushRef="#br0">-1 0 11352,'5'37'4773,"-5"-6"-258,3 9-258,-3 2-2580,0 6-645,0 0-387,1 1-516,0-7-387,-1-10-1548,0-4-2322,0-11-387,0-2-129,0-15-258</inkml:trace>
 </inkml:ink>
 </file>
 
@@ -7148,7 +7652,7 @@
           <inkml:channelProperty channel="F" name="resolution" value="0" units="1/dev"/>
         </inkml:channelProperties>
       </inkml:inkSource>
-      <inkml:timestamp xml:id="ts0" timeString="2012-10-02T16:45:11.441"/>
+      <inkml:timestamp xml:id="ts0" timeString="2012-10-02T16:45:45.016"/>
     </inkml:context>
     <inkml:brush xml:id="br0">
       <inkml:brushProperty name="width" value="0.03333" units="cm"/>
@@ -7156,7 +7660,7 @@
       <inkml:brushProperty name="fitToCurve" value="1"/>
     </inkml:brush>
   </inkml:definitions>
-  <inkml:trace contextRef="#ctx0" brushRef="#br0">311 0 3225,'2'13'4257,"-2"10"0,-12 10 0,-3 18-1419,-11-1-1677,8 16-387,-14 2 0,7 7 258,-9-2-258,5 2-258,-4-5 0,8-8-129,-1-6-129,8-8-129,7-11 0,5-15-774,8-3-903,-2-19-2580,19 0-387,0-11-129,0-7-387</inkml:trace>
+  <inkml:trace contextRef="#ctx0" brushRef="#br0">200 58 6708,'10'-15'4386,"-10"15"129,-10-7-387,1 14-1161,-12 2-774,5 9-903,-9 4-645,0 9-129,-4 3-129,5 3-258,0 3-129,8 3 129,7 2-129,8-4 0,3-7 0,15-8 0,9-9 0,8-11 129,3-9 258,3-16-129,-1-14 258,-3-13-129,-8-7 129,-3-2 129,-14 0-129,-8 4 0,-10 4-258,-13 11 0,-11 7-129,-2 13-258,0 14-129,1 2-645,11 18-2709,2-3-1161,14 10-258,5-3-387,11 5-129</inkml:trace>
 </inkml:ink>
 </file>
 
@@ -7176,7 +7680,7 @@
           <inkml:channelProperty channel="F" name="resolution" value="0" units="1/dev"/>
         </inkml:channelProperties>
       </inkml:inkSource>
-      <inkml:timestamp xml:id="ts0" timeString="2012-10-02T16:45:10.958"/>
+      <inkml:timestamp xml:id="ts0" timeString="2012-10-02T16:45:44.579"/>
     </inkml:context>
     <inkml:brush xml:id="br0">
       <inkml:brushProperty name="width" value="0.03333" units="cm"/>
@@ -7184,7 +7688,7 @@
       <inkml:brushProperty name="fitToCurve" value="1"/>
     </inkml:brush>
   </inkml:definitions>
-  <inkml:trace contextRef="#ctx0" brushRef="#br0">75 19 3612,'32'-19'4386,"-15"19"-129,0 2 0,-1 8-1419,5 13-1806,-6 6-258,3 8 129,-5 2-129,-3 6-129,-7 1-258,-3 3 0,-7-2 0,-7-2-129,-8-6 0,-4-3-129,-4-7 0,0-9 0,1-7-129,0-10 0,6-4 0,7-13 0,6-6 0,10-6-129,5-2 129,15-1 0,8 2 129,8 6 0,7 4 0,2 9 129,2 6-129,-2 5 129,-5 10-129,-4 7 129,-10 3-129,-6 2 0,-6 0-129,-7-2 0,-6-2 0,-1-6-258,-4 0-645,-8-15-1290,12 0-2193,-14 0-387,14 0 0,-12-22-645</inkml:trace>
+  <inkml:trace contextRef="#ctx0" brushRef="#br0">51 104 2580,'0'0'4128,"0"0"0,0 0-387,5-12-387,1-4-516,11 8-645,-4-12-129,10 10-774,-2-7-129,5 8-258,-2-1-129,2 9-129,-4 1-258,-2 8 0,-6 11 0,-6 11-129,-8 6-129,-6 8 0,-13 6 0,-8 3 0,-6 2-129,-5-3 129,-3-7-129,1-8 0,6-9 0,10-8-129,10-8 129,14-12 0,0 0 0,19-5 0,9-5 0,7 0 0,6-3 129,2 2-129,0-1 0,-3 1-129,0 3-129,-9-3-645,5 5-2580,-15-8-1161,2 4-258,-12-2-258,4 5-387</inkml:trace>
 </inkml:ink>
 </file>
 
@@ -7204,7 +7708,7 @@
           <inkml:channelProperty channel="F" name="resolution" value="0" units="1/dev"/>
         </inkml:channelProperties>
       </inkml:inkSource>
-      <inkml:timestamp xml:id="ts0" timeString="2012-10-02T16:45:10.349"/>
+      <inkml:timestamp xml:id="ts0" timeString="2012-10-02T16:45:43.799"/>
     </inkml:context>
     <inkml:brush xml:id="br0">
       <inkml:brushProperty name="width" value="0.03333" units="cm"/>
@@ -7212,7 +7716,7 @@
       <inkml:brushProperty name="fitToCurve" value="1"/>
     </inkml:brush>
   </inkml:definitions>
-  <inkml:trace contextRef="#ctx0" brushRef="#br0">348-3 2580,'5'-15'4257,"-5"15"0,-5 6-129,0 9-1548,-7 2-1032,4 15-645,-4 3-129,3 11 258,-8 7-387,3 14 0,-6 6-129,-3 12 0,-6 3 0,-1 6-129,-1-4 0,0-6-258,1-4 0,2-13 0,4-15-129,8-13-258,8-10-645,8-29-1806,0 0-1677,0-8-129,6-10-258,7-9-387</inkml:trace>
+  <inkml:trace contextRef="#ctx0" brushRef="#br0">361 13 4902,'14'-16'5031,"-14"16"-129,0 0-129,0 0-774,-7 10-903,-5 22-903,-16 7-774,-2 17-129,-11 4-387,-2 13-644,-7 3-259,3-1 0,5-6 0,8-11 0,9-15 0,8-17-1549,17-4-2966,0-22-645,21-3 129,5-18-645</inkml:trace>
 </inkml:ink>
 </file>
 
@@ -7232,7 +7736,7 @@
           <inkml:channelProperty channel="F" name="resolution" value="0" units="1/dev"/>
         </inkml:channelProperties>
       </inkml:inkSource>
-      <inkml:timestamp xml:id="ts0" timeString="2012-10-02T16:45:09.569"/>
+      <inkml:timestamp xml:id="ts0" timeString="2012-10-02T16:45:43.347"/>
     </inkml:context>
     <inkml:brush xml:id="br0">
       <inkml:brushProperty name="width" value="0.03333" units="cm"/>
@@ -7240,7 +7744,7 @@
       <inkml:brushProperty name="fitToCurve" value="1"/>
     </inkml:brush>
   </inkml:definitions>
-  <inkml:trace contextRef="#ctx0" brushRef="#br0">175 0 7482,'0'0'4257,"0"0"-387,-15 12 0,1 9-3225,-3 6-516,0 8 0,-2 7 129,0 10 129,-1 3 129,4 12 387,0 2-258,5 5 0,1-8 258,9-1-258,1-15 0,8-11-387,9-17 0,6-15-129,0-14 0,9-19-129,1-11 0,-2-9 0,-2-3-129,-7-4 129,-4 0-129,-10 3 129,-4 5-129,-5 8 129,-10 5 0,-4 5-129,0 6 0,-2 7-258,3 7-129,1-2-774,13 9-903,0 0-2064,0 0-258,10 0-129,8 0-387</inkml:trace>
+  <inkml:trace contextRef="#ctx0" brushRef="#br0">0 67 2967,'7'-14'3741,"3"8"387,3-5-516,6 8-387,-4-8-645,13 7-258,-10-7-516,12 10-258,-8-5-387,4 6-258,-7 3-129,0 10-129,-8 4-129,-2 11-258,-8 7 0,-1 6-129,-12 3 0,-4 3-129,-7-3 0,-4-2 0,0-5 0,-1-10-129,4-10 129,6-8 0,7-7 0,11-2 0,0-9 129,16-3 0,8-1 0,6 2 0,4-1 0,1 5 0,-1 3-129,2-1-129,-3 5-516,-7-4-1032,4 4-2580,-12-3-516,1 3-258,-19 0-258</inkml:trace>
 </inkml:ink>
 </file>
 
@@ -7260,7 +7764,7 @@
           <inkml:channelProperty channel="F" name="resolution" value="0" units="1/dev"/>
         </inkml:channelProperties>
       </inkml:inkSource>
-      <inkml:timestamp xml:id="ts0" timeString="2012-10-02T16:45:09.117"/>
+      <inkml:timestamp xml:id="ts0" timeString="2012-10-02T16:45:42.411"/>
     </inkml:context>
     <inkml:brush xml:id="br0">
       <inkml:brushProperty name="width" value="0.03333" units="cm"/>
@@ -7268,7 +7772,7 @@
       <inkml:brushProperty name="fitToCurve" value="1"/>
     </inkml:brush>
   </inkml:definitions>
-  <inkml:trace contextRef="#ctx0" brushRef="#br0">15 37 2193,'0'0'3354,"-8"-13"-387,8 13-774,-1-14-387,1 14 0,0-11 0,0 11-258,0 0-129,4 17-258,-4 3-129,1 16 129,-1 5-258,0 14-129,-1 5 0,-1 7-129,1-1-258,-1 0 0,-1-7-129,1-7-129,1-11 0,1-12-516,0-8-129,0-21-1419,0 0-2451,3-11-129,2-7-387,-2-5-258</inkml:trace>
+  <inkml:trace contextRef="#ctx0" brushRef="#br0">336 0 9933,'-19'28'4902,"-6"2"-129,-1 21-258,-9 2-1677,1 22-1161,-9 0-516,5 9-516,0-5-258,7-5-129,6-12-258,9-18-516,9-11-903,7-33-2967,17 2-387,3-21-129,9-10-645</inkml:trace>
 </inkml:ink>
 </file>
 
@@ -7288,7 +7792,7 @@
           <inkml:channelProperty channel="F" name="resolution" value="0" units="1/dev"/>
         </inkml:channelProperties>
       </inkml:inkSource>
-      <inkml:timestamp xml:id="ts0" timeString="2012-10-02T16:45:06.901"/>
+      <inkml:timestamp xml:id="ts0" timeString="2012-10-02T16:45:41.958"/>
     </inkml:context>
     <inkml:brush xml:id="br0">
       <inkml:brushProperty name="width" value="0.03333" units="cm"/>
@@ -7296,7 +7800,7 @@
       <inkml:brushProperty name="fitToCurve" value="1"/>
     </inkml:brush>
   </inkml:definitions>
-  <inkml:trace contextRef="#ctx0" brushRef="#br0">0 877 11997,'20'-6'4902,"5"-10"-516,8-5 258,4-10-4386,20-6 0,6-12-258,8-9 129,1-10-129,4-5-129,-2-4 129,-9 1-258,-7 1 129,-15 6-129,-11 10 0,-14 11 0,-15 12 129,-12 19 129,-16 12 0,-15 10 0,-11 20 129,-8 15 0,-9 11-129,-5 9 258,2 8-129,2 2 129,5-2 0,12-2 0,10-9-129,14-12 129,12-14 0,16-16 0,12-15-129,19-15 0,11-17 0,13-9-129,6-8 129,4-2-129,1 0 129,-1 9-129,-8 8 0,-10 14 129,-8 13-129,-14 9 129,-10 17-129,-11 14 0,-8 9 0,-14 9 0,-10 1 0,-9 5 129,-7-1-129,-4-3 0,-6-3 129,0-8 0,-1-11 0,4-8-129,8-7 258,7-9-129,12-7 0,10-8 0,12-7-129,11-5 129,18-3-129,14 0 0,10-2 0,9 1 0,4 4-129,5 1 129,-1 4 0,-3 2-129,-5 6 0,-9 5 0,-9 2 129,-11 4-129,-8 6 0,-13 3 129,-8 3 0,-4 1-129,-11 1 258,-10 0-129,-2-1 129,-1 2-129,1-3 258,2-3-258,6-1 258,17-12-129,0 0 0,7 6-129,17-10 0,10-12 129,9-3-129,6-4 0,3-2-129,-1 0 129,-7 3-129,-6 5 129,-6 2 0,-11 6 0,-11 5 0,-10 4-129,-9 7 129,-14 7 0,-5 2-129,-6 4 129,0 2 0,0 4 0,2-2 129,7-1 0,10-3 0,11-2-129,4-7 258,15-5-258,10-6 129,6-7-129,8-9-129,5-7 129,0-5 0,0-3-129,-3-2 129,-7 2-129,-6 6 129,-8 6-129,-7 8 129,-13 11-129,0 9 129,-7 15 0,-7 11 0,-2 9 0,-1 1 129,2 2-129,1-5 129,9-8 0,5-12 129,0-22-129,21-2 129,2-28-258,8-16 129,6-17-129,3-15 129,0-12-258,-1-6 129,-1-3-129,-6 0-129,-7 7 129,-6 11 0,-9 15 0,-7 16 0,-7 22-129,-9 25 129,-12 18 0,-6 31 129,-7 22-129,-4 18 258,-4 15-129,3 6 258,7-1 0,3-8 129,15-9 0,10-19 0,11-24-129,16-25 129,16-21-129,10-24-258,11-25 0,6-20-258,3-16 0,1-10 0,-2-6-129,-3 6 129,-10 7-129,-6 14 129,-13 18 0,-6 26 0,-12 23 258,-10 21 0,-5 32 0,-12 19 129,-6 17 0,-6 10-129,-3 9 258,-4-2-129,1-3 0,2-11 0,8-16 129,7-17 0,13-14 0,6-20 0,21-13 0,11-13 0,17-15-129,14-11 0,9-5 0,9-6-258,4-2 0,3 2-258,-6-7-2064,4 19-2193,-16-2-516,-9 10-258,-14 6-774</inkml:trace>
+  <inkml:trace contextRef="#ctx0" brushRef="#br0">132 13 4902,'0'-12'4257,"0"12"-129,-14 0-258,0 2-1032,5 17-645,-12 2-645,5 13-516,-2 0-387,2 8-387,4 0 129,5 1-387,4-3 129,3-2-129,12-8 0,7-4 129,10-9-129,7-8 0,4-9 258,4-7 129,2-15 0,-2-8 129,-3-11 0,-7-1 129,-11-4-129,-7 5 129,-13 4-129,-4 6-129,-16 8-258,-8 8 0,-6 9-258,-4 4-387,7 6-903,-4 1-2967,13 8-387,0-4-129,12 9-387</inkml:trace>
 </inkml:ink>
 </file>
 
@@ -7316,7 +7820,7 @@
           <inkml:channelProperty channel="F" name="resolution" value="0" units="1/dev"/>
         </inkml:channelProperties>
       </inkml:inkSource>
-      <inkml:timestamp xml:id="ts0" timeString="2012-10-02T16:45:04.998"/>
+      <inkml:timestamp xml:id="ts0" timeString="2012-10-02T16:45:41.490"/>
     </inkml:context>
     <inkml:brush xml:id="br0">
       <inkml:brushProperty name="width" value="0.03333" units="cm"/>
@@ -7324,7 +7828,7 @@
       <inkml:brushProperty name="fitToCurve" value="1"/>
     </inkml:brush>
   </inkml:definitions>
-  <inkml:trace contextRef="#ctx0" brushRef="#br0">46 392 2709,'-22'33'4128,"16"-17"-258,6-16 0,-19 15-1935,19-15-774,0 0 0,0 0-129,-2-15 0,4-3-258,1-11 129,7 1-129,-3-12-129,4 0 0,-1-3-258,5 2-258,-3 2 0,4 3 0,-2 6-129,1 7 0,-4 7 129,-1 9-129,-10 7 0,17 7 129,-11 13-129,-3 12 129,-2 9 0,0 10 0,-1 10 0,0 6 0,-3 6 129,-2 3-129,0-1 129,1-7 0,1-5 0,3-11-129,0-10 129,0-16-258,6-14 258,6-14-258,2-19 0,0-17 0,7-10 0,-2-12 129,-2-5-129,0-8 0,-2 2 0,-3 2 0,2 3 0,-2 6-258,2 10-258,-2 8 0,4 11 129,-3 11 129,-3 12 129,-10 8 129,10 24 0,-10 12 387,-3 6 129,-5 13 0,-4 1 0,6 6-129,-2-4-129,4-1-129,4-10 0,0-3-129,5-6 129,2-5-129,0-5 129,3-6-258,1-3 129,-1-6 0,3-8 0,0-5 0,1-10-129,3-10 129,-1-7-258,1-7 258,-2-7-129,2-3 129,-3 2-129,1 0 0,-4 7 129,-1 3-129,-2 8 129,-2 11 0,-6 13 0,3 11 0,-3 11 129,-3 11-129,-5 5 129,-1 4 0,0 1 0,2-2-129,0-6 129,3-6-129,4-7 129,0-9-258,0-13 129,12 9 0,-1-9-129,5-12 129,1-4-129,6-5 258,2-3-258,2-2 129,1-1 0,-2 4 0,3 3 0,-4 6 0,-3 7 0,-6 7 0,-4 2 0,-7 14 0,-5 4 0,-3 5 0,-11 3 0,-4 3 0,-6-1 129,-2-3-258,-3-5 258,0-4-258,1-10 258,4-8-129,3-3-129,5-14 129,6-6-129,6-3 129,4-2-129,5 0 129,8 6-129,4 2 258,5 7-129,1 7-129,-2 6 129,1 12 0,-2 5 129,-4 11-129,-1 0 129,-5 4-129,-2 0 129,-4-4-129,1-5 129,-1-5-129,1-8 0,-5-10 0,12-4 0,-4-15 0,3-7 0,0-6 0,1-6-129,2 0 129,-1 0-129,1 5 129,-3 10-129,3 7 0,-14 16 129,17 0 0,-10 11 0,-3 12-129,1 4 258,-2 6-129,-1 1 129,1 0-129,0-4 0,3-4 0,2-6 129,5-7-129,3-8 0,4-7 0,2-11 0,0-11 0,1-7 0,1-8 0,-1-9-129,-6-6 0,-2-6 0,-3-4 0,-2 0 0,-3-1-129,-3 8 129,-3 5 0,-1 11 129,0 14 0,-2 14 0,2 13 129,-12 26-129,4 15 129,0 13 0,-2 11 0,1 10 0,-2 3 0,1 1 129,4-3 0,1-12 0,4-9-129,1-14 129,2-13-129,7-15 0,7-14 0,3-19-258,3-18 0,4-12 0,1-17 0,1-12-129,1-9 0,0-5 0,-2 0 0,0 5 0,-3 10 0,-3 16 258,-7 21-129,0 24 129,-14 17 0,3 30 129,-6 21 0,-11 19 129,-2 13 0,-3 7-129,1 5 129,2-6 0,5-3 0,6-14-129,5-12 0,13-17 0,11-17 0,6-17 0,9-17-129,4-20-129,5-20 0,9-16-258,-4-18 129,2-11-129,-7-11 0,-2 1 0,-7 7 258,-4 12 0,-9 28 258,-12 24 129,-14 32 258,2 38 0,-5 36 0,-12 20 129,0 17-258,-2 5 0,5-3-387,7-8-516,1-26-3225,13-16-1290,12-30 0,12-20-516,2-17-516</inkml:trace>
+  <inkml:trace contextRef="#ctx0" brushRef="#br0">0 0 5805,'0'0'5031,"11"8"-387,-5 12-129,-5 1-903,4 18-1290,-5-2-387,5 13-903,-5 0-129,1 7-387,-1-3 0,0-1-258,-2-1-129,1-10 0,-2-4-258,0-10-129,2-5-516,-3-12-258,4 0-903,0-11-2709,0-10 0,0-8-258,5 3-129</inkml:trace>
 </inkml:ink>
 </file>
 
@@ -7344,7 +7848,7 @@
           <inkml:channelProperty channel="F" name="resolution" value="0" units="1/dev"/>
         </inkml:channelProperties>
       </inkml:inkSource>
-      <inkml:timestamp xml:id="ts0" timeString="2012-10-02T16:45:02.845"/>
+      <inkml:timestamp xml:id="ts0" timeString="2012-10-02T16:45:38.822"/>
     </inkml:context>
     <inkml:brush xml:id="br0">
       <inkml:brushProperty name="width" value="0.03333" units="cm"/>
@@ -7352,7 +7856,7 @@
       <inkml:brushProperty name="fitToCurve" value="1"/>
     </inkml:brush>
   </inkml:definitions>
-  <inkml:trace contextRef="#ctx0" brushRef="#br0">100 547 774,'13'11'1548,"-11"0"129,-2-11 129,0 14 129,0-14-129,0 16 0,0-3-129,0-13 0,0 27-129,-2-15 129,2 6-258,-7-5-129,7 5-258,0-18 129,-4 21-387,4-21 0,0 0 0,0 0-129,11 0-129,-3-10 0,5-4-129,0-3 0,4-2-129,-4-2-129,1-1 129,-2 0-258,-1-2 129,-5-1-129,0 1 0,-1-7 129,0 1-129,-1-6 129,-2 1-129,-1-7 0,0 3 0,-1-4 0,0 3 0,-1 1 0,-5 1 0,-3 7 0,0 1-129,-1 6 129,0 3 0,-1 4 0,0 5-129,1 2 129,0 5 0,-1 5-129,0 2 129,-1 9 0,-3 7 0,0 9-129,-2 8 129,2 6 0,-3 6 129,4 4-258,1 1 258,6-1-129,4-6 0,3-5 0,1-9 0,8-10 0,5-5 0,4-10 0,0-6-129,4-3 129,-4-9 0,2-4 0,-4 0 0,0-3 0,-5-3-129,-2-2 129,-4 0-129,-3-1 0,-2-3-129,1 5-258,-2-6-774,1 11-2967,-1 6-258,1 12-387,-14-2-258</inkml:trace>
+  <inkml:trace contextRef="#ctx0" brushRef="#br0">223 426 258,'-35'-8'3354,"10"3"258,1 5-645,-4 5-903,-2-1-129,7 7-645,-2 2-774,9 3 129,1 0-258,13 4 0,2-3 0,17-2-129,7-5-129,7-4 129,9-6 129,6-3 0,4-14 0,6-9 0,-4-9 0,-1-3 129,-6 0-129,-3-1 0,-10 4-129,-7 4 0,-10 4-129,-3 10 258,-10 3-129,-2 14 129,0 0 0,-12 0 0,0 1 129,1 12-258,-3-2 0,2 6-129,-2 3 0,1 1-129,-1 5 0,1 1 0,-1 4 0,-2 3-129,1 2 0,-1-2 0,6-1 0,3-6 0,3-6 0,4-8 129,0-13-258,23 2 258,-2-6-129,5-15 129,4-4 0,2-6 129,7-2-258,2-5 258,3-4-129,2-2 258,4-4-258,1-4 129,-1 1-129,-3 3 0,-5 0 129,-2 4-129,-6 5 0,-7 10 129,-8 8-129,-7 12 129,-12 7-129,0 0 129,0 0-129,0 17 129,-12-4 0,0 0 0,1-5 0,0 0 0,0 1 0,5 2-129,6-11 129,-7 20-129,1-6 0,-3 3 0,-1 5 0,-4 5 0,-5 7 129,-10 10-129,-4 8 0,-9 11 129,-8 7 129,-6 15-129,-6 8 129,-7 10 0,-6 3 0,0-1 129,0-5 0,4-5 0,9-13-129,9-14 129,9-16-129,13-15-129,14-18 0,17-19 0,0 0-129,17-25 0,10-6 0,11-11-129,8-10 129,8-8-129,8-12 129,6-7 0,6-13 0,7-3-129,5-8 129,0 2 0,3 1 0,1 5 0,-3 10 0,-6 12 0,-5 11 0,-7 10 0,-6 12 0,-9 5 0,-6 8 0,-11 5 0,-8 8-129,-6 3 129,-6 5 0,-17 6 0,0 0 0,0 0 0,0 0 0,-7 12-129,-5 0 129,-1 2 0,-1-1 129,-2 5-129,1 3 0,-1-1 0,-1 2 0,0 1 0,-2 1 0,-1 4 0,-4 3 129,-4 2-129,-6 6 0,-6 8 0,-5 5 129,-5 8-129,-3 1 129,-2 3 0,3 1-129,5 0 0,4-3 129,7-9-129,9-8 0,11-8 0,7-7 0,8-10 0,3-10 0,11-10 0,7-8 0,6-12 0,6-12 0,2-10 0,7-9 0,3-12 0,6-11 0,1-2 129,1-2-129,-1 3 0,-1 7-129,-3 4 129,-3 9 0,-6 11 0,-9 14-129,-7 11 129,-6 6 0,-16 13 0,0 0 129,0 0-129,-7 16 129,-13 10-129,-3 10 129,-6 7-129,-2 7 0,-3 8 0,-3 6 0,2 1 0,-1 0 0,6-7 0,5-6 0,7-9 0,8-12 0,10-14 0,6-11-129,13-13 129,9-18 0,3-10 0,7-12 0,2-12-129,7-6 129,-2-5-129,2 1 129,-6 5 0,-2 9 0,-8 12 0,-9 14-129,-22 29 258,0 0-129,-3 20 0,-22 17 129,-7 10-129,-2 3 129,0 4-129,3-3 0,7-5 0,9-8 0,9-12 0,11-12 0,13-13-129,13-7 129,8-18 0,9-16 0,8-14 0,9-11-129,4-15 129,0 4 0,-2 5 129,-8 9-129,-13 13 0,-11 19 0,-19 23 0,-16 18 129,-20 30-129,-18 11 129,-10 11-258,-8 5 258,-2 6-258,2 2 258,4-5-129,9-6 0,12-10 0,13-11-129,15-13 129,7-17 0,23-14 0,12-22 0,14-23 0,13-15-129,6-15 258,10-10-258,0-2 129,-5 5 0,-10 7 129,-10 15-258,-19 23 258,-17 22-129,-21 15 0,-18 33 0,-21 16 0,-12 8 129,-11 12-129,-3 1 129,0 1-129,6-8 0,11-10 0,17-8 0,15-19 0,16-10 0,18-16 0,19-19 0,14-24 0,15-13 0,7-15 0,6-8-129,0 0 258,-2 2-258,-9 7 258,-12 12-129,-10 18 0,-20 18 0,-26 22 0,0 13 129,-27 18-129,-13 14 0,-13 13 0,-7 9 129,-6 5-129,0 3 129,6 1-129,7-7 129,10-6-129,12-9 129,19-16-129,12-15 0,17-21 129,18-11-129,14-25 129,10-17-129,11-13 0,5-10 0,2-2 0,-3 3 0,-5 8 0,-10 7 0,-12 15 129,-14 15-129,-19 17 129,-14 11-129,-19 20 0,-16 9 0,-11 10-129,-7 11 258,-7 6-387,-1 3 258,2-1 0,7 0 0,13-8 0,11-6 0,18-15 0,10-14-129,24-15 129,17-15 0,15-21 0,14-13 0,11-8 0,5-8 0,1-5 0,-1 8 0,-9 6 129,-10 13-129,-18 15 0,-21 13 0,-28 15 0,0 13 0,-27 18 0,-19 10 129,-13 10-129,-9 5 0,-2 2-129,6-1 129,11-5 0,11-10 0,22-13 0,15-14 0,22-15 0,23-23 0,17-16 0,15-13 0,10-14 0,2-1 0,-3 2 0,-7 4 0,-12 13 129,-18 15-258,-17 15 129,-27 18 0,-2 15 0,-29 17 0,-16 8-129,-8 16 258,-9 0-258,-4 2 129,7-1 0,8-8 0,16-11 0,18-11 0,18-16 0,12-12 0,30-25 0,15-14-129,17-11 258,7-7-129,7-2 0,-1 0 0,-3 6 0,-10 10 0,-16 15 0,-17 11 0,-21 18 0,-19 4 0,-16 18 0,-21 14 0,-14 5-129,-4 7 0,-7 1 129,2-2 0,8-2-129,12-10 129,14-8-129,14-12 129,12-15-129,17-6 0,16-17 129,13-5 0,7-8-129,3-1 0,0 1 129,-4 4-129,-10 6 0,-11 8 129,-15 7-129,-16 11 0,0 0 0,-27 12 129,-7 5 0,-4 3-129,-4 2 0,1-1 258,2 0-258,7-1 129,1-3-129,6-2 129,6-2-129,2-4 129,4-3 0,3 5 0,10-11 0,-18 16-129,18-16 129,-9 23 0,9-11 0,0 4 0,11-6 129,10-2 0,13-4 258,14-5 0,27-16 129,24-5 0,29-7 129,23-2 0,23 5-257,9 1-388,7 4-517,11 14-2966,-19-2-1290,-12 9-258,-27 0-645,-22 0-258</inkml:trace>
 </inkml:ink>
 </file>
 
@@ -7384,6 +7888,286 @@
 </inkml:ink>
 </file>
 
+<file path=word/ink/ink60.xml><?xml version="1.0" encoding="utf-8"?>
+<inkml:ink xmlns:inkml="http://www.w3.org/2003/InkML">
+  <inkml:definitions>
+    <inkml:context xml:id="ctx0">
+      <inkml:inkSource xml:id="inkSrc0">
+        <inkml:traceFormat>
+          <inkml:channel name="X" type="integer" max="32767" units="in"/>
+          <inkml:channel name="Y" type="integer" max="32767" units="in"/>
+          <inkml:channel name="F" type="integer" max="32767" units="dev"/>
+        </inkml:traceFormat>
+        <inkml:channelProperties>
+          <inkml:channelProperty channel="X" name="resolution" value="3971.75732" units="1/in"/>
+          <inkml:channelProperty channel="Y" name="resolution" value="5295.24854" units="1/in"/>
+          <inkml:channelProperty channel="F" name="resolution" value="0" units="1/dev"/>
+        </inkml:channelProperties>
+      </inkml:inkSource>
+      <inkml:timestamp xml:id="ts0" timeString="2012-10-02T16:45:12.487"/>
+    </inkml:context>
+    <inkml:brush xml:id="br0">
+      <inkml:brushProperty name="width" value="0.03333" units="cm"/>
+      <inkml:brushProperty name="height" value="0.03333" units="cm"/>
+      <inkml:brushProperty name="fitToCurve" value="1"/>
+    </inkml:brush>
+  </inkml:definitions>
+  <inkml:trace contextRef="#ctx0" brushRef="#br0">183 0 3612,'-26'27'3999,"7"3"129,-7 7-774,-3 2-1548,8 11-129,-6-2-258,13 7 129,-2-7-129,13 3-387,2-11-129,8-6-387,9-5-129,11-10-129,6-12 0,4-7-258,5-4 0,0-12-129,1-4 0,-6-6-129,-7-1 0,-8-2 0,-9 3 0,-10 1 0,-6 7 129,-13 1-387,-5 9 0,-9 0-387,3 8-774,-10 0-1677,5 5-903,6-1-258,7-2-387</inkml:trace>
+</inkml:ink>
+</file>
+
+<file path=word/ink/ink61.xml><?xml version="1.0" encoding="utf-8"?>
+<inkml:ink xmlns:inkml="http://www.w3.org/2003/InkML">
+  <inkml:definitions>
+    <inkml:context xml:id="ctx0">
+      <inkml:inkSource xml:id="inkSrc0">
+        <inkml:traceFormat>
+          <inkml:channel name="X" type="integer" max="32767" units="in"/>
+          <inkml:channel name="Y" type="integer" max="32767" units="in"/>
+          <inkml:channel name="F" type="integer" max="32767" units="dev"/>
+        </inkml:traceFormat>
+        <inkml:channelProperties>
+          <inkml:channelProperty channel="X" name="resolution" value="3971.75732" units="1/in"/>
+          <inkml:channelProperty channel="Y" name="resolution" value="5295.24854" units="1/in"/>
+          <inkml:channelProperty channel="F" name="resolution" value="0" units="1/dev"/>
+        </inkml:channelProperties>
+      </inkml:inkSource>
+      <inkml:timestamp xml:id="ts0" timeString="2012-10-02T16:46:49.139"/>
+    </inkml:context>
+    <inkml:brush xml:id="br0">
+      <inkml:brushProperty name="width" value="0.03333" units="cm"/>
+      <inkml:brushProperty name="height" value="0.03333" units="cm"/>
+      <inkml:brushProperty name="fitToCurve" value="1"/>
+    </inkml:brush>
+  </inkml:definitions>
+  <inkml:trace contextRef="#ctx0" brushRef="#br0">51 0 1,'9'20'0,"-8"-8"128,-1 1-256,0 1 128,-5 5 0,-3 1 0,1 2 0,-2 0 0,1-2 0,1-2 0,-1-2 0,4-4 0,4-12 0,-5 13 0,5-13 0,0 0 0,0 0 0,0 0 0,0 0 0,0 0 0,0 0 0,0 0 0,0 0 0,0 0 0,0 0 0,0 0 0,0 0 0,0 0 0,0 0 0,0 0 0,0 0 0,0 0 0,0 0 0,0 0 0,0 0 0,0 0 0,0 0 0</inkml:trace>
+</inkml:ink>
+</file>
+
+<file path=word/ink/ink62.xml><?xml version="1.0" encoding="utf-8"?>
+<inkml:ink xmlns:inkml="http://www.w3.org/2003/InkML">
+  <inkml:definitions>
+    <inkml:context xml:id="ctx0">
+      <inkml:inkSource xml:id="inkSrc0">
+        <inkml:traceFormat>
+          <inkml:channel name="X" type="integer" max="32767" units="in"/>
+          <inkml:channel name="Y" type="integer" max="32767" units="in"/>
+          <inkml:channel name="F" type="integer" max="32767" units="dev"/>
+        </inkml:traceFormat>
+        <inkml:channelProperties>
+          <inkml:channelProperty channel="X" name="resolution" value="3971.75732" units="1/in"/>
+          <inkml:channelProperty channel="Y" name="resolution" value="5295.24854" units="1/in"/>
+          <inkml:channelProperty channel="F" name="resolution" value="0" units="1/dev"/>
+        </inkml:channelProperties>
+      </inkml:inkSource>
+      <inkml:timestamp xml:id="ts0" timeString="2012-10-02T16:46:47.267"/>
+    </inkml:context>
+    <inkml:brush xml:id="br0">
+      <inkml:brushProperty name="width" value="0.03333" units="cm"/>
+      <inkml:brushProperty name="height" value="0.03333" units="cm"/>
+      <inkml:brushProperty name="fitToCurve" value="1"/>
+    </inkml:brush>
+  </inkml:definitions>
+  <inkml:trace contextRef="#ctx0" brushRef="#br0">1710 60 32767,'0'0'0,"-116"21"0,32-9 0,-8 5 0,-17-2 0,-9 3 0,-1-4 0,6-3 0,7-5 0,7-4 0,3-2 0,5-2 0,8-7 0,7-2 0,12-4 0,5-1 0,6-2 0,4-1 0,5 0-32766,5 0 32766,1 2 0,6 0 0,2 3 0</inkml:trace>
+</inkml:ink>
+</file>
+
+<file path=word/ink/ink63.xml><?xml version="1.0" encoding="utf-8"?>
+<inkml:ink xmlns:inkml="http://www.w3.org/2003/InkML">
+  <inkml:definitions>
+    <inkml:context xml:id="ctx0">
+      <inkml:inkSource xml:id="inkSrc0">
+        <inkml:traceFormat>
+          <inkml:channel name="X" type="integer" max="32767" units="in"/>
+          <inkml:channel name="Y" type="integer" max="32767" units="in"/>
+          <inkml:channel name="F" type="integer" max="32767" units="dev"/>
+        </inkml:traceFormat>
+        <inkml:channelProperties>
+          <inkml:channelProperty channel="X" name="resolution" value="3971.75732" units="1/in"/>
+          <inkml:channelProperty channel="Y" name="resolution" value="5295.24854" units="1/in"/>
+          <inkml:channelProperty channel="F" name="resolution" value="0" units="1/dev"/>
+        </inkml:channelProperties>
+      </inkml:inkSource>
+      <inkml:timestamp xml:id="ts0" timeString="2012-10-02T16:45:13.329"/>
+    </inkml:context>
+    <inkml:brush xml:id="br0">
+      <inkml:brushProperty name="width" value="0.03333" units="cm"/>
+      <inkml:brushProperty name="height" value="0.03333" units="cm"/>
+      <inkml:brushProperty name="fitToCurve" value="1"/>
+    </inkml:brush>
+  </inkml:definitions>
+  <inkml:trace contextRef="#ctx0" brushRef="#br0">111 11 5547,'37'-12'4515,"-19"12"-387,3 5-129,0 15-2451,-6 2-1032,3 12 0,-6 3 129,1 7 129,-11 5-129,-2 10-129,-6-2 129,-7 5 0,-10-7-129,-2-1 0,-5-9-258,-1-9-129,-2-11-129,4-15-129,2-10 0,3-9 0,9-11 0,6-7 129,7-4-129,6 0 129,15-1 258,8 6 0,9 3 129,10 9 0,2 2 258,9 9-129,0 2-129,2 2 0,-1 7-129,-3 3-129,-5 0-129,-2 1-387,-3 4-1032,-13-6-2967,-2 4-387,-10-2-387,-10 1-258</inkml:trace>
+</inkml:ink>
+</file>
+
+<file path=word/ink/ink64.xml><?xml version="1.0" encoding="utf-8"?>
+<inkml:ink xmlns:inkml="http://www.w3.org/2003/InkML">
+  <inkml:definitions>
+    <inkml:context xml:id="ctx0">
+      <inkml:inkSource xml:id="inkSrc0">
+        <inkml:traceFormat>
+          <inkml:channel name="X" type="integer" max="32767" units="in"/>
+          <inkml:channel name="Y" type="integer" max="32767" units="in"/>
+          <inkml:channel name="F" type="integer" max="32767" units="dev"/>
+        </inkml:traceFormat>
+        <inkml:channelProperties>
+          <inkml:channelProperty channel="X" name="resolution" value="3971.75732" units="1/in"/>
+          <inkml:channelProperty channel="Y" name="resolution" value="5295.24854" units="1/in"/>
+          <inkml:channelProperty channel="F" name="resolution" value="0" units="1/dev"/>
+        </inkml:channelProperties>
+      </inkml:inkSource>
+      <inkml:timestamp xml:id="ts0" timeString="2012-10-02T16:45:12.861"/>
+    </inkml:context>
+    <inkml:brush xml:id="br0">
+      <inkml:brushProperty name="width" value="0.03333" units="cm"/>
+      <inkml:brushProperty name="height" value="0.03333" units="cm"/>
+      <inkml:brushProperty name="fitToCurve" value="1"/>
+    </inkml:brush>
+  </inkml:definitions>
+  <inkml:trace contextRef="#ctx0" brushRef="#br0">8 0 7353,'18'19'4386,"-13"-1"-258,-1 8-903,-4-1-1935,4 16-387,-4 3 0,0 10 0,-3-1-387,0 4 0,-7-3 0,5-3-129,-3-5-129,3-10-258,3-9-258,0-16-1032,2-11-1935,7 5-1161,1-14-258,-1-11-387,3-3 0</inkml:trace>
+</inkml:ink>
+</file>
+
+<file path=word/ink/ink65.xml><?xml version="1.0" encoding="utf-8"?>
+<inkml:ink xmlns:inkml="http://www.w3.org/2003/InkML">
+  <inkml:definitions>
+    <inkml:context xml:id="ctx0">
+      <inkml:inkSource xml:id="inkSrc0">
+        <inkml:traceFormat>
+          <inkml:channel name="X" type="integer" max="32767" units="in"/>
+          <inkml:channel name="Y" type="integer" max="32767" units="in"/>
+          <inkml:channel name="F" type="integer" max="32767" units="dev"/>
+        </inkml:traceFormat>
+        <inkml:channelProperties>
+          <inkml:channelProperty channel="X" name="resolution" value="3971.75732" units="1/in"/>
+          <inkml:channelProperty channel="Y" name="resolution" value="5295.24854" units="1/in"/>
+          <inkml:channelProperty channel="F" name="resolution" value="0" units="1/dev"/>
+        </inkml:channelProperties>
+      </inkml:inkSource>
+      <inkml:timestamp xml:id="ts0" timeString="2012-10-02T16:45:12.081"/>
+    </inkml:context>
+    <inkml:brush xml:id="br0">
+      <inkml:brushProperty name="width" value="0.03333" units="cm"/>
+      <inkml:brushProperty name="height" value="0.03333" units="cm"/>
+      <inkml:brushProperty name="fitToCurve" value="1"/>
+    </inkml:brush>
+  </inkml:definitions>
+  <inkml:trace contextRef="#ctx0" brushRef="#br0">173 0 7224,'35'10'4515,"-19"4"-387,3 6-129,-5 9-2451,-3 0-1290,4 5 0,-6 6-129,-2 0 0,-7 4-129,-1 3 129,-13 0 0,-7 2 0,-10-3 0,-2-3 129,-5-8 129,0-9-129,1-10 129,5-9-129,4-7 129,11-12-258,11-8 0,6-6 0,17-1-129,10-2 0,11 2 0,5 3 129,7 4 0,3 7 0,-1 6 129,-3 7-129,-6 9 129,-6 8 0,-8 6-129,-10 5 129,-6 0-258,-8-1 0,-5-2-387,-3-8-387,0-1-1161,-9-11-2580,12-5-129,-10-6-258,10-9-258</inkml:trace>
+</inkml:ink>
+</file>
+
+<file path=word/ink/ink66.xml><?xml version="1.0" encoding="utf-8"?>
+<inkml:ink xmlns:inkml="http://www.w3.org/2003/InkML">
+  <inkml:definitions>
+    <inkml:context xml:id="ctx0">
+      <inkml:inkSource xml:id="inkSrc0">
+        <inkml:traceFormat>
+          <inkml:channel name="X" type="integer" max="32767" units="in"/>
+          <inkml:channel name="Y" type="integer" max="32767" units="in"/>
+          <inkml:channel name="F" type="integer" max="32767" units="dev"/>
+        </inkml:traceFormat>
+        <inkml:channelProperties>
+          <inkml:channelProperty channel="X" name="resolution" value="3971.75732" units="1/in"/>
+          <inkml:channelProperty channel="Y" name="resolution" value="5295.24854" units="1/in"/>
+          <inkml:channelProperty channel="F" name="resolution" value="0" units="1/dev"/>
+        </inkml:channelProperties>
+      </inkml:inkSource>
+      <inkml:timestamp xml:id="ts0" timeString="2012-10-02T16:45:11.441"/>
+    </inkml:context>
+    <inkml:brush xml:id="br0">
+      <inkml:brushProperty name="width" value="0.03333" units="cm"/>
+      <inkml:brushProperty name="height" value="0.03333" units="cm"/>
+      <inkml:brushProperty name="fitToCurve" value="1"/>
+    </inkml:brush>
+  </inkml:definitions>
+  <inkml:trace contextRef="#ctx0" brushRef="#br0">311 0 3225,'2'13'4257,"-2"10"0,-12 10 0,-3 18-1419,-11-1-1677,8 16-387,-14 2 0,7 7 258,-9-2-258,5 2-258,-4-5 0,8-8-129,-1-6-129,8-8-129,7-11 0,5-15-774,8-3-903,-2-19-2580,19 0-387,0-11-129,0-7-387</inkml:trace>
+</inkml:ink>
+</file>
+
+<file path=word/ink/ink67.xml><?xml version="1.0" encoding="utf-8"?>
+<inkml:ink xmlns:inkml="http://www.w3.org/2003/InkML">
+  <inkml:definitions>
+    <inkml:context xml:id="ctx0">
+      <inkml:inkSource xml:id="inkSrc0">
+        <inkml:traceFormat>
+          <inkml:channel name="X" type="integer" max="32767" units="in"/>
+          <inkml:channel name="Y" type="integer" max="32767" units="in"/>
+          <inkml:channel name="F" type="integer" max="32767" units="dev"/>
+        </inkml:traceFormat>
+        <inkml:channelProperties>
+          <inkml:channelProperty channel="X" name="resolution" value="3971.75732" units="1/in"/>
+          <inkml:channelProperty channel="Y" name="resolution" value="5295.24854" units="1/in"/>
+          <inkml:channelProperty channel="F" name="resolution" value="0" units="1/dev"/>
+        </inkml:channelProperties>
+      </inkml:inkSource>
+      <inkml:timestamp xml:id="ts0" timeString="2012-10-02T16:45:10.958"/>
+    </inkml:context>
+    <inkml:brush xml:id="br0">
+      <inkml:brushProperty name="width" value="0.03333" units="cm"/>
+      <inkml:brushProperty name="height" value="0.03333" units="cm"/>
+      <inkml:brushProperty name="fitToCurve" value="1"/>
+    </inkml:brush>
+  </inkml:definitions>
+  <inkml:trace contextRef="#ctx0" brushRef="#br0">75 19 3612,'32'-19'4386,"-15"19"-129,0 2 0,-1 8-1419,5 13-1806,-6 6-258,3 8 129,-5 2-129,-3 6-129,-7 1-258,-3 3 0,-7-2 0,-7-2-129,-8-6 0,-4-3-129,-4-7 0,0-9 0,1-7-129,0-10 0,6-4 0,7-13 0,6-6 0,10-6-129,5-2 129,15-1 0,8 2 129,8 6 0,7 4 0,2 9 129,2 6-129,-2 5 129,-5 10-129,-4 7 129,-10 3-129,-6 2 0,-6 0-129,-7-2 0,-6-2 0,-1-6-258,-4 0-645,-8-15-1290,12 0-2193,-14 0-387,14 0 0,-12-22-645</inkml:trace>
+</inkml:ink>
+</file>
+
+<file path=word/ink/ink68.xml><?xml version="1.0" encoding="utf-8"?>
+<inkml:ink xmlns:inkml="http://www.w3.org/2003/InkML">
+  <inkml:definitions>
+    <inkml:context xml:id="ctx0">
+      <inkml:inkSource xml:id="inkSrc0">
+        <inkml:traceFormat>
+          <inkml:channel name="X" type="integer" max="32767" units="in"/>
+          <inkml:channel name="Y" type="integer" max="32767" units="in"/>
+          <inkml:channel name="F" type="integer" max="32767" units="dev"/>
+        </inkml:traceFormat>
+        <inkml:channelProperties>
+          <inkml:channelProperty channel="X" name="resolution" value="3971.75732" units="1/in"/>
+          <inkml:channelProperty channel="Y" name="resolution" value="5295.24854" units="1/in"/>
+          <inkml:channelProperty channel="F" name="resolution" value="0" units="1/dev"/>
+        </inkml:channelProperties>
+      </inkml:inkSource>
+      <inkml:timestamp xml:id="ts0" timeString="2012-10-02T16:45:10.349"/>
+    </inkml:context>
+    <inkml:brush xml:id="br0">
+      <inkml:brushProperty name="width" value="0.03333" units="cm"/>
+      <inkml:brushProperty name="height" value="0.03333" units="cm"/>
+      <inkml:brushProperty name="fitToCurve" value="1"/>
+    </inkml:brush>
+  </inkml:definitions>
+  <inkml:trace contextRef="#ctx0" brushRef="#br0">348-3 2580,'5'-15'4257,"-5"15"0,-5 6-129,0 9-1548,-7 2-1032,4 15-645,-4 3-129,3 11 258,-8 7-387,3 14 0,-6 6-129,-3 12 0,-6 3 0,-1 6-129,-1-4 0,0-6-258,1-4 0,2-13 0,4-15-129,8-13-258,8-10-645,8-29-1806,0 0-1677,0-8-129,6-10-258,7-9-387</inkml:trace>
+</inkml:ink>
+</file>
+
+<file path=word/ink/ink69.xml><?xml version="1.0" encoding="utf-8"?>
+<inkml:ink xmlns:inkml="http://www.w3.org/2003/InkML">
+  <inkml:definitions>
+    <inkml:context xml:id="ctx0">
+      <inkml:inkSource xml:id="inkSrc0">
+        <inkml:traceFormat>
+          <inkml:channel name="X" type="integer" max="32767" units="in"/>
+          <inkml:channel name="Y" type="integer" max="32767" units="in"/>
+          <inkml:channel name="F" type="integer" max="32767" units="dev"/>
+        </inkml:traceFormat>
+        <inkml:channelProperties>
+          <inkml:channelProperty channel="X" name="resolution" value="3971.75732" units="1/in"/>
+          <inkml:channelProperty channel="Y" name="resolution" value="5295.24854" units="1/in"/>
+          <inkml:channelProperty channel="F" name="resolution" value="0" units="1/dev"/>
+        </inkml:channelProperties>
+      </inkml:inkSource>
+      <inkml:timestamp xml:id="ts0" timeString="2012-10-02T16:45:09.569"/>
+    </inkml:context>
+    <inkml:brush xml:id="br0">
+      <inkml:brushProperty name="width" value="0.03333" units="cm"/>
+      <inkml:brushProperty name="height" value="0.03333" units="cm"/>
+      <inkml:brushProperty name="fitToCurve" value="1"/>
+    </inkml:brush>
+  </inkml:definitions>
+  <inkml:trace contextRef="#ctx0" brushRef="#br0">175 0 7482,'0'0'4257,"0"0"-387,-15 12 0,1 9-3225,-3 6-516,0 8 0,-2 7 129,0 10 129,-1 3 129,4 12 387,0 2-258,5 5 0,1-8 258,9-1-258,1-15 0,8-11-387,9-17 0,6-15-129,0-14 0,9-19-129,1-11 0,-2-9 0,-2-3-129,-7-4 129,-4 0-129,-10 3 129,-4 5-129,-5 8 129,-10 5 0,-4 5-129,0 6 0,-2 7-258,3 7-129,1-2-774,13 9-903,0 0-2064,0 0-258,10 0-129,8 0-387</inkml:trace>
+</inkml:ink>
+</file>
+
 <file path=word/ink/ink7.xml><?xml version="1.0" encoding="utf-8"?>
 <inkml:ink xmlns:inkml="http://www.w3.org/2003/InkML">
   <inkml:definitions>
@@ -7412,6 +8196,118 @@
 </inkml:ink>
 </file>
 
+<file path=word/ink/ink70.xml><?xml version="1.0" encoding="utf-8"?>
+<inkml:ink xmlns:inkml="http://www.w3.org/2003/InkML">
+  <inkml:definitions>
+    <inkml:context xml:id="ctx0">
+      <inkml:inkSource xml:id="inkSrc0">
+        <inkml:traceFormat>
+          <inkml:channel name="X" type="integer" max="32767" units="in"/>
+          <inkml:channel name="Y" type="integer" max="32767" units="in"/>
+          <inkml:channel name="F" type="integer" max="32767" units="dev"/>
+        </inkml:traceFormat>
+        <inkml:channelProperties>
+          <inkml:channelProperty channel="X" name="resolution" value="3971.75732" units="1/in"/>
+          <inkml:channelProperty channel="Y" name="resolution" value="5295.24854" units="1/in"/>
+          <inkml:channelProperty channel="F" name="resolution" value="0" units="1/dev"/>
+        </inkml:channelProperties>
+      </inkml:inkSource>
+      <inkml:timestamp xml:id="ts0" timeString="2012-10-02T16:45:09.117"/>
+    </inkml:context>
+    <inkml:brush xml:id="br0">
+      <inkml:brushProperty name="width" value="0.03333" units="cm"/>
+      <inkml:brushProperty name="height" value="0.03333" units="cm"/>
+      <inkml:brushProperty name="fitToCurve" value="1"/>
+    </inkml:brush>
+  </inkml:definitions>
+  <inkml:trace contextRef="#ctx0" brushRef="#br0">15 37 2193,'0'0'3354,"-8"-13"-387,8 13-774,-1-14-387,1 14 0,0-11 0,0 11-258,0 0-129,4 17-258,-4 3-129,1 16 129,-1 5-258,0 14-129,-1 5 0,-1 7-129,1-1-258,-1 0 0,-1-7-129,1-7-129,1-11 0,1-12-516,0-8-129,0-21-1419,0 0-2451,3-11-129,2-7-387,-2-5-258</inkml:trace>
+</inkml:ink>
+</file>
+
+<file path=word/ink/ink71.xml><?xml version="1.0" encoding="utf-8"?>
+<inkml:ink xmlns:inkml="http://www.w3.org/2003/InkML">
+  <inkml:definitions>
+    <inkml:context xml:id="ctx0">
+      <inkml:inkSource xml:id="inkSrc0">
+        <inkml:traceFormat>
+          <inkml:channel name="X" type="integer" max="32767" units="in"/>
+          <inkml:channel name="Y" type="integer" max="32767" units="in"/>
+          <inkml:channel name="F" type="integer" max="32767" units="dev"/>
+        </inkml:traceFormat>
+        <inkml:channelProperties>
+          <inkml:channelProperty channel="X" name="resolution" value="3971.75732" units="1/in"/>
+          <inkml:channelProperty channel="Y" name="resolution" value="5295.24854" units="1/in"/>
+          <inkml:channelProperty channel="F" name="resolution" value="0" units="1/dev"/>
+        </inkml:channelProperties>
+      </inkml:inkSource>
+      <inkml:timestamp xml:id="ts0" timeString="2012-10-02T16:45:06.901"/>
+    </inkml:context>
+    <inkml:brush xml:id="br0">
+      <inkml:brushProperty name="width" value="0.03333" units="cm"/>
+      <inkml:brushProperty name="height" value="0.03333" units="cm"/>
+      <inkml:brushProperty name="fitToCurve" value="1"/>
+    </inkml:brush>
+  </inkml:definitions>
+  <inkml:trace contextRef="#ctx0" brushRef="#br0">0 877 11997,'20'-6'4902,"5"-10"-516,8-5 258,4-10-4386,20-6 0,6-12-258,8-9 129,1-10-129,4-5-129,-2-4 129,-9 1-258,-7 1 129,-15 6-129,-11 10 0,-14 11 0,-15 12 129,-12 19 129,-16 12 0,-15 10 0,-11 20 129,-8 15 0,-9 11-129,-5 9 258,2 8-129,2 2 129,5-2 0,12-2 0,10-9-129,14-12 129,12-14 0,16-16 0,12-15-129,19-15 0,11-17 0,13-9-129,6-8 129,4-2-129,1 0 129,-1 9-129,-8 8 0,-10 14 129,-8 13-129,-14 9 129,-10 17-129,-11 14 0,-8 9 0,-14 9 0,-10 1 0,-9 5 129,-7-1-129,-4-3 0,-6-3 129,0-8 0,-1-11 0,4-8-129,8-7 258,7-9-129,12-7 0,10-8 0,12-7-129,11-5 129,18-3-129,14 0 0,10-2 0,9 1 0,4 4-129,5 1 129,-1 4 0,-3 2-129,-5 6 0,-9 5 0,-9 2 129,-11 4-129,-8 6 0,-13 3 129,-8 3 0,-4 1-129,-11 1 258,-10 0-129,-2-1 129,-1 2-129,1-3 258,2-3-258,6-1 258,17-12-129,0 0 0,7 6-129,17-10 0,10-12 129,9-3-129,6-4 0,3-2-129,-1 0 129,-7 3-129,-6 5 129,-6 2 0,-11 6 0,-11 5 0,-10 4-129,-9 7 129,-14 7 0,-5 2-129,-6 4 129,0 2 0,0 4 0,2-2 129,7-1 0,10-3 0,11-2-129,4-7 258,15-5-258,10-6 129,6-7-129,8-9-129,5-7 129,0-5 0,0-3-129,-3-2 129,-7 2-129,-6 6 129,-8 6-129,-7 8 129,-13 11-129,0 9 129,-7 15 0,-7 11 0,-2 9 0,-1 1 129,2 2-129,1-5 129,9-8 0,5-12 129,0-22-129,21-2 129,2-28-258,8-16 129,6-17-129,3-15 129,0-12-258,-1-6 129,-1-3-129,-6 0-129,-7 7 129,-6 11 0,-9 15 0,-7 16 0,-7 22-129,-9 25 129,-12 18 0,-6 31 129,-7 22-129,-4 18 258,-4 15-129,3 6 258,7-1 0,3-8 129,15-9 0,10-19 0,11-24-129,16-25 129,16-21-129,10-24-258,11-25 0,6-20-258,3-16 0,1-10 0,-2-6-129,-3 6 129,-10 7-129,-6 14 129,-13 18 0,-6 26 0,-12 23 258,-10 21 0,-5 32 0,-12 19 129,-6 17 0,-6 10-129,-3 9 258,-4-2-129,1-3 0,2-11 0,8-16 129,7-17 0,13-14 0,6-20 0,21-13 0,11-13 0,17-15-129,14-11 0,9-5 0,9-6-258,4-2 0,3 2-258,-6-7-2064,4 19-2193,-16-2-516,-9 10-258,-14 6-774</inkml:trace>
+</inkml:ink>
+</file>
+
+<file path=word/ink/ink72.xml><?xml version="1.0" encoding="utf-8"?>
+<inkml:ink xmlns:inkml="http://www.w3.org/2003/InkML">
+  <inkml:definitions>
+    <inkml:context xml:id="ctx0">
+      <inkml:inkSource xml:id="inkSrc0">
+        <inkml:traceFormat>
+          <inkml:channel name="X" type="integer" max="32767" units="in"/>
+          <inkml:channel name="Y" type="integer" max="32767" units="in"/>
+          <inkml:channel name="F" type="integer" max="32767" units="dev"/>
+        </inkml:traceFormat>
+        <inkml:channelProperties>
+          <inkml:channelProperty channel="X" name="resolution" value="3971.75732" units="1/in"/>
+          <inkml:channelProperty channel="Y" name="resolution" value="5295.24854" units="1/in"/>
+          <inkml:channelProperty channel="F" name="resolution" value="0" units="1/dev"/>
+        </inkml:channelProperties>
+      </inkml:inkSource>
+      <inkml:timestamp xml:id="ts0" timeString="2012-10-02T16:45:04.998"/>
+    </inkml:context>
+    <inkml:brush xml:id="br0">
+      <inkml:brushProperty name="width" value="0.03333" units="cm"/>
+      <inkml:brushProperty name="height" value="0.03333" units="cm"/>
+      <inkml:brushProperty name="fitToCurve" value="1"/>
+    </inkml:brush>
+  </inkml:definitions>
+  <inkml:trace contextRef="#ctx0" brushRef="#br0">46 392 2709,'-22'33'4128,"16"-17"-258,6-16 0,-19 15-1935,19-15-774,0 0 0,0 0-129,-2-15 0,4-3-258,1-11 129,7 1-129,-3-12-129,4 0 0,-1-3-258,5 2-258,-3 2 0,4 3 0,-2 6-129,1 7 0,-4 7 129,-1 9-129,-10 7 0,17 7 129,-11 13-129,-3 12 129,-2 9 0,0 10 0,-1 10 0,0 6 0,-3 6 129,-2 3-129,0-1 129,1-7 0,1-5 0,3-11-129,0-10 129,0-16-258,6-14 258,6-14-258,2-19 0,0-17 0,7-10 0,-2-12 129,-2-5-129,0-8 0,-2 2 0,-3 2 0,2 3 0,-2 6-258,2 10-258,-2 8 0,4 11 129,-3 11 129,-3 12 129,-10 8 129,10 24 0,-10 12 387,-3 6 129,-5 13 0,-4 1 0,6 6-129,-2-4-129,4-1-129,4-10 0,0-3-129,5-6 129,2-5-129,0-5 129,3-6-258,1-3 129,-1-6 0,3-8 0,0-5 0,1-10-129,3-10 129,-1-7-258,1-7 258,-2-7-129,2-3 129,-3 2-129,1 0 0,-4 7 129,-1 3-129,-2 8 129,-2 11 0,-6 13 0,3 11 0,-3 11 129,-3 11-129,-5 5 129,-1 4 0,0 1 0,2-2-129,0-6 129,3-6-129,4-7 129,0-9-258,0-13 129,12 9 0,-1-9-129,5-12 129,1-4-129,6-5 258,2-3-258,2-2 129,1-1 0,-2 4 0,3 3 0,-4 6 0,-3 7 0,-6 7 0,-4 2 0,-7 14 0,-5 4 0,-3 5 0,-11 3 0,-4 3 0,-6-1 129,-2-3-258,-3-5 258,0-4-258,1-10 258,4-8-129,3-3-129,5-14 129,6-6-129,6-3 129,4-2-129,5 0 129,8 6-129,4 2 258,5 7-129,1 7-129,-2 6 129,1 12 0,-2 5 129,-4 11-129,-1 0 129,-5 4-129,-2 0 129,-4-4-129,1-5 129,-1-5-129,1-8 0,-5-10 0,12-4 0,-4-15 0,3-7 0,0-6 0,1-6-129,2 0 129,-1 0-129,1 5 129,-3 10-129,3 7 0,-14 16 129,17 0 0,-10 11 0,-3 12-129,1 4 258,-2 6-129,-1 1 129,1 0-129,0-4 0,3-4 0,2-6 129,5-7-129,3-8 0,4-7 0,2-11 0,0-11 0,1-7 0,1-8 0,-1-9-129,-6-6 0,-2-6 0,-3-4 0,-2 0 0,-3-1-129,-3 8 129,-3 5 0,-1 11 129,0 14 0,-2 14 0,2 13 129,-12 26-129,4 15 129,0 13 0,-2 11 0,1 10 0,-2 3 0,1 1 129,4-3 0,1-12 0,4-9-129,1-14 129,2-13-129,7-15 0,7-14 0,3-19-258,3-18 0,4-12 0,1-17 0,1-12-129,1-9 0,0-5 0,-2 0 0,0 5 0,-3 10 0,-3 16 258,-7 21-129,0 24 129,-14 17 0,3 30 129,-6 21 0,-11 19 129,-2 13 0,-3 7-129,1 5 129,2-6 0,5-3 0,6-14-129,5-12 0,13-17 0,11-17 0,6-17 0,9-17-129,4-20-129,5-20 0,9-16-258,-4-18 129,2-11-129,-7-11 0,-2 1 0,-7 7 258,-4 12 0,-9 28 258,-12 24 129,-14 32 258,2 38 0,-5 36 0,-12 20 129,0 17-258,-2 5 0,5-3-387,7-8-516,1-26-3225,13-16-1290,12-30 0,12-20-516,2-17-516</inkml:trace>
+</inkml:ink>
+</file>
+
+<file path=word/ink/ink73.xml><?xml version="1.0" encoding="utf-8"?>
+<inkml:ink xmlns:inkml="http://www.w3.org/2003/InkML">
+  <inkml:definitions>
+    <inkml:context xml:id="ctx0">
+      <inkml:inkSource xml:id="inkSrc0">
+        <inkml:traceFormat>
+          <inkml:channel name="X" type="integer" max="32767" units="in"/>
+          <inkml:channel name="Y" type="integer" max="32767" units="in"/>
+          <inkml:channel name="F" type="integer" max="32767" units="dev"/>
+        </inkml:traceFormat>
+        <inkml:channelProperties>
+          <inkml:channelProperty channel="X" name="resolution" value="3971.75732" units="1/in"/>
+          <inkml:channelProperty channel="Y" name="resolution" value="5295.24854" units="1/in"/>
+          <inkml:channelProperty channel="F" name="resolution" value="0" units="1/dev"/>
+        </inkml:channelProperties>
+      </inkml:inkSource>
+      <inkml:timestamp xml:id="ts0" timeString="2012-10-02T16:45:02.845"/>
+    </inkml:context>
+    <inkml:brush xml:id="br0">
+      <inkml:brushProperty name="width" value="0.03333" units="cm"/>
+      <inkml:brushProperty name="height" value="0.03333" units="cm"/>
+      <inkml:brushProperty name="fitToCurve" value="1"/>
+    </inkml:brush>
+  </inkml:definitions>
+  <inkml:trace contextRef="#ctx0" brushRef="#br0">100 547 774,'13'11'1548,"-11"0"129,-2-11 129,0 14 129,0-14-129,0 16 0,0-3-129,0-13 0,0 27-129,-2-15 129,2 6-258,-7-5-129,7 5-258,0-18 129,-4 21-387,4-21 0,0 0 0,0 0-129,11 0-129,-3-10 0,5-4-129,0-3 0,4-2-129,-4-2-129,1-1 129,-2 0-258,-1-2 129,-5-1-129,0 1 0,-1-7 129,0 1-129,-1-6 129,-2 1-129,-1-7 0,0 3 0,-1-4 0,0 3 0,-1 1 0,-5 1 0,-3 7 0,0 1-129,-1 6 129,0 3 0,-1 4 0,0 5-129,1 2 129,0 5 0,-1 5-129,0 2 129,-1 9 0,-3 7 0,0 9-129,-2 8 129,2 6 0,-3 6 129,4 4-258,1 1 258,6-1-129,4-6 0,3-5 0,1-9 0,8-10 0,5-5 0,4-10 0,0-6-129,4-3 129,-4-9 0,2-4 0,-4 0 0,0-3 0,-5-3-129,-2-2 129,-4 0-129,-3-1 0,-2-3-129,1 5-258,-2-6-774,1 11-2967,-1 6-258,1 12-387,-14-2-258</inkml:trace>
+</inkml:ink>
+</file>
+
 <file path=word/ink/ink8.xml><?xml version="1.0" encoding="utf-8"?>
 <inkml:ink xmlns:inkml="http://www.w3.org/2003/InkML">
   <inkml:definitions>
@@ -7436,7 +8332,7 @@
       <inkml:brushProperty name="fitToCurve" value="1"/>
     </inkml:brush>
   </inkml:definitions>
-  <inkml:trace contextRef="#ctx0" brushRef="#br0">359 164 3483,'25'-27'4257,"-14"14"-258,-9-9-903,9 9-258,-11-10-516,0 10-645,-7-7-258,1 9-387,-7-2-129,-1 8-258,-7 3-129,-4 2-258,-4 11 129,-2 6-258,-3 5 0,0 10 0,0 6 0,1 10-129,2 5 0,3 8 0,5 4 0,3 4 0,7-3 0,5 0 0,6-5 0,2-9-129,11-10 258,7-11-258,6-12 129,5-12 0,6-9 0,5-16 0,4-12-129,2-8 129,2-10-129,-3-7 129,-2-3 0,-6-4 0,-5 0-129,-9 9 0,-9 2 129,-8 8-258,-5 11-258,-3 4-1290,-3 16-2709,-6 0 0,11 12-516,-18-7-258</inkml:trace>
+  <inkml:trace contextRef="#ctx0" brushRef="#br0">355 164 3483,'25'-27'4257,"-14"14"-258,-9-9-903,9 9-258,-11-10-516,0 10-645,-7-7-258,1 9-387,-7-2-129,-1 8-258,-6 3-129,-5 2-258,-4 11 129,-2 6-258,-2 5 0,-1 10 0,0 6 0,2 10-129,1 5 0,3 8 0,6 4 0,2 5 0,7-4 0,5 0 0,6-5 0,2-9-129,11-10 258,7-11-258,5-12 129,6-12 0,6-9 0,4-16 0,5-12-129,1-8 129,3-10-129,-3-7 129,-3-3 0,-5-4 0,-6 0-129,-8 8 0,-9 3 129,-8 8-258,-5 11-258,-3 4-1290,-3 16-2709,-6 0 0,11 12-516,-18-7-258</inkml:trace>
 </inkml:ink>
 </file>
 

</xml_diff>